<commit_message>
Update proposal authors and adapt interview procedure to a female co-researcher
Co-Authored-By: Claude Fable 5.1 <noreply@anthropic.com>
Claude-Session: https://claude.ai/code/session_013NTfKpqds6XkbupkiTDphe
</commit_message>
<xml_diff>
--- a/academic/research-proposal-bedouin-mothers.docx
+++ b/academic/research-proposal-bedouin-mothers.docx
@@ -299,7 +299,7 @@
           <w:szCs w:val="24"/>
           <w:rtl/>
         </w:rPr>
-        <w:t xml:space="preserve">מגיש: מוחמד מוחמד</w:t>
+        <w:t xml:space="preserve">מגישים:</w:t>
       </w:r>
     </w:p>
     <w:p>
@@ -319,7 +319,27 @@
           <w:szCs w:val="24"/>
           <w:rtl/>
         </w:rPr>
-        <w:t xml:space="preserve">ת.ז. ____________</w:t>
+        <w:t xml:space="preserve">סולימאן אבו חמיד, ת.ז. 066127135</w:t>
+      </w:r>
+    </w:p>
+    <w:p>
+      <w:pPr>
+        <w:bidi/>
+        <w:spacing w:after="0" w:before="0" w:line="360"/>
+        <w:jc w:val="center"/>
+      </w:pPr>
+      <w:r>
+        <w:rPr>
+          <w:rFonts w:ascii="David" w:cs="David" w:eastAsia="David" w:hAnsi="David"/>
+          <w:b w:val="false"/>
+          <w:bCs w:val="false"/>
+          <w:i w:val="false"/>
+          <w:iCs w:val="false"/>
+          <w:sz w:val="24"/>
+          <w:szCs w:val="24"/>
+          <w:rtl/>
+        </w:rPr>
+        <w:t xml:space="preserve">ג'ואהר אבו גאנם, ת.ז. 212555130</w:t>
       </w:r>
     </w:p>
     <w:p>
@@ -1401,27 +1421,27 @@
           <w:szCs w:val="24"/>
           <w:rtl/>
         </w:rPr>
-        <w:t xml:space="preserve">המחקר יחל לאחר קבלת אישור מוועדת האתיקה של המוסד. הקשר עם המשתתפות ייווצר דרך שומרי הסף, שיציגו את המחקר לאימהות ויעבירו לחוקר רק את פרטיהן של אלה שהביעו עניין. מקום הריאיון ייקבע לפי בחירת האם: ביתה, מרכז קהילתי או מרכז להתפתחות הילד. הריאיון יימשך בין 45 ל-75 דקות ויוקלט באישור האם.</w:t>
-      </w:r>
-    </w:p>
-    <w:p>
-      <w:pPr>
-        <w:bidi/>
-        <w:spacing w:after="0" w:before="0" w:line="360"/>
-        <w:jc w:val="both"/>
-      </w:pPr>
-      <w:r>
-        <w:rPr>
-          <w:rFonts w:ascii="David" w:cs="David" w:eastAsia="David" w:hAnsi="David"/>
-          <w:b w:val="false"/>
-          <w:bCs w:val="false"/>
-          <w:i w:val="false"/>
-          <w:iCs w:val="false"/>
-          <w:sz w:val="24"/>
-          <w:szCs w:val="24"/>
-          <w:rtl/>
-        </w:rPr>
-        <w:t xml:space="preserve">בהתחשב בנורמות התרבותיות הנוגעות למפגש בין נשים לגברים שאינם בני משפחה, ייערכו הראיונות באחת משתי דרכים, לפי בחירת האם ובאישור ועדת האתיקה: בנוכחות בת משפחה שהאם תבחר, או באמצעות מראיינת מהקהילה, בעלת רקע אקדמי במקצועות הטיפול, שתוכשר על ידי החוקר לשימוש במדריך. בחירה זו אינה רק אילוץ, היא גם תנאי לכך שהאימהות ידברו בחופשיות. הראיונות יתומללו בערבית וינותחו בשפת המקור. ציטוטים נבחרים יתורגמו לעברית, והתרגום ייבדק על ידי עמית דו-לשוני כדי לשמור על משמעות ועל ניואנסים.</w:t>
+        <w:t xml:space="preserve">המחקר יחל לאחר קבלת אישור מוועדת האתיקה של המוסד. הקשר עם המשתתפות ייווצר דרך שומרי הסף, שיציגו את המחקר לאימהות ויעבירו לחוקרים רק את פרטיהן של אלה שהביעו עניין. מקום הריאיון ייקבע לפי בחירת האם: ביתה, מרכז קהילתי או מרכז להתפתחות הילד. הריאיון יימשך בין 45 ל-75 דקות ויוקלט באישור האם.</w:t>
+      </w:r>
+    </w:p>
+    <w:p>
+      <w:pPr>
+        <w:bidi/>
+        <w:spacing w:after="0" w:before="0" w:line="360"/>
+        <w:jc w:val="both"/>
+      </w:pPr>
+      <w:r>
+        <w:rPr>
+          <w:rFonts w:ascii="David" w:cs="David" w:eastAsia="David" w:hAnsi="David"/>
+          <w:b w:val="false"/>
+          <w:bCs w:val="false"/>
+          <w:i w:val="false"/>
+          <w:iCs w:val="false"/>
+          <w:sz w:val="24"/>
+          <w:szCs w:val="24"/>
+          <w:rtl/>
+        </w:rPr>
+        <w:t xml:space="preserve">בהתחשב בנורמות התרבותיות הנוגעות למפגש בין נשים לגברים שאינם בני משפחה, כל הראיונות ייערכו על ידי החוקרת, ג'ואהר אבו גאנם, בערבית. אם תעדיף זאת, תוכל האם להזמין בת משפחה להיות נוכחת. החוקר, סולימאן אבו חמיד, יהיה שותף מלא לבניית המדריך, לניתוח ולכתיבה, אך לא ינכח בראיונות. חלוקה זו אינה רק אילוץ, היא גם תנאי לכך שהאימהות ידברו בחופשיות על נושאים כמו יחסים זוגיים, פוליגמיה ואשמה. הראיונות יתומללו בערבית וינותחו בשפת המקור. ציטוטים נבחרים יתורגמו לעברית, והתרגום ייבדק על ידי עמית דו-לשוני כדי לשמור על משמעות ועל ניואנסים.</w:t>
       </w:r>
     </w:p>
     <w:p>
@@ -1479,47 +1499,47 @@
           <w:szCs w:val="28"/>
           <w:rtl/>
         </w:rPr>
-        <w:t xml:space="preserve">4.6 אמינות המחקר ומקומו של החוקר</w:t>
-      </w:r>
-    </w:p>
-    <w:p>
-      <w:pPr>
-        <w:bidi/>
-        <w:spacing w:after="0" w:before="0" w:line="360"/>
-        <w:jc w:val="both"/>
-      </w:pPr>
-      <w:r>
-        <w:rPr>
-          <w:rFonts w:ascii="David" w:cs="David" w:eastAsia="David" w:hAnsi="David"/>
-          <w:b w:val="false"/>
-          <w:bCs w:val="false"/>
-          <w:i w:val="false"/>
-          <w:iCs w:val="false"/>
-          <w:sz w:val="24"/>
-          <w:szCs w:val="24"/>
-          <w:rtl/>
-        </w:rPr>
-        <w:t xml:space="preserve">אמינות המחקר תיבחן לפי ארבעת הקריטריונים של לינקולן וגובה (Lincoln &amp; Guba, 1985). מהימנות פנימית תובטח באמצעות החזרת סיכום הממצאים לשתיים או שלוש משתתפות לבדיקה, ובאמצעות דיון בקידוד עם עמית. יכולת ההעברה תובטח באמצעות תיאור עשיר של ההקשר ושל המשתתפות. עקביות תובטח באמצעות שמירת שובל ביקורת: תמלילים, טבלאות קידוד ויומן החלטות. ואובייקטיביות, במובנה האיכותני, תובטח באמצעות יומן רפלקסיבי שבו יתעד החוקר את הנחותיו ואת תגובותיו לאורך המחקר.</w:t>
-      </w:r>
-    </w:p>
-    <w:p>
-      <w:pPr>
-        <w:bidi/>
-        <w:spacing w:after="0" w:before="0" w:line="360"/>
-        <w:jc w:val="both"/>
-      </w:pPr>
-      <w:r>
-        <w:rPr>
-          <w:rFonts w:ascii="David" w:cs="David" w:eastAsia="David" w:hAnsi="David"/>
-          <w:b w:val="false"/>
-          <w:bCs w:val="false"/>
-          <w:i w:val="false"/>
-          <w:iCs w:val="false"/>
-          <w:sz w:val="24"/>
-          <w:szCs w:val="24"/>
-          <w:rtl/>
-        </w:rPr>
-        <w:t xml:space="preserve">לחוקר, כבן החברה הערבית, יש עמדה של "מבפנים ומבחוץ": קרבה תרבותית ולשונית שמקלה על יצירת אמון, ובה בעת ריחוק מגדרי ולעיתים מעמדי או קהילתי מהמשתתפות. שתי העמדות ישפיעו על מה שייאמר ועל מה שיובן, ולכן יידונו במפורש בפרק הממצאים ובפרק הרפלקציה.</w:t>
+        <w:t xml:space="preserve">4.6 אמינות המחקר ומקומם של החוקרים</w:t>
+      </w:r>
+    </w:p>
+    <w:p>
+      <w:pPr>
+        <w:bidi/>
+        <w:spacing w:after="0" w:before="0" w:line="360"/>
+        <w:jc w:val="both"/>
+      </w:pPr>
+      <w:r>
+        <w:rPr>
+          <w:rFonts w:ascii="David" w:cs="David" w:eastAsia="David" w:hAnsi="David"/>
+          <w:b w:val="false"/>
+          <w:bCs w:val="false"/>
+          <w:i w:val="false"/>
+          <w:iCs w:val="false"/>
+          <w:sz w:val="24"/>
+          <w:szCs w:val="24"/>
+          <w:rtl/>
+        </w:rPr>
+        <w:t xml:space="preserve">אמינות המחקר תיבחן לפי ארבעת הקריטריונים של לינקולן וגובה (Lincoln &amp; Guba, 1985). מהימנות פנימית תובטח באמצעות החזרת סיכום הממצאים לשתיים או שלוש משתתפות לבדיקה, ובאמצעות דיון בקידוד עם עמית. יכולת ההעברה תובטח באמצעות תיאור עשיר של ההקשר ושל המשתתפות. עקביות תובטח באמצעות שמירת שובל ביקורת: תמלילים, טבלאות קידוד ויומן החלטות. ואובייקטיביות, במובנה האיכותני, תובטח באמצעות יומן רפלקסיבי שבו יתעדו החוקרים את הנחותיהם ואת תגובותיהם לאורך המחקר.</w:t>
+      </w:r>
+    </w:p>
+    <w:p>
+      <w:pPr>
+        <w:bidi/>
+        <w:spacing w:after="0" w:before="0" w:line="360"/>
+        <w:jc w:val="both"/>
+      </w:pPr>
+      <w:r>
+        <w:rPr>
+          <w:rFonts w:ascii="David" w:cs="David" w:eastAsia="David" w:hAnsi="David"/>
+          <w:b w:val="false"/>
+          <w:bCs w:val="false"/>
+          <w:i w:val="false"/>
+          <w:iCs w:val="false"/>
+          <w:sz w:val="24"/>
+          <w:szCs w:val="24"/>
+          <w:rtl/>
+        </w:rPr>
+        <w:t xml:space="preserve">לחוקרים, כבני החברה הערבית, יש עמדה של "מבפנים ומבחוץ": קרבה תרבותית ולשונית שמקלה על יצירת אמון, ובה בעת ריחוק מעמדי, השכלתי ולעיתים קהילתי מהמשתתפות. העובדה שהמראיינת היא אישה מקלה על השיחה בנושאים אינטימיים, אך אינה מבטלת את הפער בין אישה אקדמאית לבין אם שחייה מתנהלים בתוך מגבלות שהיא לא בחרה. שתי העמדות ישפיעו על מה שייאמר ועל מה שיובן, ולכן יידונו במפורש בפרק הממצאים ובפרק הרפלקציה.</w:t>
       </w:r>
     </w:p>
     <w:p>
@@ -3421,7 +3441,7 @@
           <w:szCs w:val="24"/>
           <w:rtl/>
         </w:rPr>
-        <w:t xml:space="preserve">הצגת החוקר או המראיינת, הסבר קצר על מטרת המחקר ("אני רוצה להבין איך אימהות כמוך חוות את הדרך של הילד בבית הספר ובקהילה"), הבהרה שאין תשובות נכונות או לא נכונות, סודיות, הקלטה, זכות לעצור בכל רגע, חתימה על טופס הסכמה.</w:t>
+        <w:t xml:space="preserve">הצגת המראיינת, הסבר קצר על מטרת המחקר ("אני רוצה להבין איך אימהות כמוך חוות את הדרך של הילד בבית הספר ובקהילה"), הבהרה שאין תשובות נכונות או לא נכונות, סודיות, הקלטה, זכות לעצור בכל רגע, חתימה על טופס הסכמה.</w:t>
       </w:r>
     </w:p>
     <w:p>
@@ -4542,7 +4562,7 @@
           <w:szCs w:val="24"/>
           <w:rtl/>
         </w:rPr>
-        <w:t xml:space="preserve">תודה, תזכורת על סודיות, הסבר על השלבים הבאים ועל האפשרות לקבל סיכום של הממצאים, מסירת פרטי קשר של החוקר ושל שירותי תמיכה בערבית.</w:t>
+        <w:t xml:space="preserve">תודה, תזכורת על סודיות, הסבר על השלבים הבאים ועל האפשרות לקבל סיכום של הממצאים, מסירת פרטי קשר של החוקרים ושל שירותי תמיכה בערבית.</w:t>
       </w:r>
     </w:p>
     <w:p>
@@ -5849,20 +5869,20 @@
           <w:szCs w:val="24"/>
           <w:rtl/>
         </w:rPr>
-        <w:t xml:space="preserve">החוקר: </w:t>
-      </w:r>
-      <w:r>
-        <w:rPr>
-          <w:rFonts w:ascii="David" w:cs="David" w:eastAsia="David" w:hAnsi="David"/>
-          <w:b w:val="false"/>
-          <w:bCs w:val="false"/>
-          <w:i w:val="false"/>
-          <w:iCs w:val="false"/>
-          <w:sz w:val="24"/>
-          <w:szCs w:val="24"/>
-          <w:rtl/>
-        </w:rPr>
-        <w:t xml:space="preserve">מוחמד מוחמד, סטודנט בקורס "שילוב והכלה במרחב החינוכי-חברתי", הקריה האקדמית אונו, בהנחיית עומרי טנקמן.</w:t>
+        <w:t xml:space="preserve">החוקרים: </w:t>
+      </w:r>
+      <w:r>
+        <w:rPr>
+          <w:rFonts w:ascii="David" w:cs="David" w:eastAsia="David" w:hAnsi="David"/>
+          <w:b w:val="false"/>
+          <w:bCs w:val="false"/>
+          <w:i w:val="false"/>
+          <w:iCs w:val="false"/>
+          <w:sz w:val="24"/>
+          <w:szCs w:val="24"/>
+          <w:rtl/>
+        </w:rPr>
+        <w:t xml:space="preserve">סולימאן אבו חמיד וג'ואהר אבו גאנם, סטודנטים בקורס "שילוב והכלה במרחב החינוכי-חברתי", הקריה האקדמית אונו, בהנחיית עומרי טנקמן.</w:t>
       </w:r>
     </w:p>
     <w:p>
@@ -5928,7 +5948,7 @@
           <w:szCs w:val="24"/>
           <w:rtl/>
         </w:rPr>
-        <w:t xml:space="preserve">ריאיון אחד בערבית, באורך של כשעה, במקום שתבחרי. הריאיון יוקלט כדי שאוכל לזכור במדויק את דברייך.</w:t>
+        <w:t xml:space="preserve">ריאיון אחד בערבית, באורך של כשעה, במקום שתבחרי. הריאיון ייערך על ידי החוקרת ויוקלט כדי שנוכל לזכור במדויק את דברייך.</w:t>
       </w:r>
     </w:p>
     <w:p>
@@ -6027,7 +6047,7 @@
           <w:szCs w:val="24"/>
           <w:rtl/>
         </w:rPr>
-        <w:t xml:space="preserve">הריאיון עשוי לעורר רגשות קשים. אם תרצי, נעצור, ואוכל למסור לך פרטים של גורמי תמיכה בערבית. אין תועלת אישית ישירה מההשתתפות, אך דברייך עשויים לסייע לשיפור השירותים לאימהות אחרות.</w:t>
+        <w:t xml:space="preserve">הריאיון עשוי לעורר רגשות קשים. אם תרצי, נעצור, ונוכל למסור לך פרטים של גורמי תמיכה בערבית. אין תועלת אישית ישירה מההשתתפות, אך דברייך עשויים לסייע לשיפור השירותים לאימהות אחרות.</w:t>
       </w:r>
     </w:p>
     <w:p>
@@ -6060,7 +6080,7 @@
           <w:szCs w:val="24"/>
           <w:rtl/>
         </w:rPr>
-        <w:t xml:space="preserve">מוחמד מוחמד, טלפון: __________, דוא"ל: __________.</w:t>
+        <w:t xml:space="preserve">ג'ואהר אבו גאנם, טלפון: __________, דוא"ל: __________; סולימאן אבו חמיד, טלפון: __________, דוא"ל: __________.</w:t>
       </w:r>
     </w:p>
     <w:p>

</xml_diff>

<commit_message>
Add two open-access Hebrew sources and flatten interview guide to 17 questions
Co-Authored-By: Claude Fable 5.1 <noreply@anthropic.com>
Claude-Session: https://claude.ai/code/session_013NTfKpqds6XkbupkiTDphe
</commit_message>
<xml_diff>
--- a/academic/research-proposal-bedouin-mothers.docx
+++ b/academic/research-proposal-bedouin-mothers.docx
@@ -700,6 +700,26 @@
           <w:szCs w:val="24"/>
           <w:rtl/>
         </w:rPr>
+        <w:t xml:space="preserve">בהמשך לכך, מחקר משולב שיטות בקרב ארבעים אימהות בדואיות לילדים עם אוטיזם או עם מוגבלות שכלית התפתחותית זיהה שתי עמדות דתיות שונות כלפי המוגבלות: עמדה פסימית, שרואה בה עונש משמיים ומלווה בהלם, בפחד ובצער, ועמדה אופטימית, שרואה בה מתנה או ניסיון של אהבה. אחת האימהות ניסחה זאת במילים "אלוהים נתן לי את הילד הזה מתוך אהבתו הרבה אליי". השילוב בין העמדה הדתית לעמדה הרגשית של האם עיצב את דרך ההתמודדות שלה עם המוגבלות ועם המערכות שסביבה (פריינטה וברק לוי, 2025). ממצא זה מחדד את הצורך לשאול את האימהות עצמן מה המשמעות שהן מייחסות למוגבלות, לפני שמניחים שהדת פועלת בכיוון אחד בלבד.</w:t>
+      </w:r>
+    </w:p>
+    <w:p>
+      <w:pPr>
+        <w:bidi/>
+        <w:spacing w:after="0" w:before="0" w:line="360"/>
+        <w:jc w:val="both"/>
+      </w:pPr>
+      <w:r>
+        <w:rPr>
+          <w:rFonts w:ascii="David" w:cs="David" w:eastAsia="David" w:hAnsi="David"/>
+          <w:b w:val="false"/>
+          <w:bCs w:val="false"/>
+          <w:i w:val="false"/>
+          <w:iCs w:val="false"/>
+          <w:sz w:val="24"/>
+          <w:szCs w:val="24"/>
+          <w:rtl/>
+        </w:rPr>
         <w:t xml:space="preserve">מצד שני, הסטיגמה חזקה ונדבקת גם להורים. אצל אימהות בדואיות לילדים צעירים עם מוגבלות התפתחותית נמצא קשר בין סטיגמה נתפסת לבין איכות חיים נמוכה, וקשר בין שני אלה לבין מידת שיתוף הפעולה של האם עם אנשי המקצוע (Manor-Binyamini &amp; Schreiber-Divon, 2021). ממצא זה נוגע ישירות למחקר על שילוב, משום שהוא מרמז שהסטיגמה אינה רק חוויה פנימית אלא גם מנגנון שמרחיק את האם מהמערכת שאמורה לסייע לילדה.</w:t>
       </w:r>
     </w:p>
@@ -878,6 +898,26 @@
           <w:szCs w:val="24"/>
           <w:rtl/>
         </w:rPr>
+        <w:t xml:space="preserve">מחקר ארצי שבחן כיצד הורים בוחרים בפועל מסגרת לילדם הזכאי לשירותי חינוך מיוחדים מצא שהשיקולים המרכזיים הם זמינות התמיכות והשירותים, גודל הכיתה, גישת הצוות ויכולתו להכיל, לצד מאפייני המשפחה והילד. בחברה הערבית נמצא שיעור גבוה יותר של תלמידים המשולבים בכיתות רגילות, אך המחקר מייחס זאת בעיקר למחסור במסגרות ייעודיות ולא לבחירה מודעת, וממליץ להעמיק את המידע שבידי ההורים הערבים כדי שהבחירה תנבע מהבנה ולא מהיעדר ברירה (נמר פורסטנברג ואחרים, 2024). ממצא זה מציב סימן שאלה על עצם המושג "בחירה הורית" בהקשר הבדואי.</w:t>
+      </w:r>
+    </w:p>
+    <w:p>
+      <w:pPr>
+        <w:bidi/>
+        <w:spacing w:after="0" w:before="0" w:line="360"/>
+        <w:jc w:val="both"/>
+      </w:pPr>
+      <w:r>
+        <w:rPr>
+          <w:rFonts w:ascii="David" w:cs="David" w:eastAsia="David" w:hAnsi="David"/>
+          <w:b w:val="false"/>
+          <w:bCs w:val="false"/>
+          <w:i w:val="false"/>
+          <w:iCs w:val="false"/>
+          <w:sz w:val="24"/>
+          <w:szCs w:val="24"/>
+          <w:rtl/>
+        </w:rPr>
         <w:t xml:space="preserve">מה חושבים הורים בחברה הערבית על הצד שלהם במשוואה? בראיונות עם עשרים הורים לילדים עם צרכים חינוכיים מיוחדים בחברה הערבית בישראל עלו שש קטגוריות: הורות, למידה בבית, תקשורת עם בית הספר, התנדבות, שיתוף ההורים בקבלת החלטות הנוגעות לילדם, ועמדות המורים כלפי הילדים. ההורים תיארו תקשורת דלה ותחושה שההחלטות מתקבלות בלעדיהם (Jorban et al., 2024). המחקר לא הבחין בין אוכלוסיות שונות בתוך החברה הערבית, ולא בין אימהות לאבות.</w:t>
       </w:r>
     </w:p>
@@ -957,7 +997,7 @@
           <w:szCs w:val="24"/>
           <w:rtl/>
         </w:rPr>
-        <w:t xml:space="preserve">הספרות מתעדת היטב את הנטל הרגשי של אימהות בדואיות לילדים עם מוגבלות, את הסטיגמה ואת מעמדן המוגבל. היא מתעדת גם, בנפרד, את עמדות ההורים בחברה הערבית ואת עמדות המורים הבדואים כלפי שילוב. אבל שלוש חוליות חסרות. ראשית, המחקרים האיכותניים על אימהות בדואיות התמקדו בסוג מוגבלות אחד ולא בשאלת השילוב עצמה. שנית, מחקר ההורים בחברה הערבית לא התייחס לחברה הבדואית ולא לאימהות כקבוצה נפרדת. שלישית, כמעט כל הנתונים נאספו לפני שתיקון 11 הפך למציאות היומיומית של ועדות הזכאות ובתי הספר. המחקר המוצע פונה לאימהות עצמן ושואל כיצד הן מבינות את השילוב, בבית הספר ובקהילה, מתוך עולמן התרבותי.</w:t>
+        <w:t xml:space="preserve">הספרות מתעדת היטב את הנטל הרגשי של אימהות בדואיות לילדים עם מוגבלות, את הסטיגמה ואת מעמדן המוגבל. היא מתעדת גם, בנפרד, את עמדות ההורים בחברה הערבית ואת עמדות המורים הבדואים כלפי שילוב. אבל שלוש חוליות חסרות. ראשית, המחקרים על אימהות בדואיות התמקדו בסוג מוגבלות אחד או בהתמודדות הרגשית והדתית, ולא בשאלת השילוב עצמה. שנית, מחקר ההורים בחברה הערבית לא התייחס לחברה הבדואית ולא לאימהות כקבוצה נפרדת. שלישית, כמעט כל הנתונים נאספו לפני שתיקון 11 הפך למציאות היומיומית של ועדות הזכאות ובתי הספר. המחקר המוצע פונה לאימהות עצמן ושואל כיצד הן מבינות את השילוב, בבית הספר ובקהילה, מתוך עולמן התרבותי.</w:t>
       </w:r>
     </w:p>
     <w:p>
@@ -1382,7 +1422,7 @@
           <w:szCs w:val="24"/>
           <w:rtl/>
         </w:rPr>
-        <w:t xml:space="preserve">כלי המחקר הוא ריאיון עומק חצי-מובנה. מדריך הריאיון (נספח א') נפתח בשאלה פתוחה, "ספרי לי על עצמך", שנועדה לאפשר לאם לבחור מאיפה להתחיל ולבסס אמון לפני שנכנסים לנושאים רגישים. אחריה מגיעות שאלות בשבעה תחומים: הילד והאבחון, חיי היומיום, יחס הסביבה, בית הספר והשילוב, הקהילה, משאבי תמיכה ומבט לעתיד. לכל תחום מצורפות שאלות המשך (probes) שישמשו רק אם האם לא תתייחס לנושא מעצמה. הראיונות ייערכו בערבית, שפת האם של המשתתפות, ולכן מצורף גם נוסח ערבי של המדריך (נספח ב'). המדריך ייבדק בשני ראיונות פיילוט, ונוסח השאלות יתוקן לפי הצורך. בנוסף ימולא שאלון דמוגרפי קצר: גיל, השכלה, תעסוקה, יישוב, מספר ילדים, מבנה המשפחה, גיל הילד וסוג המסגרת.</w:t>
+        <w:t xml:space="preserve">כלי המחקר הוא ריאיון עומק חצי-מובנה. מדריך הריאיון (נספח א') נפתח בשאלה פתוחה, "ספרי לי על עצמך", שנועדה לאפשר לאם לבחור מאיפה להתחיל ולבסס אמון לפני שנכנסים לנושאים רגישים. אחריה מגיעות עוד שש-עשרה שאלות פתוחות, שנעות מהילד והאבחון, דרך חיי היומיום ויחס הסביבה, אל בית הספר והשילוב, הקהילה, משאבי התמיכה והמבט לעתיד. המראיינת תשתמש בשאלות הבהרה קצרות, כמו "תוכלי לתת דוגמה?" או "מה הרגשת באותו רגע?", רק כאשר האם לא תרחיב מעצמה. הראיונות ייערכו בערבית, שפת האם של המשתתפות, ולכן מצורף גם נוסח ערבי של המדריך (נספח ב'). המדריך ייבדק בשני ראיונות פיילוט, ונוסח השאלות יתוקן לפי הצורך. בנוסף ימולא שאלון דמוגרפי קצר: גיל, השכלה, תעסוקה, יישוב, מספר ילדים, מבנה המשפחה, גיל הילד וסוג המסגרת.</w:t>
       </w:r>
     </w:p>
     <w:p>
@@ -2847,6 +2887,88 @@
           <w:szCs w:val="24"/>
           <w:rtl/>
         </w:rPr>
+        <w:t xml:space="preserve">נמר פורסטנברג, ר', ברלב, ל', הרקוביץ-אמיר, ע', ואיילי, ט' (2024). </w:t>
+      </w:r>
+      <w:r>
+        <w:rPr>
+          <w:rFonts w:ascii="David" w:cs="David" w:eastAsia="David" w:hAnsi="David"/>
+          <w:i/>
+          <w:iCs/>
+          <w:sz w:val="24"/>
+          <w:szCs w:val="24"/>
+          <w:rtl/>
+        </w:rPr>
+        <w:t xml:space="preserve">החלטות הורים על בחירת מסגרת חינוך לילדיהם הזכאים לשירותי חינוך מיוחדים</w:t>
+      </w:r>
+      <w:r>
+        <w:rPr>
+          <w:rFonts w:ascii="David" w:cs="David" w:eastAsia="David" w:hAnsi="David"/>
+          <w:i w:val="false"/>
+          <w:iCs w:val="false"/>
+          <w:sz w:val="24"/>
+          <w:szCs w:val="24"/>
+          <w:rtl/>
+        </w:rPr>
+        <w:t xml:space="preserve"> (דמ-24-949). מאיירס-ג'וינט-ברוקדייל.</w:t>
+      </w:r>
+    </w:p>
+    <w:p>
+      <w:pPr>
+        <w:bidi/>
+        <w:spacing w:line="360"/>
+        <w:ind w:start="709" w:hanging="709"/>
+        <w:jc w:val="both"/>
+      </w:pPr>
+      <w:r>
+        <w:rPr>
+          <w:rFonts w:ascii="David" w:cs="David" w:eastAsia="David" w:hAnsi="David"/>
+          <w:i w:val="false"/>
+          <w:iCs w:val="false"/>
+          <w:sz w:val="24"/>
+          <w:szCs w:val="24"/>
+          <w:rtl/>
+        </w:rPr>
+        <w:t xml:space="preserve">פריינטה, ב', וברק לוי, י' (2025). תהליכי ההתמודדות של אימהות בדוויות לילדים עם צרכים מיוחדים: "אלוהים נתן לי את הילד הזה מתוך אהבתו הרבה אליי". </w:t>
+      </w:r>
+      <w:r>
+        <w:rPr>
+          <w:rFonts w:ascii="David" w:cs="David" w:eastAsia="David" w:hAnsi="David"/>
+          <w:i/>
+          <w:iCs/>
+          <w:sz w:val="24"/>
+          <w:szCs w:val="24"/>
+          <w:rtl/>
+        </w:rPr>
+        <w:t xml:space="preserve">מפגש לעבודה חינוכית-סוציאלית, לג</w:t>
+      </w:r>
+      <w:r>
+        <w:rPr>
+          <w:rFonts w:ascii="David" w:cs="David" w:eastAsia="David" w:hAnsi="David"/>
+          <w:i w:val="false"/>
+          <w:iCs w:val="false"/>
+          <w:sz w:val="24"/>
+          <w:szCs w:val="24"/>
+          <w:rtl/>
+        </w:rPr>
+        <w:t xml:space="preserve">(58).</w:t>
+      </w:r>
+    </w:p>
+    <w:p>
+      <w:pPr>
+        <w:bidi/>
+        <w:spacing w:line="360"/>
+        <w:ind w:start="709" w:hanging="709"/>
+        <w:jc w:val="both"/>
+      </w:pPr>
+      <w:r>
+        <w:rPr>
+          <w:rFonts w:ascii="David" w:cs="David" w:eastAsia="David" w:hAnsi="David"/>
+          <w:i w:val="false"/>
+          <w:iCs w:val="false"/>
+          <w:sz w:val="24"/>
+          <w:szCs w:val="24"/>
+          <w:rtl/>
+        </w:rPr>
         <w:t xml:space="preserve">שקדי, א' (2003). </w:t>
       </w:r>
       <w:r>
@@ -3402,65 +3524,7 @@
           <w:szCs w:val="24"/>
           <w:rtl/>
         </w:rPr>
-        <w:t xml:space="preserve">הריאיון ייערך בערבית (הנוסח הערבי בנספח ב'). השאלות הראשיות יישאלו לכל המשתתפות. שאלות ההמשך, בכתב נטוי, ישמשו רק אם הנושא לא עלה מעצמו. סדר השאלות גמיש ויותאם לזרימת השיחה.</w:t>
-      </w:r>
-    </w:p>
-    <w:p>
-      <w:pPr>
-        <w:pStyle w:val="Heading2"/>
-        <w:keepNext/>
-        <w:bidi/>
-        <w:spacing w:after="120" w:before="240" w:line="360"/>
-      </w:pPr>
-      <w:r>
-        <w:rPr>
-          <w:rFonts w:ascii="David" w:cs="David" w:eastAsia="David" w:hAnsi="David"/>
-          <w:b/>
-          <w:bCs/>
-          <w:sz w:val="28"/>
-          <w:szCs w:val="28"/>
-          <w:rtl/>
-        </w:rPr>
-        <w:t xml:space="preserve">פתיחה</w:t>
-      </w:r>
-    </w:p>
-    <w:p>
-      <w:pPr>
-        <w:bidi/>
-        <w:spacing w:after="0" w:before="0" w:line="360"/>
-        <w:jc w:val="both"/>
-      </w:pPr>
-      <w:r>
-        <w:rPr>
-          <w:rFonts w:ascii="David" w:cs="David" w:eastAsia="David" w:hAnsi="David"/>
-          <w:b w:val="false"/>
-          <w:bCs w:val="false"/>
-          <w:i w:val="false"/>
-          <w:iCs w:val="false"/>
-          <w:sz w:val="24"/>
-          <w:szCs w:val="24"/>
-          <w:rtl/>
-        </w:rPr>
-        <w:t xml:space="preserve">הצגת המראיינת, הסבר קצר על מטרת המחקר ("אני רוצה להבין איך אימהות כמוך חוות את הדרך של הילד בבית הספר ובקהילה"), הבהרה שאין תשובות נכונות או לא נכונות, סודיות, הקלטה, זכות לעצור בכל רגע, חתימה על טופס הסכמה.</w:t>
-      </w:r>
-    </w:p>
-    <w:p>
-      <w:pPr>
-        <w:pStyle w:val="Heading2"/>
-        <w:keepNext/>
-        <w:bidi/>
-        <w:spacing w:after="120" w:before="240" w:line="360"/>
-      </w:pPr>
-      <w:r>
-        <w:rPr>
-          <w:rFonts w:ascii="David" w:cs="David" w:eastAsia="David" w:hAnsi="David"/>
-          <w:b/>
-          <w:bCs/>
-          <w:sz w:val="28"/>
-          <w:szCs w:val="28"/>
-          <w:rtl/>
-        </w:rPr>
-        <w:t xml:space="preserve">1. שאלת פתיחה</w:t>
+        <w:t xml:space="preserve">הריאיון ייערך בערבית (הנוסח הערבי בנספח ב'). לפני השאלות: הצגת המראיינת, הסבר קצר על מטרת המחקר, הבהרה שאין תשובות נכונות או לא נכונות, סודיות, הקלטה, זכות לעצור בכל רגע וחתימה על טופס הסכמה. סדר השאלות גמיש ויותאם לזרימת השיחה. בסיום: תודה, תזכורת על סודיות ומסירת פרטי קשר של החוקרים ושל שירותי תמיכה בערבית.</w:t>
       </w:r>
     </w:p>
     <w:p>
@@ -3490,42 +3554,439 @@
     </w:p>
     <w:p>
       <w:pPr>
-        <w:bidi/>
-        <w:spacing w:after="0" w:before="0" w:line="360"/>
-        <w:ind w:start="1134"/>
-        <w:jc w:val="both"/>
-      </w:pPr>
-      <w:r>
-        <w:rPr>
-          <w:rFonts w:ascii="David" w:cs="David" w:eastAsia="David" w:hAnsi="David"/>
-          <w:b w:val="false"/>
-          <w:bCs w:val="false"/>
-          <w:i w:val="false"/>
-          <w:iCs w:val="false"/>
-          <w:sz w:val="24"/>
-          <w:szCs w:val="24"/>
-          <w:rtl/>
-        </w:rPr>
-        <w:t xml:space="preserve">גיל, השכלה, עיסוק, איפה גדלת ואיפה את גרה היום, מבנה המשפחה, כמה ילדים יש לך ובאילו גילאים.</w:t>
-      </w:r>
-    </w:p>
-    <w:p>
-      <w:pPr>
-        <w:pStyle w:val="Heading2"/>
-        <w:keepNext/>
-        <w:bidi/>
-        <w:spacing w:after="120" w:before="240" w:line="360"/>
+        <w:pStyle w:val="ListParagraph"/>
+        <w:numPr>
+          <w:ilvl w:val="0"/>
+          <w:numId w:val="4"/>
+        </w:numPr>
+        <w:bidi/>
+        <w:spacing w:after="0" w:before="0" w:line="360"/>
+        <w:jc w:val="both"/>
+      </w:pPr>
+      <w:r>
+        <w:rPr>
+          <w:rFonts w:ascii="David" w:cs="David" w:eastAsia="David" w:hAnsi="David"/>
+          <w:b w:val="false"/>
+          <w:bCs w:val="false"/>
+          <w:i w:val="false"/>
+          <w:iCs w:val="false"/>
+          <w:sz w:val="24"/>
+          <w:szCs w:val="24"/>
+          <w:rtl/>
+        </w:rPr>
+        <w:t xml:space="preserve">ספרי לי על [שם הילד/ה]. איך גיליתם שיש לו/לה מוגבלות, ומה הרגשת אז?</w:t>
+      </w:r>
+    </w:p>
+    <w:p>
+      <w:pPr>
+        <w:pStyle w:val="ListParagraph"/>
+        <w:numPr>
+          <w:ilvl w:val="0"/>
+          <w:numId w:val="4"/>
+        </w:numPr>
+        <w:bidi/>
+        <w:spacing w:after="0" w:before="0" w:line="360"/>
+        <w:jc w:val="both"/>
+      </w:pPr>
+      <w:r>
+        <w:rPr>
+          <w:rFonts w:ascii="David" w:cs="David" w:eastAsia="David" w:hAnsi="David"/>
+          <w:b w:val="false"/>
+          <w:bCs w:val="false"/>
+          <w:i w:val="false"/>
+          <w:iCs w:val="false"/>
+          <w:sz w:val="24"/>
+          <w:szCs w:val="24"/>
+          <w:rtl/>
+        </w:rPr>
+        <w:t xml:space="preserve">תארי לי יום רגיל שלך, מהבוקר עד הלילה.</w:t>
+      </w:r>
+    </w:p>
+    <w:p>
+      <w:pPr>
+        <w:pStyle w:val="ListParagraph"/>
+        <w:numPr>
+          <w:ilvl w:val="0"/>
+          <w:numId w:val="4"/>
+        </w:numPr>
+        <w:bidi/>
+        <w:spacing w:after="0" w:before="0" w:line="360"/>
+        <w:jc w:val="both"/>
+      </w:pPr>
+      <w:r>
+        <w:rPr>
+          <w:rFonts w:ascii="David" w:cs="David" w:eastAsia="David" w:hAnsi="David"/>
+          <w:b w:val="false"/>
+          <w:bCs w:val="false"/>
+          <w:i w:val="false"/>
+          <w:iCs w:val="false"/>
+          <w:sz w:val="24"/>
+          <w:szCs w:val="24"/>
+          <w:rtl/>
+        </w:rPr>
+        <w:t xml:space="preserve">מה הדבר הכי קשה בשבילך בגידול של [שם], ומה נותן לך כוח?</w:t>
+      </w:r>
+    </w:p>
+    <w:p>
+      <w:pPr>
+        <w:pStyle w:val="ListParagraph"/>
+        <w:numPr>
+          <w:ilvl w:val="0"/>
+          <w:numId w:val="4"/>
+        </w:numPr>
+        <w:bidi/>
+        <w:spacing w:after="0" w:before="0" w:line="360"/>
+        <w:jc w:val="both"/>
+      </w:pPr>
+      <w:r>
+        <w:rPr>
+          <w:rFonts w:ascii="David" w:cs="David" w:eastAsia="David" w:hAnsi="David"/>
+          <w:b w:val="false"/>
+          <w:bCs w:val="false"/>
+          <w:i w:val="false"/>
+          <w:iCs w:val="false"/>
+          <w:sz w:val="24"/>
+          <w:szCs w:val="24"/>
+          <w:rtl/>
+        </w:rPr>
+        <w:t xml:space="preserve">איך המצב השפיע על הבריאות שלך, על הקשר עם בעלך ועם המשפחה המורחבת?</w:t>
+      </w:r>
+    </w:p>
+    <w:p>
+      <w:pPr>
+        <w:pStyle w:val="ListParagraph"/>
+        <w:numPr>
+          <w:ilvl w:val="0"/>
+          <w:numId w:val="4"/>
+        </w:numPr>
+        <w:bidi/>
+        <w:spacing w:after="0" w:before="0" w:line="360"/>
+        <w:jc w:val="both"/>
+      </w:pPr>
+      <w:r>
+        <w:rPr>
+          <w:rFonts w:ascii="David" w:cs="David" w:eastAsia="David" w:hAnsi="David"/>
+          <w:b w:val="false"/>
+          <w:bCs w:val="false"/>
+          <w:i w:val="false"/>
+          <w:iCs w:val="false"/>
+          <w:sz w:val="24"/>
+          <w:szCs w:val="24"/>
+          <w:rtl/>
+        </w:rPr>
+        <w:t xml:space="preserve">מה חושבים אנשים בסביבה שלך על ילד עם מוגבלות?</w:t>
+      </w:r>
+    </w:p>
+    <w:p>
+      <w:pPr>
+        <w:pStyle w:val="ListParagraph"/>
+        <w:numPr>
+          <w:ilvl w:val="0"/>
+          <w:numId w:val="4"/>
+        </w:numPr>
+        <w:bidi/>
+        <w:spacing w:after="0" w:before="0" w:line="360"/>
+        <w:jc w:val="both"/>
+      </w:pPr>
+      <w:r>
+        <w:rPr>
+          <w:rFonts w:ascii="David" w:cs="David" w:eastAsia="David" w:hAnsi="David"/>
+          <w:b w:val="false"/>
+          <w:bCs w:val="false"/>
+          <w:i w:val="false"/>
+          <w:iCs w:val="false"/>
+          <w:sz w:val="24"/>
+          <w:szCs w:val="24"/>
+          <w:rtl/>
+        </w:rPr>
+        <w:t xml:space="preserve">איך המשפחה המורחבת והשבט התייחסו כשנודע על המוגבלות, ואיך היום?</w:t>
+      </w:r>
+    </w:p>
+    <w:p>
+      <w:pPr>
+        <w:pStyle w:val="ListParagraph"/>
+        <w:numPr>
+          <w:ilvl w:val="0"/>
+          <w:numId w:val="4"/>
+        </w:numPr>
+        <w:bidi/>
+        <w:spacing w:after="0" w:before="0" w:line="360"/>
+        <w:jc w:val="both"/>
+      </w:pPr>
+      <w:r>
+        <w:rPr>
+          <w:rFonts w:ascii="David" w:cs="David" w:eastAsia="David" w:hAnsi="David"/>
+          <w:b w:val="false"/>
+          <w:bCs w:val="false"/>
+          <w:i w:val="false"/>
+          <w:iCs w:val="false"/>
+          <w:sz w:val="24"/>
+          <w:szCs w:val="24"/>
+          <w:rtl/>
+        </w:rPr>
+        <w:t xml:space="preserve">האם הרגשת פעם שמאשימים אותך, או שהמוגבלות של הילד השפיעה על המעמד שלך בבית או במשפחה?</w:t>
+      </w:r>
+    </w:p>
+    <w:p>
+      <w:pPr>
+        <w:pStyle w:val="ListParagraph"/>
+        <w:numPr>
+          <w:ilvl w:val="0"/>
+          <w:numId w:val="4"/>
+        </w:numPr>
+        <w:bidi/>
+        <w:spacing w:after="0" w:before="0" w:line="360"/>
+        <w:jc w:val="both"/>
+      </w:pPr>
+      <w:r>
+        <w:rPr>
+          <w:rFonts w:ascii="David" w:cs="David" w:eastAsia="David" w:hAnsi="David"/>
+          <w:b w:val="false"/>
+          <w:bCs w:val="false"/>
+          <w:i w:val="false"/>
+          <w:iCs w:val="false"/>
+          <w:sz w:val="24"/>
+          <w:szCs w:val="24"/>
+          <w:rtl/>
+        </w:rPr>
+        <w:t xml:space="preserve">איזה מקום יש לדת ולאמונה באופן שבו את מבינה את המצב ומתמודדת איתו?</w:t>
+      </w:r>
+    </w:p>
+    <w:p>
+      <w:pPr>
+        <w:pStyle w:val="ListParagraph"/>
+        <w:numPr>
+          <w:ilvl w:val="0"/>
+          <w:numId w:val="4"/>
+        </w:numPr>
+        <w:bidi/>
+        <w:spacing w:after="0" w:before="0" w:line="360"/>
+        <w:jc w:val="both"/>
+      </w:pPr>
+      <w:r>
+        <w:rPr>
+          <w:rFonts w:ascii="David" w:cs="David" w:eastAsia="David" w:hAnsi="David"/>
+          <w:b w:val="false"/>
+          <w:bCs w:val="false"/>
+          <w:i w:val="false"/>
+          <w:iCs w:val="false"/>
+          <w:sz w:val="24"/>
+          <w:szCs w:val="24"/>
+          <w:rtl/>
+        </w:rPr>
+        <w:t xml:space="preserve">איפה [שם] לומד/ת היום, ואיך הגעתם למסגרת הזאת? מי החליט, והאם הרגשת שמקשיבים לך בוועדה?</w:t>
+      </w:r>
+    </w:p>
+    <w:p>
+      <w:pPr>
+        <w:pStyle w:val="ListParagraph"/>
+        <w:numPr>
+          <w:ilvl w:val="0"/>
+          <w:numId w:val="4"/>
+        </w:numPr>
+        <w:bidi/>
+        <w:spacing w:after="0" w:before="0" w:line="360"/>
+        <w:jc w:val="both"/>
+      </w:pPr>
+      <w:r>
+        <w:rPr>
+          <w:rFonts w:ascii="David" w:cs="David" w:eastAsia="David" w:hAnsi="David"/>
+          <w:b w:val="false"/>
+          <w:bCs w:val="false"/>
+          <w:i w:val="false"/>
+          <w:iCs w:val="false"/>
+          <w:sz w:val="24"/>
+          <w:szCs w:val="24"/>
+          <w:rtl/>
+        </w:rPr>
+        <w:t xml:space="preserve">כשאומרים "שילוב", מה זה אומר בשבילך, ומה היית רוצה שיהיה בשביל [שם]?</w:t>
+      </w:r>
+    </w:p>
+    <w:p>
+      <w:pPr>
+        <w:pStyle w:val="ListParagraph"/>
+        <w:numPr>
+          <w:ilvl w:val="0"/>
+          <w:numId w:val="4"/>
+        </w:numPr>
+        <w:bidi/>
+        <w:spacing w:after="0" w:before="0" w:line="360"/>
+        <w:jc w:val="both"/>
+      </w:pPr>
+      <w:r>
+        <w:rPr>
+          <w:rFonts w:ascii="David" w:cs="David" w:eastAsia="David" w:hAnsi="David"/>
+          <w:b w:val="false"/>
+          <w:bCs w:val="false"/>
+          <w:i w:val="false"/>
+          <w:iCs w:val="false"/>
+          <w:sz w:val="24"/>
+          <w:szCs w:val="24"/>
+          <w:rtl/>
+        </w:rPr>
+        <w:t xml:space="preserve">איך הקשר שלך עם המורות, הסייעת והיועצת? באיזו שפה מדברים איתך, ואיך מעדכנים אותך?</w:t>
+      </w:r>
+    </w:p>
+    <w:p>
+      <w:pPr>
+        <w:pStyle w:val="ListParagraph"/>
+        <w:numPr>
+          <w:ilvl w:val="0"/>
+          <w:numId w:val="4"/>
+        </w:numPr>
+        <w:bidi/>
+        <w:spacing w:after="0" w:before="0" w:line="360"/>
+        <w:jc w:val="both"/>
+      </w:pPr>
+      <w:r>
+        <w:rPr>
+          <w:rFonts w:ascii="David" w:cs="David" w:eastAsia="David" w:hAnsi="David"/>
+          <w:b w:val="false"/>
+          <w:bCs w:val="false"/>
+          <w:i w:val="false"/>
+          <w:iCs w:val="false"/>
+          <w:sz w:val="24"/>
+          <w:szCs w:val="24"/>
+          <w:rtl/>
+        </w:rPr>
+        <w:t xml:space="preserve">מה עובד טוב בבית הספר ומה לא? האם [שם] מרגיש/ה שייך/ת, ויש לו/לה חברים?</w:t>
+      </w:r>
+    </w:p>
+    <w:p>
+      <w:pPr>
+        <w:pStyle w:val="ListParagraph"/>
+        <w:numPr>
+          <w:ilvl w:val="0"/>
+          <w:numId w:val="4"/>
+        </w:numPr>
+        <w:bidi/>
+        <w:spacing w:after="0" w:before="0" w:line="360"/>
+        <w:jc w:val="both"/>
+      </w:pPr>
+      <w:r>
+        <w:rPr>
+          <w:rFonts w:ascii="David" w:cs="David" w:eastAsia="David" w:hAnsi="David"/>
+          <w:b w:val="false"/>
+          <w:bCs w:val="false"/>
+          <w:i w:val="false"/>
+          <w:iCs w:val="false"/>
+          <w:sz w:val="24"/>
+          <w:szCs w:val="24"/>
+          <w:rtl/>
+        </w:rPr>
+        <w:t xml:space="preserve">איך [שם] משתתף/ת בחיי הקהילה: משחק עם ילדי השכנים, מסגד, אירועים משפחתיים? יש מקומות שבהם הוא/היא לא רצוי/ה?</w:t>
+      </w:r>
+    </w:p>
+    <w:p>
+      <w:pPr>
+        <w:pStyle w:val="ListParagraph"/>
+        <w:numPr>
+          <w:ilvl w:val="0"/>
+          <w:numId w:val="4"/>
+        </w:numPr>
+        <w:bidi/>
+        <w:spacing w:after="0" w:before="0" w:line="360"/>
+        <w:jc w:val="both"/>
+      </w:pPr>
+      <w:r>
+        <w:rPr>
+          <w:rFonts w:ascii="David" w:cs="David" w:eastAsia="David" w:hAnsi="David"/>
+          <w:b w:val="false"/>
+          <w:bCs w:val="false"/>
+          <w:i w:val="false"/>
+          <w:iCs w:val="false"/>
+          <w:sz w:val="24"/>
+          <w:szCs w:val="24"/>
+          <w:rtl/>
+        </w:rPr>
+        <w:t xml:space="preserve">למי את פונה כשקשה לך, ועם אילו שירותים את בקשר? מה חסר, ומה היה יכול לעזור?</w:t>
+      </w:r>
+    </w:p>
+    <w:p>
+      <w:pPr>
+        <w:pStyle w:val="ListParagraph"/>
+        <w:numPr>
+          <w:ilvl w:val="0"/>
+          <w:numId w:val="4"/>
+        </w:numPr>
+        <w:bidi/>
+        <w:spacing w:after="0" w:before="0" w:line="360"/>
+        <w:jc w:val="both"/>
+      </w:pPr>
+      <w:r>
+        <w:rPr>
+          <w:rFonts w:ascii="David" w:cs="David" w:eastAsia="David" w:hAnsi="David"/>
+          <w:b w:val="false"/>
+          <w:bCs w:val="false"/>
+          <w:i w:val="false"/>
+          <w:iCs w:val="false"/>
+          <w:sz w:val="24"/>
+          <w:szCs w:val="24"/>
+          <w:rtl/>
+        </w:rPr>
+        <w:t xml:space="preserve">מה את מאחלת ל[שם] בעוד חמש שנים, ומה היית אומרת לאם צעירה שרק גילתה שלילדה יש מוגבלות?</w:t>
+      </w:r>
+    </w:p>
+    <w:p>
+      <w:pPr>
+        <w:pStyle w:val="ListParagraph"/>
+        <w:numPr>
+          <w:ilvl w:val="0"/>
+          <w:numId w:val="4"/>
+        </w:numPr>
+        <w:bidi/>
+        <w:spacing w:after="0" w:before="0" w:line="360"/>
+        <w:jc w:val="both"/>
+      </w:pPr>
+      <w:r>
+        <w:rPr>
+          <w:rFonts w:ascii="David" w:cs="David" w:eastAsia="David" w:hAnsi="David"/>
+          <w:b w:val="false"/>
+          <w:bCs w:val="false"/>
+          <w:i w:val="false"/>
+          <w:iCs w:val="false"/>
+          <w:sz w:val="24"/>
+          <w:szCs w:val="24"/>
+          <w:rtl/>
+        </w:rPr>
+        <w:t xml:space="preserve">אם היית יכולה להגיד משפט אחד למנהל בית הספר ומשפט אחד למשרד החינוך, מה היית אומרת? ויש משהו שלא שאלתי ואת רוצה להוסיף?</w:t>
+      </w:r>
+    </w:p>
+    <w:p>
+      <w:pPr>
+        <w:pStyle w:val="Heading1"/>
+        <w:pageBreakBefore/>
+        <w:bidi/>
+        <w:spacing w:after="240" w:before="0" w:line="360"/>
       </w:pPr>
       <w:r>
         <w:rPr>
           <w:rFonts w:ascii="David" w:cs="David" w:eastAsia="David" w:hAnsi="David"/>
           <w:b/>
           <w:bCs/>
-          <w:sz w:val="28"/>
-          <w:szCs w:val="28"/>
-          <w:rtl/>
-        </w:rPr>
-        <w:t xml:space="preserve">2. הילד/ה והאבחון</w:t>
+          <w:sz w:val="32"/>
+          <w:szCs w:val="32"/>
+          <w:rtl/>
+        </w:rPr>
+        <w:t xml:space="preserve">נספח ב': מדריך הריאיון בערבית (دليل المقابلة)</w:t>
+      </w:r>
+    </w:p>
+    <w:p>
+      <w:pPr>
+        <w:bidi/>
+        <w:spacing w:line="360"/>
+        <w:jc w:val="both"/>
+      </w:pPr>
+      <w:r>
+        <w:rPr>
+          <w:rFonts w:ascii="Arial" w:cs="Arial" w:eastAsia="Arial" w:hAnsi="Arial"/>
+          <w:b w:val="false"/>
+          <w:bCs w:val="false"/>
+          <w:sz w:val="24"/>
+          <w:szCs w:val="24"/>
+          <w:rtl/>
+        </w:rPr>
+        <w:t xml:space="preserve">قبل الأسئلة: تعريف بالباحثة، شرح قصير عن هدف البحث، توضيح إنه ما في إجابات صح أو غلط، السرية، التسجيل، حق التوقف بأي لحظة، وتوقيع نموذج الموافقة. ترتيب الأسئلة مرن وبيتغير حسب مجرى الحديث. بالختام: شكر، تذكير بالسرية، وإعطاء أرقام تواصل للباحثين ولخدمات دعم باللغة العربية.</w:t>
       </w:r>
     </w:p>
     <w:p>
@@ -3536,21 +3997,19 @@
           <w:numId w:val="5"/>
         </w:numPr>
         <w:bidi/>
-        <w:spacing w:after="0" w:before="0" w:line="360"/>
-        <w:jc w:val="both"/>
-      </w:pPr>
-      <w:r>
-        <w:rPr>
-          <w:rFonts w:ascii="David" w:cs="David" w:eastAsia="David" w:hAnsi="David"/>
-          <w:b w:val="false"/>
-          <w:bCs w:val="false"/>
-          <w:i w:val="false"/>
-          <w:iCs w:val="false"/>
-          <w:sz w:val="24"/>
-          <w:szCs w:val="24"/>
-          <w:rtl/>
-        </w:rPr>
-        <w:t xml:space="preserve">ספרי לי על [שם הילד/ה].</w:t>
+        <w:spacing w:line="360"/>
+        <w:jc w:val="both"/>
+      </w:pPr>
+      <w:r>
+        <w:rPr>
+          <w:rFonts w:ascii="Arial" w:cs="Arial" w:eastAsia="Arial" w:hAnsi="Arial"/>
+          <w:b w:val="false"/>
+          <w:bCs w:val="false"/>
+          <w:sz w:val="24"/>
+          <w:szCs w:val="24"/>
+          <w:rtl/>
+        </w:rPr>
+        <w:t xml:space="preserve">احكيلي عن حالك.</w:t>
       </w:r>
     </w:p>
     <w:p>
@@ -3561,21 +4020,19 @@
           <w:numId w:val="5"/>
         </w:numPr>
         <w:bidi/>
-        <w:spacing w:after="0" w:before="0" w:line="360"/>
-        <w:jc w:val="both"/>
-      </w:pPr>
-      <w:r>
-        <w:rPr>
-          <w:rFonts w:ascii="David" w:cs="David" w:eastAsia="David" w:hAnsi="David"/>
-          <w:b w:val="false"/>
-          <w:bCs w:val="false"/>
-          <w:i w:val="false"/>
-          <w:iCs w:val="false"/>
-          <w:sz w:val="24"/>
-          <w:szCs w:val="24"/>
-          <w:rtl/>
-        </w:rPr>
-        <w:t xml:space="preserve">איך גיליתם שיש לו/לה מוגבלות? מי ליווה אתכם בתקופה הזאת?</w:t>
+        <w:spacing w:line="360"/>
+        <w:jc w:val="both"/>
+      </w:pPr>
+      <w:r>
+        <w:rPr>
+          <w:rFonts w:ascii="Arial" w:cs="Arial" w:eastAsia="Arial" w:hAnsi="Arial"/>
+          <w:b w:val="false"/>
+          <w:bCs w:val="false"/>
+          <w:sz w:val="24"/>
+          <w:szCs w:val="24"/>
+          <w:rtl/>
+        </w:rPr>
+        <w:t xml:space="preserve">احكيلي عن [اسم الطفل/ة]. كيف اكتشفتوا إنه عنده/عندها إعاقة، وشو حسّيتي وقتها؟</w:t>
       </w:r>
     </w:p>
     <w:p>
@@ -3586,61 +4043,19 @@
           <w:numId w:val="5"/>
         </w:numPr>
         <w:bidi/>
-        <w:spacing w:after="0" w:before="0" w:line="360"/>
-        <w:jc w:val="both"/>
-      </w:pPr>
-      <w:r>
-        <w:rPr>
-          <w:rFonts w:ascii="David" w:cs="David" w:eastAsia="David" w:hAnsi="David"/>
-          <w:b w:val="false"/>
-          <w:bCs w:val="false"/>
-          <w:i w:val="false"/>
-          <w:iCs w:val="false"/>
-          <w:sz w:val="24"/>
-          <w:szCs w:val="24"/>
-          <w:rtl/>
-        </w:rPr>
-        <w:t xml:space="preserve">מה הרגשת אז? ומה את מרגישה היום כשאת נזכרת?</w:t>
-      </w:r>
-    </w:p>
-    <w:p>
-      <w:pPr>
-        <w:bidi/>
-        <w:spacing w:after="0" w:before="0" w:line="360"/>
-        <w:ind w:start="1134"/>
-        <w:jc w:val="both"/>
-      </w:pPr>
-      <w:r>
-        <w:rPr>
-          <w:rFonts w:ascii="David" w:cs="David" w:eastAsia="David" w:hAnsi="David"/>
-          <w:b w:val="false"/>
-          <w:bCs w:val="false"/>
-          <w:i w:val="false"/>
-          <w:iCs w:val="false"/>
-          <w:sz w:val="24"/>
-          <w:szCs w:val="24"/>
-          <w:rtl/>
-        </w:rPr>
-        <w:t xml:space="preserve">מי הסביר לך מה המשמעות של האבחנה? באיזו שפה? האם הרגשת שהבנת?</w:t>
-      </w:r>
-    </w:p>
-    <w:p>
-      <w:pPr>
-        <w:pStyle w:val="Heading2"/>
-        <w:keepNext/>
-        <w:bidi/>
-        <w:spacing w:after="120" w:before="240" w:line="360"/>
-      </w:pPr>
-      <w:r>
-        <w:rPr>
-          <w:rFonts w:ascii="David" w:cs="David" w:eastAsia="David" w:hAnsi="David"/>
-          <w:b/>
-          <w:bCs/>
-          <w:sz w:val="28"/>
-          <w:szCs w:val="28"/>
-          <w:rtl/>
-        </w:rPr>
-        <w:t xml:space="preserve">3. מה עוברות: חיי היומיום</w:t>
+        <w:spacing w:line="360"/>
+        <w:jc w:val="both"/>
+      </w:pPr>
+      <w:r>
+        <w:rPr>
+          <w:rFonts w:ascii="Arial" w:cs="Arial" w:eastAsia="Arial" w:hAnsi="Arial"/>
+          <w:b w:val="false"/>
+          <w:bCs w:val="false"/>
+          <w:sz w:val="24"/>
+          <w:szCs w:val="24"/>
+          <w:rtl/>
+        </w:rPr>
+        <w:t xml:space="preserve">صفيلي يوم عادي إلك، من الصبح للّيل.</w:t>
       </w:r>
     </w:p>
     <w:p>
@@ -3648,24 +4063,22 @@
         <w:pStyle w:val="ListParagraph"/>
         <w:numPr>
           <w:ilvl w:val="0"/>
-          <w:numId w:val="6"/>
+          <w:numId w:val="5"/>
         </w:numPr>
         <w:bidi/>
-        <w:spacing w:after="0" w:before="0" w:line="360"/>
-        <w:jc w:val="both"/>
-      </w:pPr>
-      <w:r>
-        <w:rPr>
-          <w:rFonts w:ascii="David" w:cs="David" w:eastAsia="David" w:hAnsi="David"/>
-          <w:b w:val="false"/>
-          <w:bCs w:val="false"/>
-          <w:i w:val="false"/>
-          <w:iCs w:val="false"/>
-          <w:sz w:val="24"/>
-          <w:szCs w:val="24"/>
-          <w:rtl/>
-        </w:rPr>
-        <w:t xml:space="preserve">תארי לי יום רגיל שלך, מהבוקר עד הלילה.</w:t>
+        <w:spacing w:line="360"/>
+        <w:jc w:val="both"/>
+      </w:pPr>
+      <w:r>
+        <w:rPr>
+          <w:rFonts w:ascii="Arial" w:cs="Arial" w:eastAsia="Arial" w:hAnsi="Arial"/>
+          <w:b w:val="false"/>
+          <w:bCs w:val="false"/>
+          <w:sz w:val="24"/>
+          <w:szCs w:val="24"/>
+          <w:rtl/>
+        </w:rPr>
+        <w:t xml:space="preserve">شو أصعب إشي بالنسبة إلك بتربية [الاسم]، وشو بيعطيكي قوة؟</w:t>
       </w:r>
     </w:p>
     <w:p>
@@ -3673,24 +4086,22 @@
         <w:pStyle w:val="ListParagraph"/>
         <w:numPr>
           <w:ilvl w:val="0"/>
-          <w:numId w:val="6"/>
+          <w:numId w:val="5"/>
         </w:numPr>
         <w:bidi/>
-        <w:spacing w:after="0" w:before="0" w:line="360"/>
-        <w:jc w:val="both"/>
-      </w:pPr>
-      <w:r>
-        <w:rPr>
-          <w:rFonts w:ascii="David" w:cs="David" w:eastAsia="David" w:hAnsi="David"/>
-          <w:b w:val="false"/>
-          <w:bCs w:val="false"/>
-          <w:i w:val="false"/>
-          <w:iCs w:val="false"/>
-          <w:sz w:val="24"/>
-          <w:szCs w:val="24"/>
-          <w:rtl/>
-        </w:rPr>
-        <w:t xml:space="preserve">מה הדבר הכי קשה בשבילך בגידול של [שם]? ומה נותן לך כוח?</w:t>
+        <w:spacing w:line="360"/>
+        <w:jc w:val="both"/>
+      </w:pPr>
+      <w:r>
+        <w:rPr>
+          <w:rFonts w:ascii="Arial" w:cs="Arial" w:eastAsia="Arial" w:hAnsi="Arial"/>
+          <w:b w:val="false"/>
+          <w:bCs w:val="false"/>
+          <w:sz w:val="24"/>
+          <w:szCs w:val="24"/>
+          <w:rtl/>
+        </w:rPr>
+        <w:t xml:space="preserve">كيف أثّر الوضع على صحتك، وعلى علاقتك مع زوجك ومع العائلة الكبيرة؟</w:t>
       </w:r>
     </w:p>
     <w:p>
@@ -3698,24 +4109,22 @@
         <w:pStyle w:val="ListParagraph"/>
         <w:numPr>
           <w:ilvl w:val="0"/>
-          <w:numId w:val="6"/>
+          <w:numId w:val="5"/>
         </w:numPr>
         <w:bidi/>
-        <w:spacing w:after="0" w:before="0" w:line="360"/>
-        <w:jc w:val="both"/>
-      </w:pPr>
-      <w:r>
-        <w:rPr>
-          <w:rFonts w:ascii="David" w:cs="David" w:eastAsia="David" w:hAnsi="David"/>
-          <w:b w:val="false"/>
-          <w:bCs w:val="false"/>
-          <w:i w:val="false"/>
-          <w:iCs w:val="false"/>
-          <w:sz w:val="24"/>
-          <w:szCs w:val="24"/>
-          <w:rtl/>
-        </w:rPr>
-        <w:t xml:space="preserve">איך המצב השפיע על הבריאות שלך, על השינה, על מצב הרוח?</w:t>
+        <w:spacing w:line="360"/>
+        <w:jc w:val="both"/>
+      </w:pPr>
+      <w:r>
+        <w:rPr>
+          <w:rFonts w:ascii="Arial" w:cs="Arial" w:eastAsia="Arial" w:hAnsi="Arial"/>
+          <w:b w:val="false"/>
+          <w:bCs w:val="false"/>
+          <w:sz w:val="24"/>
+          <w:szCs w:val="24"/>
+          <w:rtl/>
+        </w:rPr>
+        <w:t xml:space="preserve">شو بيفكروا الناس بمحيطك عن طفل عنده إعاقة؟</w:t>
       </w:r>
     </w:p>
     <w:p>
@@ -3723,64 +4132,22 @@
         <w:pStyle w:val="ListParagraph"/>
         <w:numPr>
           <w:ilvl w:val="0"/>
-          <w:numId w:val="6"/>
+          <w:numId w:val="5"/>
         </w:numPr>
         <w:bidi/>
-        <w:spacing w:after="0" w:before="0" w:line="360"/>
-        <w:jc w:val="both"/>
-      </w:pPr>
-      <w:r>
-        <w:rPr>
-          <w:rFonts w:ascii="David" w:cs="David" w:eastAsia="David" w:hAnsi="David"/>
-          <w:b w:val="false"/>
-          <w:bCs w:val="false"/>
-          <w:i w:val="false"/>
-          <w:iCs w:val="false"/>
-          <w:sz w:val="24"/>
-          <w:szCs w:val="24"/>
-          <w:rtl/>
-        </w:rPr>
-        <w:t xml:space="preserve">איך זה השפיע על הקשר שלך עם בעלך? עם המשפחה המורחבת? עם הילדים האחרים?</w:t>
-      </w:r>
-    </w:p>
-    <w:p>
-      <w:pPr>
-        <w:bidi/>
-        <w:spacing w:after="0" w:before="0" w:line="360"/>
-        <w:ind w:start="1134"/>
-        <w:jc w:val="both"/>
-      </w:pPr>
-      <w:r>
-        <w:rPr>
-          <w:rFonts w:ascii="David" w:cs="David" w:eastAsia="David" w:hAnsi="David"/>
-          <w:b w:val="false"/>
-          <w:bCs w:val="false"/>
-          <w:i w:val="false"/>
-          <w:iCs w:val="false"/>
-          <w:sz w:val="24"/>
-          <w:szCs w:val="24"/>
-          <w:rtl/>
-        </w:rPr>
-        <w:t xml:space="preserve">האם יש מישהו שמחליף אותך כשאת צריכה? האם את יוצאת מהבית לבד לפגישות שקשורות לילד?</w:t>
-      </w:r>
-    </w:p>
-    <w:p>
-      <w:pPr>
-        <w:pStyle w:val="Heading2"/>
-        <w:keepNext/>
-        <w:bidi/>
-        <w:spacing w:after="120" w:before="240" w:line="360"/>
-      </w:pPr>
-      <w:r>
-        <w:rPr>
-          <w:rFonts w:ascii="David" w:cs="David" w:eastAsia="David" w:hAnsi="David"/>
-          <w:b/>
-          <w:bCs/>
-          <w:sz w:val="28"/>
-          <w:szCs w:val="28"/>
-          <w:rtl/>
-        </w:rPr>
-        <w:t xml:space="preserve">4. מה חושבים בסביבה</w:t>
+        <w:spacing w:line="360"/>
+        <w:jc w:val="both"/>
+      </w:pPr>
+      <w:r>
+        <w:rPr>
+          <w:rFonts w:ascii="Arial" w:cs="Arial" w:eastAsia="Arial" w:hAnsi="Arial"/>
+          <w:b w:val="false"/>
+          <w:bCs w:val="false"/>
+          <w:sz w:val="24"/>
+          <w:szCs w:val="24"/>
+          <w:rtl/>
+        </w:rPr>
+        <w:t xml:space="preserve">كيف تعاملت العائلة الكبيرة والعشيرة لما عرفوا عن الإعاقة، وكيف اليوم؟</w:t>
       </w:r>
     </w:p>
     <w:p>
@@ -3788,24 +4155,22 @@
         <w:pStyle w:val="ListParagraph"/>
         <w:numPr>
           <w:ilvl w:val="0"/>
-          <w:numId w:val="7"/>
+          <w:numId w:val="5"/>
         </w:numPr>
         <w:bidi/>
-        <w:spacing w:after="0" w:before="0" w:line="360"/>
-        <w:jc w:val="both"/>
-      </w:pPr>
-      <w:r>
-        <w:rPr>
-          <w:rFonts w:ascii="David" w:cs="David" w:eastAsia="David" w:hAnsi="David"/>
-          <w:b w:val="false"/>
-          <w:bCs w:val="false"/>
-          <w:i w:val="false"/>
-          <w:iCs w:val="false"/>
-          <w:sz w:val="24"/>
-          <w:szCs w:val="24"/>
-          <w:rtl/>
-        </w:rPr>
-        <w:t xml:space="preserve">מה חושבים אנשים בסביבה שלך על ילד עם מוגבלות?</w:t>
+        <w:spacing w:line="360"/>
+        <w:jc w:val="both"/>
+      </w:pPr>
+      <w:r>
+        <w:rPr>
+          <w:rFonts w:ascii="Arial" w:cs="Arial" w:eastAsia="Arial" w:hAnsi="Arial"/>
+          <w:b w:val="false"/>
+          <w:bCs w:val="false"/>
+          <w:sz w:val="24"/>
+          <w:szCs w:val="24"/>
+          <w:rtl/>
+        </w:rPr>
+        <w:t xml:space="preserve">حسّيتي مرة إنهم بيلوموكي، أو إنه إعاقة الولد أثّرت على مكانتك بالبيت أو بالعائلة؟</w:t>
       </w:r>
     </w:p>
     <w:p>
@@ -3813,24 +4178,22 @@
         <w:pStyle w:val="ListParagraph"/>
         <w:numPr>
           <w:ilvl w:val="0"/>
-          <w:numId w:val="7"/>
+          <w:numId w:val="5"/>
         </w:numPr>
         <w:bidi/>
-        <w:spacing w:after="0" w:before="0" w:line="360"/>
-        <w:jc w:val="both"/>
-      </w:pPr>
-      <w:r>
-        <w:rPr>
-          <w:rFonts w:ascii="David" w:cs="David" w:eastAsia="David" w:hAnsi="David"/>
-          <w:b w:val="false"/>
-          <w:bCs w:val="false"/>
-          <w:i w:val="false"/>
-          <w:iCs w:val="false"/>
-          <w:sz w:val="24"/>
-          <w:szCs w:val="24"/>
-          <w:rtl/>
-        </w:rPr>
-        <w:t xml:space="preserve">איך המשפחה המורחבת והשבט התייחסו כשנודע על המוגבלות? ואיך היום?</w:t>
+        <w:spacing w:line="360"/>
+        <w:jc w:val="both"/>
+      </w:pPr>
+      <w:r>
+        <w:rPr>
+          <w:rFonts w:ascii="Arial" w:cs="Arial" w:eastAsia="Arial" w:hAnsi="Arial"/>
+          <w:b w:val="false"/>
+          <w:bCs w:val="false"/>
+          <w:sz w:val="24"/>
+          <w:szCs w:val="24"/>
+          <w:rtl/>
+        </w:rPr>
+        <w:t xml:space="preserve">شو مكان الدين والإيمان بالطريقة اللي بتفهمي فيها الوضع وبتتعاملي معه؟</w:t>
       </w:r>
     </w:p>
     <w:p>
@@ -3838,24 +4201,22 @@
         <w:pStyle w:val="ListParagraph"/>
         <w:numPr>
           <w:ilvl w:val="0"/>
-          <w:numId w:val="7"/>
+          <w:numId w:val="5"/>
         </w:numPr>
         <w:bidi/>
-        <w:spacing w:after="0" w:before="0" w:line="360"/>
-        <w:jc w:val="both"/>
-      </w:pPr>
-      <w:r>
-        <w:rPr>
-          <w:rFonts w:ascii="David" w:cs="David" w:eastAsia="David" w:hAnsi="David"/>
-          <w:b w:val="false"/>
-          <w:bCs w:val="false"/>
-          <w:i w:val="false"/>
-          <w:iCs w:val="false"/>
-          <w:sz w:val="24"/>
-          <w:szCs w:val="24"/>
-          <w:rtl/>
-        </w:rPr>
-        <w:t xml:space="preserve">יש דברים שלא מדברים עליהם? דברים שאנשים אומרים מאחורי הגב?</w:t>
+        <w:spacing w:line="360"/>
+        <w:jc w:val="both"/>
+      </w:pPr>
+      <w:r>
+        <w:rPr>
+          <w:rFonts w:ascii="Arial" w:cs="Arial" w:eastAsia="Arial" w:hAnsi="Arial"/>
+          <w:b w:val="false"/>
+          <w:bCs w:val="false"/>
+          <w:sz w:val="24"/>
+          <w:szCs w:val="24"/>
+          <w:rtl/>
+        </w:rPr>
+        <w:t xml:space="preserve">وين بيتعلم/بتتعلم [الاسم] اليوم، وكيف وصلتوا لهاي المدرسة أو الصف؟ مين قرّر، وحسّيتي إنهم بيسمعوكي باللجنة؟</w:t>
       </w:r>
     </w:p>
     <w:p>
@@ -3863,24 +4224,22 @@
         <w:pStyle w:val="ListParagraph"/>
         <w:numPr>
           <w:ilvl w:val="0"/>
-          <w:numId w:val="7"/>
+          <w:numId w:val="5"/>
         </w:numPr>
         <w:bidi/>
-        <w:spacing w:after="0" w:before="0" w:line="360"/>
-        <w:jc w:val="both"/>
-      </w:pPr>
-      <w:r>
-        <w:rPr>
-          <w:rFonts w:ascii="David" w:cs="David" w:eastAsia="David" w:hAnsi="David"/>
-          <w:b w:val="false"/>
-          <w:bCs w:val="false"/>
-          <w:i w:val="false"/>
-          <w:iCs w:val="false"/>
-          <w:sz w:val="24"/>
-          <w:szCs w:val="24"/>
-          <w:rtl/>
-        </w:rPr>
-        <w:t xml:space="preserve">האם הרגשת פעם שמאשימים אותך? האם המוגבלות של הילד השפיעה על המעמד שלך בבית או במשפחה?</w:t>
+        <w:spacing w:line="360"/>
+        <w:jc w:val="both"/>
+      </w:pPr>
+      <w:r>
+        <w:rPr>
+          <w:rFonts w:ascii="Arial" w:cs="Arial" w:eastAsia="Arial" w:hAnsi="Arial"/>
+          <w:b w:val="false"/>
+          <w:bCs w:val="false"/>
+          <w:sz w:val="24"/>
+          <w:szCs w:val="24"/>
+          <w:rtl/>
+        </w:rPr>
+        <w:t xml:space="preserve">لما بيقولوا "دمج"، شو معناها بالنسبة إلك، وشو كنتي تتمني يكون لـ[الاسم]؟</w:t>
       </w:r>
     </w:p>
     <w:p>
@@ -3888,64 +4247,22 @@
         <w:pStyle w:val="ListParagraph"/>
         <w:numPr>
           <w:ilvl w:val="0"/>
-          <w:numId w:val="7"/>
+          <w:numId w:val="5"/>
         </w:numPr>
         <w:bidi/>
-        <w:spacing w:after="0" w:before="0" w:line="360"/>
-        <w:jc w:val="both"/>
-      </w:pPr>
-      <w:r>
-        <w:rPr>
-          <w:rFonts w:ascii="David" w:cs="David" w:eastAsia="David" w:hAnsi="David"/>
-          <w:b w:val="false"/>
-          <w:bCs w:val="false"/>
-          <w:i w:val="false"/>
-          <w:iCs w:val="false"/>
-          <w:sz w:val="24"/>
-          <w:szCs w:val="24"/>
-          <w:rtl/>
-        </w:rPr>
-        <w:t xml:space="preserve">איזה מקום יש לדת ולאמונה באיך שאת מבינה את המצב ומתמודדת איתו?</w:t>
-      </w:r>
-    </w:p>
-    <w:p>
-      <w:pPr>
-        <w:bidi/>
-        <w:spacing w:after="0" w:before="0" w:line="360"/>
-        <w:ind w:start="1134"/>
-        <w:jc w:val="both"/>
-      </w:pPr>
-      <w:r>
-        <w:rPr>
-          <w:rFonts w:ascii="David" w:cs="David" w:eastAsia="David" w:hAnsi="David"/>
-          <w:b w:val="false"/>
-          <w:bCs w:val="false"/>
-          <w:i w:val="false"/>
-          <w:iCs w:val="false"/>
-          <w:sz w:val="24"/>
-          <w:szCs w:val="24"/>
-          <w:rtl/>
-        </w:rPr>
-        <w:t xml:space="preserve">האם את לוקחת את [שם] לאירועים משפחתיים, לחתונות, לביקורים? מה קורה שם?</w:t>
-      </w:r>
-    </w:p>
-    <w:p>
-      <w:pPr>
-        <w:pStyle w:val="Heading2"/>
-        <w:keepNext/>
-        <w:bidi/>
-        <w:spacing w:after="120" w:before="240" w:line="360"/>
-      </w:pPr>
-      <w:r>
-        <w:rPr>
-          <w:rFonts w:ascii="David" w:cs="David" w:eastAsia="David" w:hAnsi="David"/>
-          <w:b/>
-          <w:bCs/>
-          <w:sz w:val="28"/>
-          <w:szCs w:val="28"/>
-          <w:rtl/>
-        </w:rPr>
-        <w:t xml:space="preserve">5. בית הספר והשילוב</w:t>
+        <w:spacing w:line="360"/>
+        <w:jc w:val="both"/>
+      </w:pPr>
+      <w:r>
+        <w:rPr>
+          <w:rFonts w:ascii="Arial" w:cs="Arial" w:eastAsia="Arial" w:hAnsi="Arial"/>
+          <w:b w:val="false"/>
+          <w:bCs w:val="false"/>
+          <w:sz w:val="24"/>
+          <w:szCs w:val="24"/>
+          <w:rtl/>
+        </w:rPr>
+        <w:t xml:space="preserve">كيف علاقتك مع المعلمات والمساعدة والمستشارة؟ بأي لغة بيحكوا معك، وكيف بيخبروكي شو بيصير؟</w:t>
       </w:r>
     </w:p>
     <w:p>
@@ -3953,24 +4270,22 @@
         <w:pStyle w:val="ListParagraph"/>
         <w:numPr>
           <w:ilvl w:val="0"/>
-          <w:numId w:val="8"/>
+          <w:numId w:val="5"/>
         </w:numPr>
         <w:bidi/>
-        <w:spacing w:after="0" w:before="0" w:line="360"/>
-        <w:jc w:val="both"/>
-      </w:pPr>
-      <w:r>
-        <w:rPr>
-          <w:rFonts w:ascii="David" w:cs="David" w:eastAsia="David" w:hAnsi="David"/>
-          <w:b w:val="false"/>
-          <w:bCs w:val="false"/>
-          <w:i w:val="false"/>
-          <w:iCs w:val="false"/>
-          <w:sz w:val="24"/>
-          <w:szCs w:val="24"/>
-          <w:rtl/>
-        </w:rPr>
-        <w:t xml:space="preserve">איפה [שם] לומד/ת היום? ספרי לי איך הגעתם למסגרת הזאת.</w:t>
+        <w:spacing w:line="360"/>
+        <w:jc w:val="both"/>
+      </w:pPr>
+      <w:r>
+        <w:rPr>
+          <w:rFonts w:ascii="Arial" w:cs="Arial" w:eastAsia="Arial" w:hAnsi="Arial"/>
+          <w:b w:val="false"/>
+          <w:bCs w:val="false"/>
+          <w:sz w:val="24"/>
+          <w:szCs w:val="24"/>
+          <w:rtl/>
+        </w:rPr>
+        <w:t xml:space="preserve">شو ماشي منيح بالمدرسة وشو لأ؟ [الاسم] بيحس/بتحس بانتماء، وعنده/عندها أصحاب؟</w:t>
       </w:r>
     </w:p>
     <w:p>
@@ -3978,24 +4293,22 @@
         <w:pStyle w:val="ListParagraph"/>
         <w:numPr>
           <w:ilvl w:val="0"/>
-          <w:numId w:val="8"/>
+          <w:numId w:val="5"/>
         </w:numPr>
         <w:bidi/>
-        <w:spacing w:after="0" w:before="0" w:line="360"/>
-        <w:jc w:val="both"/>
-      </w:pPr>
-      <w:r>
-        <w:rPr>
-          <w:rFonts w:ascii="David" w:cs="David" w:eastAsia="David" w:hAnsi="David"/>
-          <w:b w:val="false"/>
-          <w:bCs w:val="false"/>
-          <w:i w:val="false"/>
-          <w:iCs w:val="false"/>
-          <w:sz w:val="24"/>
-          <w:szCs w:val="24"/>
-          <w:rtl/>
-        </w:rPr>
-        <w:t xml:space="preserve">מי החליט על המסגרת? האם היית בוועדה? איך הרגשת שם? האם הרגשת שמקשיבים לך?</w:t>
+        <w:spacing w:line="360"/>
+        <w:jc w:val="both"/>
+      </w:pPr>
+      <w:r>
+        <w:rPr>
+          <w:rFonts w:ascii="Arial" w:cs="Arial" w:eastAsia="Arial" w:hAnsi="Arial"/>
+          <w:b w:val="false"/>
+          <w:bCs w:val="false"/>
+          <w:sz w:val="24"/>
+          <w:szCs w:val="24"/>
+          <w:rtl/>
+        </w:rPr>
+        <w:t xml:space="preserve">كيف بيشارك/بتشارك [الاسم] بحياة المجتمع: لعب مع أولاد الجيران، المسجد، مناسبات عائلية؟ في أماكن مش مرغوب/ة فيها؟</w:t>
       </w:r>
     </w:p>
     <w:p>
@@ -4003,24 +4316,22 @@
         <w:pStyle w:val="ListParagraph"/>
         <w:numPr>
           <w:ilvl w:val="0"/>
-          <w:numId w:val="8"/>
+          <w:numId w:val="5"/>
         </w:numPr>
         <w:bidi/>
-        <w:spacing w:after="0" w:before="0" w:line="360"/>
-        <w:jc w:val="both"/>
-      </w:pPr>
-      <w:r>
-        <w:rPr>
-          <w:rFonts w:ascii="David" w:cs="David" w:eastAsia="David" w:hAnsi="David"/>
-          <w:b w:val="false"/>
-          <w:bCs w:val="false"/>
-          <w:i w:val="false"/>
-          <w:iCs w:val="false"/>
-          <w:sz w:val="24"/>
-          <w:szCs w:val="24"/>
-          <w:rtl/>
-        </w:rPr>
-        <w:t xml:space="preserve">האם הציעו לך אפשרויות אחרות? האם ידעת שיש לך זכות לבחור?</w:t>
+        <w:spacing w:line="360"/>
+        <w:jc w:val="both"/>
+      </w:pPr>
+      <w:r>
+        <w:rPr>
+          <w:rFonts w:ascii="Arial" w:cs="Arial" w:eastAsia="Arial" w:hAnsi="Arial"/>
+          <w:b w:val="false"/>
+          <w:bCs w:val="false"/>
+          <w:sz w:val="24"/>
+          <w:szCs w:val="24"/>
+          <w:rtl/>
+        </w:rPr>
+        <w:t xml:space="preserve">لمين بتلجئي لما يصعب عليكي، ومع أي خدمات إنتي على تواصل؟ شو ناقص، وشو كان ممكن يساعد؟</w:t>
       </w:r>
     </w:p>
     <w:p>
@@ -4028,24 +4339,22 @@
         <w:pStyle w:val="ListParagraph"/>
         <w:numPr>
           <w:ilvl w:val="0"/>
-          <w:numId w:val="8"/>
+          <w:numId w:val="5"/>
         </w:numPr>
         <w:bidi/>
-        <w:spacing w:after="0" w:before="0" w:line="360"/>
-        <w:jc w:val="both"/>
-      </w:pPr>
-      <w:r>
-        <w:rPr>
-          <w:rFonts w:ascii="David" w:cs="David" w:eastAsia="David" w:hAnsi="David"/>
-          <w:b w:val="false"/>
-          <w:bCs w:val="false"/>
-          <w:i w:val="false"/>
-          <w:iCs w:val="false"/>
-          <w:sz w:val="24"/>
-          <w:szCs w:val="24"/>
-          <w:rtl/>
-        </w:rPr>
-        <w:t xml:space="preserve">כשאומרים "שילוב", מה זה אומר בשבילך? מה היית רוצה שיהיה בשביל [שם]?</w:t>
+        <w:spacing w:line="360"/>
+        <w:jc w:val="both"/>
+      </w:pPr>
+      <w:r>
+        <w:rPr>
+          <w:rFonts w:ascii="Arial" w:cs="Arial" w:eastAsia="Arial" w:hAnsi="Arial"/>
+          <w:b w:val="false"/>
+          <w:bCs w:val="false"/>
+          <w:sz w:val="24"/>
+          <w:szCs w:val="24"/>
+          <w:rtl/>
+        </w:rPr>
+        <w:t xml:space="preserve">شو بتتمني لـ[الاسم] بعد خمس سنين، وشو بتقولي لأم شابة لسا اكتشفت إنه ابنها عنده إعاقة؟</w:t>
       </w:r>
     </w:p>
     <w:p>
@@ -4053,1751 +4362,22 @@
         <w:pStyle w:val="ListParagraph"/>
         <w:numPr>
           <w:ilvl w:val="0"/>
-          <w:numId w:val="8"/>
+          <w:numId w:val="5"/>
         </w:numPr>
         <w:bidi/>
-        <w:spacing w:after="0" w:before="0" w:line="360"/>
-        <w:jc w:val="both"/>
-      </w:pPr>
-      <w:r>
-        <w:rPr>
-          <w:rFonts w:ascii="David" w:cs="David" w:eastAsia="David" w:hAnsi="David"/>
-          <w:b w:val="false"/>
-          <w:bCs w:val="false"/>
-          <w:i w:val="false"/>
-          <w:iCs w:val="false"/>
-          <w:sz w:val="24"/>
-          <w:szCs w:val="24"/>
-          <w:rtl/>
-        </w:rPr>
-        <w:t xml:space="preserve">איך הקשר שלך עם המורות, עם הסייעת, עם היועצת? באיזו שפה מדברים איתך? איך מעדכנים אותך?</w:t>
-      </w:r>
-    </w:p>
-    <w:p>
-      <w:pPr>
-        <w:pStyle w:val="ListParagraph"/>
-        <w:numPr>
-          <w:ilvl w:val="0"/>
-          <w:numId w:val="8"/>
-        </w:numPr>
-        <w:bidi/>
-        <w:spacing w:after="0" w:before="0" w:line="360"/>
-        <w:jc w:val="both"/>
-      </w:pPr>
-      <w:r>
-        <w:rPr>
-          <w:rFonts w:ascii="David" w:cs="David" w:eastAsia="David" w:hAnsi="David"/>
-          <w:b w:val="false"/>
-          <w:bCs w:val="false"/>
-          <w:i w:val="false"/>
-          <w:iCs w:val="false"/>
-          <w:sz w:val="24"/>
-          <w:szCs w:val="24"/>
-          <w:rtl/>
-        </w:rPr>
-        <w:t xml:space="preserve">מה עובד טוב בבית הספר? מה לא עובד?</w:t>
-      </w:r>
-    </w:p>
-    <w:p>
-      <w:pPr>
-        <w:pStyle w:val="ListParagraph"/>
-        <w:numPr>
-          <w:ilvl w:val="0"/>
-          <w:numId w:val="8"/>
-        </w:numPr>
-        <w:bidi/>
-        <w:spacing w:after="0" w:before="0" w:line="360"/>
-        <w:jc w:val="both"/>
-      </w:pPr>
-      <w:r>
-        <w:rPr>
-          <w:rFonts w:ascii="David" w:cs="David" w:eastAsia="David" w:hAnsi="David"/>
-          <w:b w:val="false"/>
-          <w:bCs w:val="false"/>
-          <w:i w:val="false"/>
-          <w:iCs w:val="false"/>
-          <w:sz w:val="24"/>
-          <w:szCs w:val="24"/>
-          <w:rtl/>
-        </w:rPr>
-        <w:t xml:space="preserve">האם [שם] מרגיש/ה שייך/ת? יש לו/לה חברים? איך הילדים האחרים מתייחסים?</w:t>
-      </w:r>
-    </w:p>
-    <w:p>
-      <w:pPr>
-        <w:pStyle w:val="ListParagraph"/>
-        <w:numPr>
-          <w:ilvl w:val="0"/>
-          <w:numId w:val="8"/>
-        </w:numPr>
-        <w:bidi/>
-        <w:spacing w:after="0" w:before="0" w:line="360"/>
-        <w:jc w:val="both"/>
-      </w:pPr>
-      <w:r>
-        <w:rPr>
-          <w:rFonts w:ascii="David" w:cs="David" w:eastAsia="David" w:hAnsi="David"/>
-          <w:b w:val="false"/>
-          <w:bCs w:val="false"/>
-          <w:i w:val="false"/>
-          <w:iCs w:val="false"/>
-          <w:sz w:val="24"/>
-          <w:szCs w:val="24"/>
-          <w:rtl/>
-        </w:rPr>
-        <w:t xml:space="preserve">איך מגיעים לבית הספר? האם המרחק או ההסעה משפיעים על הבחירה או על הקשר עם הצוות?</w:t>
-      </w:r>
-    </w:p>
-    <w:p>
-      <w:pPr>
-        <w:bidi/>
-        <w:spacing w:after="0" w:before="0" w:line="360"/>
-        <w:ind w:start="1134"/>
-        <w:jc w:val="both"/>
-      </w:pPr>
-      <w:r>
-        <w:rPr>
-          <w:rFonts w:ascii="David" w:cs="David" w:eastAsia="David" w:hAnsi="David"/>
-          <w:b w:val="false"/>
-          <w:bCs w:val="false"/>
-          <w:i w:val="false"/>
-          <w:iCs w:val="false"/>
-          <w:sz w:val="24"/>
-          <w:szCs w:val="24"/>
-          <w:rtl/>
-        </w:rPr>
-        <w:t xml:space="preserve">תני לי דוגמה לפעם שהרגשת שהצוות באמת שותף איתך. ודוגמה לפעם שהרגשת לבד מולם.</w:t>
-      </w:r>
-    </w:p>
-    <w:p>
-      <w:pPr>
-        <w:pStyle w:val="Heading2"/>
-        <w:keepNext/>
-        <w:bidi/>
-        <w:spacing w:after="120" w:before="240" w:line="360"/>
-      </w:pPr>
-      <w:r>
-        <w:rPr>
-          <w:rFonts w:ascii="David" w:cs="David" w:eastAsia="David" w:hAnsi="David"/>
-          <w:b/>
-          <w:bCs/>
-          <w:sz w:val="28"/>
-          <w:szCs w:val="28"/>
-          <w:rtl/>
-        </w:rPr>
-        <w:t xml:space="preserve">6. הקהילה</w:t>
-      </w:r>
-    </w:p>
-    <w:p>
-      <w:pPr>
-        <w:pStyle w:val="ListParagraph"/>
-        <w:numPr>
-          <w:ilvl w:val="0"/>
-          <w:numId w:val="9"/>
-        </w:numPr>
-        <w:bidi/>
-        <w:spacing w:after="0" w:before="0" w:line="360"/>
-        <w:jc w:val="both"/>
-      </w:pPr>
-      <w:r>
-        <w:rPr>
-          <w:rFonts w:ascii="David" w:cs="David" w:eastAsia="David" w:hAnsi="David"/>
-          <w:b w:val="false"/>
-          <w:bCs w:val="false"/>
-          <w:i w:val="false"/>
-          <w:iCs w:val="false"/>
-          <w:sz w:val="24"/>
-          <w:szCs w:val="24"/>
-          <w:rtl/>
-        </w:rPr>
-        <w:t xml:space="preserve">איך [שם] משתתף/ת בחיי הקהילה: משחק עם ילדי השכנים, מסגד, חוגים, אירועים?</w:t>
-      </w:r>
-    </w:p>
-    <w:p>
-      <w:pPr>
-        <w:pStyle w:val="ListParagraph"/>
-        <w:numPr>
-          <w:ilvl w:val="0"/>
-          <w:numId w:val="9"/>
-        </w:numPr>
-        <w:bidi/>
-        <w:spacing w:after="0" w:before="0" w:line="360"/>
-        <w:jc w:val="both"/>
-      </w:pPr>
-      <w:r>
-        <w:rPr>
-          <w:rFonts w:ascii="David" w:cs="David" w:eastAsia="David" w:hAnsi="David"/>
-          <w:b w:val="false"/>
-          <w:bCs w:val="false"/>
-          <w:i w:val="false"/>
-          <w:iCs w:val="false"/>
-          <w:sz w:val="24"/>
-          <w:szCs w:val="24"/>
-          <w:rtl/>
-        </w:rPr>
-        <w:t xml:space="preserve">האם יש מקומות בקהילה שאת מרגישה שהוא/היא לא רצוי/ה בהם?</w:t>
-      </w:r>
-    </w:p>
-    <w:p>
-      <w:pPr>
-        <w:pStyle w:val="ListParagraph"/>
-        <w:numPr>
-          <w:ilvl w:val="0"/>
-          <w:numId w:val="9"/>
-        </w:numPr>
-        <w:bidi/>
-        <w:spacing w:after="0" w:before="0" w:line="360"/>
-        <w:jc w:val="both"/>
-      </w:pPr>
-      <w:r>
-        <w:rPr>
-          <w:rFonts w:ascii="David" w:cs="David" w:eastAsia="David" w:hAnsi="David"/>
-          <w:b w:val="false"/>
-          <w:bCs w:val="false"/>
-          <w:i w:val="false"/>
-          <w:iCs w:val="false"/>
-          <w:sz w:val="24"/>
-          <w:szCs w:val="24"/>
-          <w:rtl/>
-        </w:rPr>
-        <w:t xml:space="preserve">מה היית רוצה שישתנה ביישוב שלך בשביל ילדים כמו [שם]?</w:t>
-      </w:r>
-    </w:p>
-    <w:p>
-      <w:pPr>
-        <w:pStyle w:val="Heading2"/>
-        <w:keepNext/>
-        <w:bidi/>
-        <w:spacing w:after="120" w:before="240" w:line="360"/>
-      </w:pPr>
-      <w:r>
-        <w:rPr>
-          <w:rFonts w:ascii="David" w:cs="David" w:eastAsia="David" w:hAnsi="David"/>
-          <w:b/>
-          <w:bCs/>
-          <w:sz w:val="28"/>
-          <w:szCs w:val="28"/>
-          <w:rtl/>
-        </w:rPr>
-        <w:t xml:space="preserve">7. משאבים ותמיכה</w:t>
-      </w:r>
-    </w:p>
-    <w:p>
-      <w:pPr>
-        <w:pStyle w:val="ListParagraph"/>
-        <w:numPr>
-          <w:ilvl w:val="0"/>
-          <w:numId w:val="10"/>
-        </w:numPr>
-        <w:bidi/>
-        <w:spacing w:after="0" w:before="0" w:line="360"/>
-        <w:jc w:val="both"/>
-      </w:pPr>
-      <w:r>
-        <w:rPr>
-          <w:rFonts w:ascii="David" w:cs="David" w:eastAsia="David" w:hAnsi="David"/>
-          <w:b w:val="false"/>
-          <w:bCs w:val="false"/>
-          <w:i w:val="false"/>
-          <w:iCs w:val="false"/>
-          <w:sz w:val="24"/>
-          <w:szCs w:val="24"/>
-          <w:rtl/>
-        </w:rPr>
-        <w:t xml:space="preserve">למי את פונה כשקשה לך? מי באמת עוזר?</w:t>
-      </w:r>
-    </w:p>
-    <w:p>
-      <w:pPr>
-        <w:pStyle w:val="ListParagraph"/>
-        <w:numPr>
-          <w:ilvl w:val="0"/>
-          <w:numId w:val="10"/>
-        </w:numPr>
-        <w:bidi/>
-        <w:spacing w:after="0" w:before="0" w:line="360"/>
-        <w:jc w:val="both"/>
-      </w:pPr>
-      <w:r>
-        <w:rPr>
-          <w:rFonts w:ascii="David" w:cs="David" w:eastAsia="David" w:hAnsi="David"/>
-          <w:b w:val="false"/>
-          <w:bCs w:val="false"/>
-          <w:i w:val="false"/>
-          <w:iCs w:val="false"/>
-          <w:sz w:val="24"/>
-          <w:szCs w:val="24"/>
-          <w:rtl/>
-        </w:rPr>
-        <w:t xml:space="preserve">עם אילו שירותים את בקשר: עובדת סוציאלית, מרכז להתפתחות הילד, ביטוח לאומי, עמותה, קבוצת אימהות? איך החוויה איתם?</w:t>
-      </w:r>
-    </w:p>
-    <w:p>
-      <w:pPr>
-        <w:pStyle w:val="ListParagraph"/>
-        <w:numPr>
-          <w:ilvl w:val="0"/>
-          <w:numId w:val="10"/>
-        </w:numPr>
-        <w:bidi/>
-        <w:spacing w:after="0" w:before="0" w:line="360"/>
-        <w:jc w:val="both"/>
-      </w:pPr>
-      <w:r>
-        <w:rPr>
-          <w:rFonts w:ascii="David" w:cs="David" w:eastAsia="David" w:hAnsi="David"/>
-          <w:b w:val="false"/>
-          <w:bCs w:val="false"/>
-          <w:i w:val="false"/>
-          <w:iCs w:val="false"/>
-          <w:sz w:val="24"/>
-          <w:szCs w:val="24"/>
-          <w:rtl/>
-        </w:rPr>
-        <w:t xml:space="preserve">מה חסר לך? מה היה יכול לעזור לך ולא קיים?</w:t>
-      </w:r>
-    </w:p>
-    <w:p>
-      <w:pPr>
-        <w:pStyle w:val="ListParagraph"/>
-        <w:numPr>
-          <w:ilvl w:val="0"/>
-          <w:numId w:val="10"/>
-        </w:numPr>
-        <w:bidi/>
-        <w:spacing w:after="0" w:before="0" w:line="360"/>
-        <w:jc w:val="both"/>
-      </w:pPr>
-      <w:r>
-        <w:rPr>
-          <w:rFonts w:ascii="David" w:cs="David" w:eastAsia="David" w:hAnsi="David"/>
-          <w:b w:val="false"/>
-          <w:bCs w:val="false"/>
-          <w:i w:val="false"/>
-          <w:iCs w:val="false"/>
-          <w:sz w:val="24"/>
-          <w:szCs w:val="24"/>
-          <w:rtl/>
-        </w:rPr>
-        <w:t xml:space="preserve">האם הכרת אימהות אחרות במצב דומה? האם זה עזר?</w:t>
-      </w:r>
-    </w:p>
-    <w:p>
-      <w:pPr>
-        <w:pStyle w:val="Heading2"/>
-        <w:keepNext/>
-        <w:bidi/>
-        <w:spacing w:after="120" w:before="240" w:line="360"/>
-      </w:pPr>
-      <w:r>
-        <w:rPr>
-          <w:rFonts w:ascii="David" w:cs="David" w:eastAsia="David" w:hAnsi="David"/>
-          <w:b/>
-          <w:bCs/>
-          <w:sz w:val="28"/>
-          <w:szCs w:val="28"/>
-          <w:rtl/>
-        </w:rPr>
-        <w:t xml:space="preserve">8. מבט לעתיד</w:t>
-      </w:r>
-    </w:p>
-    <w:p>
-      <w:pPr>
-        <w:pStyle w:val="ListParagraph"/>
-        <w:numPr>
-          <w:ilvl w:val="0"/>
-          <w:numId w:val="11"/>
-        </w:numPr>
-        <w:bidi/>
-        <w:spacing w:after="0" w:before="0" w:line="360"/>
-        <w:jc w:val="both"/>
-      </w:pPr>
-      <w:r>
-        <w:rPr>
-          <w:rFonts w:ascii="David" w:cs="David" w:eastAsia="David" w:hAnsi="David"/>
-          <w:b w:val="false"/>
-          <w:bCs w:val="false"/>
-          <w:i w:val="false"/>
-          <w:iCs w:val="false"/>
-          <w:sz w:val="24"/>
-          <w:szCs w:val="24"/>
-          <w:rtl/>
-        </w:rPr>
-        <w:t xml:space="preserve">מה את מאחלת ל[שם] בעוד חמש שנים?</w:t>
-      </w:r>
-    </w:p>
-    <w:p>
-      <w:pPr>
-        <w:pStyle w:val="ListParagraph"/>
-        <w:numPr>
-          <w:ilvl w:val="0"/>
-          <w:numId w:val="11"/>
-        </w:numPr>
-        <w:bidi/>
-        <w:spacing w:after="0" w:before="0" w:line="360"/>
-        <w:jc w:val="both"/>
-      </w:pPr>
-      <w:r>
-        <w:rPr>
-          <w:rFonts w:ascii="David" w:cs="David" w:eastAsia="David" w:hAnsi="David"/>
-          <w:b w:val="false"/>
-          <w:bCs w:val="false"/>
-          <w:i w:val="false"/>
-          <w:iCs w:val="false"/>
-          <w:sz w:val="24"/>
-          <w:szCs w:val="24"/>
-          <w:rtl/>
-        </w:rPr>
-        <w:t xml:space="preserve">אם אם צעירה מהיישוב שלך הייתה מגלה עכשיו שלילד שלה יש מוגבלות, מה היית אומרת לה?</w:t>
-      </w:r>
-    </w:p>
-    <w:p>
-      <w:pPr>
-        <w:pStyle w:val="ListParagraph"/>
-        <w:numPr>
-          <w:ilvl w:val="0"/>
-          <w:numId w:val="11"/>
-        </w:numPr>
-        <w:bidi/>
-        <w:spacing w:after="0" w:before="0" w:line="360"/>
-        <w:jc w:val="both"/>
-      </w:pPr>
-      <w:r>
-        <w:rPr>
-          <w:rFonts w:ascii="David" w:cs="David" w:eastAsia="David" w:hAnsi="David"/>
-          <w:b w:val="false"/>
-          <w:bCs w:val="false"/>
-          <w:i w:val="false"/>
-          <w:iCs w:val="false"/>
-          <w:sz w:val="24"/>
-          <w:szCs w:val="24"/>
-          <w:rtl/>
-        </w:rPr>
-        <w:t xml:space="preserve">אם היית יכולה להגיד משפט אחד למנהל בית הספר, ומשפט אחד למשרד החינוך, מה היית אומרת?</w:t>
-      </w:r>
-    </w:p>
-    <w:p>
-      <w:pPr>
-        <w:pStyle w:val="Heading2"/>
-        <w:keepNext/>
-        <w:bidi/>
-        <w:spacing w:after="120" w:before="240" w:line="360"/>
-      </w:pPr>
-      <w:r>
-        <w:rPr>
-          <w:rFonts w:ascii="David" w:cs="David" w:eastAsia="David" w:hAnsi="David"/>
-          <w:b/>
-          <w:bCs/>
-          <w:sz w:val="28"/>
-          <w:szCs w:val="28"/>
-          <w:rtl/>
-        </w:rPr>
-        <w:t xml:space="preserve">9. סיום</w:t>
-      </w:r>
-    </w:p>
-    <w:p>
-      <w:pPr>
-        <w:pStyle w:val="ListParagraph"/>
-        <w:numPr>
-          <w:ilvl w:val="0"/>
-          <w:numId w:val="12"/>
-        </w:numPr>
-        <w:bidi/>
-        <w:spacing w:after="0" w:before="0" w:line="360"/>
-        <w:jc w:val="both"/>
-      </w:pPr>
-      <w:r>
-        <w:rPr>
-          <w:rFonts w:ascii="David" w:cs="David" w:eastAsia="David" w:hAnsi="David"/>
-          <w:b w:val="false"/>
-          <w:bCs w:val="false"/>
-          <w:i w:val="false"/>
-          <w:iCs w:val="false"/>
-          <w:sz w:val="24"/>
-          <w:szCs w:val="24"/>
-          <w:rtl/>
-        </w:rPr>
-        <w:t xml:space="preserve">יש משהו שלא שאלתי ואת רוצה להוסיף?</w:t>
-      </w:r>
-    </w:p>
-    <w:p>
-      <w:pPr>
-        <w:pStyle w:val="ListParagraph"/>
-        <w:numPr>
-          <w:ilvl w:val="0"/>
-          <w:numId w:val="12"/>
-        </w:numPr>
-        <w:bidi/>
-        <w:spacing w:after="0" w:before="0" w:line="360"/>
-        <w:jc w:val="both"/>
-      </w:pPr>
-      <w:r>
-        <w:rPr>
-          <w:rFonts w:ascii="David" w:cs="David" w:eastAsia="David" w:hAnsi="David"/>
-          <w:b w:val="false"/>
-          <w:bCs w:val="false"/>
-          <w:i w:val="false"/>
-          <w:iCs w:val="false"/>
-          <w:sz w:val="24"/>
-          <w:szCs w:val="24"/>
-          <w:rtl/>
-        </w:rPr>
-        <w:t xml:space="preserve">איך הרגשת בשיחה הזאת?</w:t>
-      </w:r>
-    </w:p>
-    <w:p>
-      <w:pPr>
-        <w:bidi/>
-        <w:spacing w:after="0" w:before="0" w:line="360"/>
-        <w:jc w:val="both"/>
-      </w:pPr>
-      <w:r>
-        <w:rPr>
-          <w:rFonts w:ascii="David" w:cs="David" w:eastAsia="David" w:hAnsi="David"/>
-          <w:b w:val="false"/>
-          <w:bCs w:val="false"/>
-          <w:i w:val="false"/>
-          <w:iCs w:val="false"/>
-          <w:sz w:val="24"/>
-          <w:szCs w:val="24"/>
-          <w:rtl/>
-        </w:rPr>
-        <w:t xml:space="preserve">תודה, תזכורת על סודיות, הסבר על השלבים הבאים ועל האפשרות לקבל סיכום של הממצאים, מסירת פרטי קשר של החוקרים ושל שירותי תמיכה בערבית.</w:t>
-      </w:r>
-    </w:p>
-    <w:p>
-      <w:pPr>
-        <w:pStyle w:val="Heading2"/>
-        <w:keepNext/>
-        <w:bidi/>
-        <w:spacing w:after="120" w:before="240" w:line="360"/>
-      </w:pPr>
-      <w:r>
-        <w:rPr>
-          <w:rFonts w:ascii="David" w:cs="David" w:eastAsia="David" w:hAnsi="David"/>
-          <w:b/>
-          <w:bCs/>
-          <w:sz w:val="28"/>
-          <w:szCs w:val="28"/>
-          <w:rtl/>
-        </w:rPr>
-        <w:t xml:space="preserve">שאלות המשך כלליות (לשימוש בכל תחום)</w:t>
-      </w:r>
-    </w:p>
-    <w:p>
-      <w:pPr>
-        <w:pStyle w:val="ListParagraph"/>
-        <w:numPr>
-          <w:ilvl w:val="0"/>
-          <w:numId w:val="3"/>
-        </w:numPr>
-        <w:bidi/>
-        <w:spacing w:after="0" w:before="0" w:line="360"/>
-        <w:jc w:val="both"/>
-      </w:pPr>
-      <w:r>
-        <w:rPr>
-          <w:rFonts w:ascii="David" w:cs="David" w:eastAsia="David" w:hAnsi="David"/>
-          <w:b w:val="false"/>
-          <w:bCs w:val="false"/>
-          <w:i w:val="false"/>
-          <w:iCs w:val="false"/>
-          <w:sz w:val="24"/>
-          <w:szCs w:val="24"/>
-          <w:rtl/>
-        </w:rPr>
-        <w:t xml:space="preserve">תוכלי לתת לי דוגמה?</w:t>
-      </w:r>
-    </w:p>
-    <w:p>
-      <w:pPr>
-        <w:pStyle w:val="ListParagraph"/>
-        <w:numPr>
-          <w:ilvl w:val="0"/>
-          <w:numId w:val="3"/>
-        </w:numPr>
-        <w:bidi/>
-        <w:spacing w:after="0" w:before="0" w:line="360"/>
-        <w:jc w:val="both"/>
-      </w:pPr>
-      <w:r>
-        <w:rPr>
-          <w:rFonts w:ascii="David" w:cs="David" w:eastAsia="David" w:hAnsi="David"/>
-          <w:b w:val="false"/>
-          <w:bCs w:val="false"/>
-          <w:i w:val="false"/>
-          <w:iCs w:val="false"/>
-          <w:sz w:val="24"/>
-          <w:szCs w:val="24"/>
-          <w:rtl/>
-        </w:rPr>
-        <w:t xml:space="preserve">מה הרגשת באותו רגע?</w:t>
-      </w:r>
-    </w:p>
-    <w:p>
-      <w:pPr>
-        <w:pStyle w:val="ListParagraph"/>
-        <w:numPr>
-          <w:ilvl w:val="0"/>
-          <w:numId w:val="3"/>
-        </w:numPr>
-        <w:bidi/>
-        <w:spacing w:after="0" w:before="0" w:line="360"/>
-        <w:jc w:val="both"/>
-      </w:pPr>
-      <w:r>
-        <w:rPr>
-          <w:rFonts w:ascii="David" w:cs="David" w:eastAsia="David" w:hAnsi="David"/>
-          <w:b w:val="false"/>
-          <w:bCs w:val="false"/>
-          <w:i w:val="false"/>
-          <w:iCs w:val="false"/>
-          <w:sz w:val="24"/>
-          <w:szCs w:val="24"/>
-          <w:rtl/>
-        </w:rPr>
-        <w:t xml:space="preserve">מה עשית אז?</w:t>
-      </w:r>
-    </w:p>
-    <w:p>
-      <w:pPr>
-        <w:pStyle w:val="ListParagraph"/>
-        <w:numPr>
-          <w:ilvl w:val="0"/>
-          <w:numId w:val="3"/>
-        </w:numPr>
-        <w:bidi/>
-        <w:spacing w:after="0" w:before="0" w:line="360"/>
-        <w:jc w:val="both"/>
-      </w:pPr>
-      <w:r>
-        <w:rPr>
-          <w:rFonts w:ascii="David" w:cs="David" w:eastAsia="David" w:hAnsi="David"/>
-          <w:b w:val="false"/>
-          <w:bCs w:val="false"/>
-          <w:i w:val="false"/>
-          <w:iCs w:val="false"/>
-          <w:sz w:val="24"/>
-          <w:szCs w:val="24"/>
-          <w:rtl/>
-        </w:rPr>
-        <w:t xml:space="preserve">איך זה נראה היום, בהשוואה לאז?</w:t>
-      </w:r>
-    </w:p>
-    <w:p>
-      <w:pPr>
-        <w:pStyle w:val="ListParagraph"/>
-        <w:numPr>
-          <w:ilvl w:val="0"/>
-          <w:numId w:val="3"/>
-        </w:numPr>
-        <w:bidi/>
-        <w:spacing w:after="0" w:before="0" w:line="360"/>
-        <w:jc w:val="both"/>
-      </w:pPr>
-      <w:r>
-        <w:rPr>
-          <w:rFonts w:ascii="David" w:cs="David" w:eastAsia="David" w:hAnsi="David"/>
-          <w:b w:val="false"/>
-          <w:bCs w:val="false"/>
-          <w:i w:val="false"/>
-          <w:iCs w:val="false"/>
-          <w:sz w:val="24"/>
-          <w:szCs w:val="24"/>
-          <w:rtl/>
-        </w:rPr>
-        <w:t xml:space="preserve">מה היית רוצה שיקרה אחרת?</w:t>
-      </w:r>
-    </w:p>
-    <w:p>
-      <w:pPr>
-        <w:pStyle w:val="Heading1"/>
-        <w:pageBreakBefore/>
-        <w:bidi/>
-        <w:spacing w:after="240" w:before="0" w:line="360"/>
-      </w:pPr>
-      <w:r>
-        <w:rPr>
-          <w:rFonts w:ascii="David" w:cs="David" w:eastAsia="David" w:hAnsi="David"/>
-          <w:b/>
-          <w:bCs/>
-          <w:sz w:val="32"/>
-          <w:szCs w:val="32"/>
-          <w:rtl/>
-        </w:rPr>
-        <w:t xml:space="preserve">נספח ב': מדריך הריאיון בערבית (دليل المقابلة)</w:t>
-      </w:r>
-    </w:p>
-    <w:p>
-      <w:pPr>
-        <w:bidi/>
         <w:spacing w:line="360"/>
         <w:jc w:val="both"/>
       </w:pPr>
       <w:r>
         <w:rPr>
           <w:rFonts w:ascii="Arial" w:cs="Arial" w:eastAsia="Arial" w:hAnsi="Arial"/>
-          <w:b/>
-          <w:bCs/>
-          <w:sz w:val="24"/>
-          <w:szCs w:val="24"/>
-          <w:rtl/>
-        </w:rPr>
-        <w:t xml:space="preserve">الافتتاحية: </w:t>
-      </w:r>
-      <w:r>
-        <w:rPr>
-          <w:rFonts w:ascii="Arial" w:cs="Arial" w:eastAsia="Arial" w:hAnsi="Arial"/>
-          <w:b w:val="false"/>
-          <w:bCs w:val="false"/>
-          <w:sz w:val="24"/>
-          <w:szCs w:val="24"/>
-          <w:rtl/>
-        </w:rPr>
-        <w:t xml:space="preserve">تعريف بالباحث/ة، شرح قصير عن هدف البحث ("بدّي أفهم كيف أمهات مثلك بيعيشوا طريق الولد بالمدرسة وبالمجتمع")، توضيح إنه ما في إجابات صح أو غلط، السرية، التسجيل، حق التوقف بأي لحظة، توقيع نموذج الموافقة.</w:t>
-      </w:r>
-    </w:p>
-    <w:p>
-      <w:pPr>
-        <w:pStyle w:val="Heading2"/>
-        <w:keepNext/>
-        <w:bidi/>
-        <w:spacing w:after="120" w:before="240" w:line="360"/>
-      </w:pPr>
-      <w:r>
-        <w:rPr>
-          <w:rFonts w:ascii="David" w:cs="David" w:eastAsia="David" w:hAnsi="David"/>
-          <w:b/>
-          <w:bCs/>
-          <w:sz w:val="28"/>
-          <w:szCs w:val="28"/>
-          <w:rtl/>
-        </w:rPr>
-        <w:t xml:space="preserve">1. سؤال افتتاحي</w:t>
-      </w:r>
-    </w:p>
-    <w:p>
-      <w:pPr>
-        <w:pStyle w:val="ListParagraph"/>
-        <w:numPr>
-          <w:ilvl w:val="0"/>
-          <w:numId w:val="13"/>
-        </w:numPr>
-        <w:bidi/>
-        <w:spacing w:line="360"/>
-        <w:jc w:val="both"/>
-      </w:pPr>
-      <w:r>
-        <w:rPr>
-          <w:rFonts w:ascii="Arial" w:cs="Arial" w:eastAsia="Arial" w:hAnsi="Arial"/>
-          <w:b w:val="false"/>
-          <w:bCs w:val="false"/>
-          <w:sz w:val="24"/>
-          <w:szCs w:val="24"/>
-          <w:rtl/>
-        </w:rPr>
-        <w:t xml:space="preserve">احكيلي عن حالك.</w:t>
-      </w:r>
-    </w:p>
-    <w:p>
-      <w:pPr>
-        <w:bidi/>
-        <w:spacing w:line="360"/>
-        <w:ind w:start="1134"/>
-        <w:jc w:val="both"/>
-      </w:pPr>
-      <w:r>
-        <w:rPr>
-          <w:rFonts w:ascii="Arial" w:cs="Arial" w:eastAsia="Arial" w:hAnsi="Arial"/>
-          <w:b w:val="false"/>
-          <w:bCs w:val="false"/>
-          <w:sz w:val="24"/>
-          <w:szCs w:val="24"/>
-          <w:rtl/>
-        </w:rPr>
-        <w:t xml:space="preserve">(العمر، التعليم، الشغل، وين كبرتي ووين ساكنة اليوم، تركيبة العائلة، كم ولد عندك وبأي أعمار)</w:t>
-      </w:r>
-    </w:p>
-    <w:p>
-      <w:pPr>
-        <w:pStyle w:val="Heading2"/>
-        <w:keepNext/>
-        <w:bidi/>
-        <w:spacing w:after="120" w:before="240" w:line="360"/>
-      </w:pPr>
-      <w:r>
-        <w:rPr>
-          <w:rFonts w:ascii="David" w:cs="David" w:eastAsia="David" w:hAnsi="David"/>
-          <w:b/>
-          <w:bCs/>
-          <w:sz w:val="28"/>
-          <w:szCs w:val="28"/>
-          <w:rtl/>
-        </w:rPr>
-        <w:t xml:space="preserve">2. الطفل/ة والتشخيص</w:t>
-      </w:r>
-    </w:p>
-    <w:p>
-      <w:pPr>
-        <w:pStyle w:val="ListParagraph"/>
-        <w:numPr>
-          <w:ilvl w:val="0"/>
-          <w:numId w:val="14"/>
-        </w:numPr>
-        <w:bidi/>
-        <w:spacing w:line="360"/>
-        <w:jc w:val="both"/>
-      </w:pPr>
-      <w:r>
-        <w:rPr>
-          <w:rFonts w:ascii="Arial" w:cs="Arial" w:eastAsia="Arial" w:hAnsi="Arial"/>
-          <w:b w:val="false"/>
-          <w:bCs w:val="false"/>
-          <w:sz w:val="24"/>
-          <w:szCs w:val="24"/>
-          <w:rtl/>
-        </w:rPr>
-        <w:t xml:space="preserve">احكيلي عن [اسم الطفل/ة].</w:t>
-      </w:r>
-    </w:p>
-    <w:p>
-      <w:pPr>
-        <w:pStyle w:val="ListParagraph"/>
-        <w:numPr>
-          <w:ilvl w:val="0"/>
-          <w:numId w:val="14"/>
-        </w:numPr>
-        <w:bidi/>
-        <w:spacing w:line="360"/>
-        <w:jc w:val="both"/>
-      </w:pPr>
-      <w:r>
-        <w:rPr>
-          <w:rFonts w:ascii="Arial" w:cs="Arial" w:eastAsia="Arial" w:hAnsi="Arial"/>
-          <w:b w:val="false"/>
-          <w:bCs w:val="false"/>
-          <w:sz w:val="24"/>
-          <w:szCs w:val="24"/>
-          <w:rtl/>
-        </w:rPr>
-        <w:t xml:space="preserve">كيف اكتشفتوا إنه عنده/عندها إعاقة؟ مين رافقكم بهاي الفترة؟</w:t>
-      </w:r>
-    </w:p>
-    <w:p>
-      <w:pPr>
-        <w:pStyle w:val="ListParagraph"/>
-        <w:numPr>
-          <w:ilvl w:val="0"/>
-          <w:numId w:val="14"/>
-        </w:numPr>
-        <w:bidi/>
-        <w:spacing w:line="360"/>
-        <w:jc w:val="both"/>
-      </w:pPr>
-      <w:r>
-        <w:rPr>
-          <w:rFonts w:ascii="Arial" w:cs="Arial" w:eastAsia="Arial" w:hAnsi="Arial"/>
-          <w:b w:val="false"/>
-          <w:bCs w:val="false"/>
-          <w:sz w:val="24"/>
-          <w:szCs w:val="24"/>
-          <w:rtl/>
-        </w:rPr>
-        <w:t xml:space="preserve">شو حسّيتي وقتها؟ وشو بتحسي اليوم لما تتذكري؟</w:t>
-      </w:r>
-    </w:p>
-    <w:p>
-      <w:pPr>
-        <w:bidi/>
-        <w:spacing w:line="360"/>
-        <w:ind w:start="1134"/>
-        <w:jc w:val="both"/>
-      </w:pPr>
-      <w:r>
-        <w:rPr>
-          <w:rFonts w:ascii="Arial" w:cs="Arial" w:eastAsia="Arial" w:hAnsi="Arial"/>
-          <w:b w:val="false"/>
-          <w:bCs w:val="false"/>
-          <w:sz w:val="24"/>
-          <w:szCs w:val="24"/>
-          <w:rtl/>
-        </w:rPr>
-        <w:t xml:space="preserve">(مين شرح لك شو معنى التشخيص؟ بأي لغة؟ حسّيتي إنك فهمتي؟)</w:t>
-      </w:r>
-    </w:p>
-    <w:p>
-      <w:pPr>
-        <w:pStyle w:val="Heading2"/>
-        <w:keepNext/>
-        <w:bidi/>
-        <w:spacing w:after="120" w:before="240" w:line="360"/>
-      </w:pPr>
-      <w:r>
-        <w:rPr>
-          <w:rFonts w:ascii="David" w:cs="David" w:eastAsia="David" w:hAnsi="David"/>
-          <w:b/>
-          <w:bCs/>
-          <w:sz w:val="28"/>
-          <w:szCs w:val="28"/>
-          <w:rtl/>
-        </w:rPr>
-        <w:t xml:space="preserve">3. الحياة اليومية</w:t>
-      </w:r>
-    </w:p>
-    <w:p>
-      <w:pPr>
-        <w:pStyle w:val="ListParagraph"/>
-        <w:numPr>
-          <w:ilvl w:val="0"/>
-          <w:numId w:val="15"/>
-        </w:numPr>
-        <w:bidi/>
-        <w:spacing w:line="360"/>
-        <w:jc w:val="both"/>
-      </w:pPr>
-      <w:r>
-        <w:rPr>
-          <w:rFonts w:ascii="Arial" w:cs="Arial" w:eastAsia="Arial" w:hAnsi="Arial"/>
-          <w:b w:val="false"/>
-          <w:bCs w:val="false"/>
-          <w:sz w:val="24"/>
-          <w:szCs w:val="24"/>
-          <w:rtl/>
-        </w:rPr>
-        <w:t xml:space="preserve">صفيلي يوم عادي إلك، من الصبح للّيل.</w:t>
-      </w:r>
-    </w:p>
-    <w:p>
-      <w:pPr>
-        <w:pStyle w:val="ListParagraph"/>
-        <w:numPr>
-          <w:ilvl w:val="0"/>
-          <w:numId w:val="15"/>
-        </w:numPr>
-        <w:bidi/>
-        <w:spacing w:line="360"/>
-        <w:jc w:val="both"/>
-      </w:pPr>
-      <w:r>
-        <w:rPr>
-          <w:rFonts w:ascii="Arial" w:cs="Arial" w:eastAsia="Arial" w:hAnsi="Arial"/>
-          <w:b w:val="false"/>
-          <w:bCs w:val="false"/>
-          <w:sz w:val="24"/>
-          <w:szCs w:val="24"/>
-          <w:rtl/>
-        </w:rPr>
-        <w:t xml:space="preserve">شو أصعب إشي بالنسبة إلك بتربية [الاسم]؟ وشو بيعطيكي قوة؟</w:t>
-      </w:r>
-    </w:p>
-    <w:p>
-      <w:pPr>
-        <w:pStyle w:val="ListParagraph"/>
-        <w:numPr>
-          <w:ilvl w:val="0"/>
-          <w:numId w:val="15"/>
-        </w:numPr>
-        <w:bidi/>
-        <w:spacing w:line="360"/>
-        <w:jc w:val="both"/>
-      </w:pPr>
-      <w:r>
-        <w:rPr>
-          <w:rFonts w:ascii="Arial" w:cs="Arial" w:eastAsia="Arial" w:hAnsi="Arial"/>
-          <w:b w:val="false"/>
-          <w:bCs w:val="false"/>
-          <w:sz w:val="24"/>
-          <w:szCs w:val="24"/>
-          <w:rtl/>
-        </w:rPr>
-        <w:t xml:space="preserve">كيف أثّر الوضع على صحتك، على نومك، على مزاجك؟</w:t>
-      </w:r>
-    </w:p>
-    <w:p>
-      <w:pPr>
-        <w:pStyle w:val="ListParagraph"/>
-        <w:numPr>
-          <w:ilvl w:val="0"/>
-          <w:numId w:val="15"/>
-        </w:numPr>
-        <w:bidi/>
-        <w:spacing w:line="360"/>
-        <w:jc w:val="both"/>
-      </w:pPr>
-      <w:r>
-        <w:rPr>
-          <w:rFonts w:ascii="Arial" w:cs="Arial" w:eastAsia="Arial" w:hAnsi="Arial"/>
-          <w:b w:val="false"/>
-          <w:bCs w:val="false"/>
-          <w:sz w:val="24"/>
-          <w:szCs w:val="24"/>
-          <w:rtl/>
-        </w:rPr>
-        <w:t xml:space="preserve">كيف أثّر على علاقتك مع زوجك؟ مع العائلة الكبيرة؟ مع باقي الأولاد؟</w:t>
-      </w:r>
-    </w:p>
-    <w:p>
-      <w:pPr>
-        <w:bidi/>
-        <w:spacing w:line="360"/>
-        <w:ind w:start="1134"/>
-        <w:jc w:val="both"/>
-      </w:pPr>
-      <w:r>
-        <w:rPr>
-          <w:rFonts w:ascii="Arial" w:cs="Arial" w:eastAsia="Arial" w:hAnsi="Arial"/>
-          <w:b w:val="false"/>
-          <w:bCs w:val="false"/>
-          <w:sz w:val="24"/>
-          <w:szCs w:val="24"/>
-          <w:rtl/>
-        </w:rPr>
-        <w:t xml:space="preserve">(في حدا بيبدّلك لما تحتاجي؟ بتطلعي من البيت لحالك لاجتماعات خاصة بالولد؟)</w:t>
-      </w:r>
-    </w:p>
-    <w:p>
-      <w:pPr>
-        <w:pStyle w:val="Heading2"/>
-        <w:keepNext/>
-        <w:bidi/>
-        <w:spacing w:after="120" w:before="240" w:line="360"/>
-      </w:pPr>
-      <w:r>
-        <w:rPr>
-          <w:rFonts w:ascii="David" w:cs="David" w:eastAsia="David" w:hAnsi="David"/>
-          <w:b/>
-          <w:bCs/>
-          <w:sz w:val="28"/>
-          <w:szCs w:val="28"/>
-          <w:rtl/>
-        </w:rPr>
-        <w:t xml:space="preserve">4. شو بيفكروا الناس حواليكي</w:t>
-      </w:r>
-    </w:p>
-    <w:p>
-      <w:pPr>
-        <w:pStyle w:val="ListParagraph"/>
-        <w:numPr>
-          <w:ilvl w:val="0"/>
-          <w:numId w:val="16"/>
-        </w:numPr>
-        <w:bidi/>
-        <w:spacing w:line="360"/>
-        <w:jc w:val="both"/>
-      </w:pPr>
-      <w:r>
-        <w:rPr>
-          <w:rFonts w:ascii="Arial" w:cs="Arial" w:eastAsia="Arial" w:hAnsi="Arial"/>
-          <w:b w:val="false"/>
-          <w:bCs w:val="false"/>
-          <w:sz w:val="24"/>
-          <w:szCs w:val="24"/>
-          <w:rtl/>
-        </w:rPr>
-        <w:t xml:space="preserve">شو بيفكروا الناس بمحيطك عن طفل عنده إعاقة؟</w:t>
-      </w:r>
-    </w:p>
-    <w:p>
-      <w:pPr>
-        <w:pStyle w:val="ListParagraph"/>
-        <w:numPr>
-          <w:ilvl w:val="0"/>
-          <w:numId w:val="16"/>
-        </w:numPr>
-        <w:bidi/>
-        <w:spacing w:line="360"/>
-        <w:jc w:val="both"/>
-      </w:pPr>
-      <w:r>
-        <w:rPr>
-          <w:rFonts w:ascii="Arial" w:cs="Arial" w:eastAsia="Arial" w:hAnsi="Arial"/>
-          <w:b w:val="false"/>
-          <w:bCs w:val="false"/>
-          <w:sz w:val="24"/>
-          <w:szCs w:val="24"/>
-          <w:rtl/>
-        </w:rPr>
-        <w:t xml:space="preserve">كيف تعاملت العائلة الكبيرة والعشيرة لما عرفوا عن الإعاقة؟ وكيف اليوم؟</w:t>
-      </w:r>
-    </w:p>
-    <w:p>
-      <w:pPr>
-        <w:pStyle w:val="ListParagraph"/>
-        <w:numPr>
-          <w:ilvl w:val="0"/>
-          <w:numId w:val="16"/>
-        </w:numPr>
-        <w:bidi/>
-        <w:spacing w:line="360"/>
-        <w:jc w:val="both"/>
-      </w:pPr>
-      <w:r>
-        <w:rPr>
-          <w:rFonts w:ascii="Arial" w:cs="Arial" w:eastAsia="Arial" w:hAnsi="Arial"/>
-          <w:b w:val="false"/>
-          <w:bCs w:val="false"/>
-          <w:sz w:val="24"/>
-          <w:szCs w:val="24"/>
-          <w:rtl/>
-        </w:rPr>
-        <w:t xml:space="preserve">في أشياء ما بتنحكى؟ أشياء الناس بيقولوها من ورا الظهر؟</w:t>
-      </w:r>
-    </w:p>
-    <w:p>
-      <w:pPr>
-        <w:pStyle w:val="ListParagraph"/>
-        <w:numPr>
-          <w:ilvl w:val="0"/>
-          <w:numId w:val="16"/>
-        </w:numPr>
-        <w:bidi/>
-        <w:spacing w:line="360"/>
-        <w:jc w:val="both"/>
-      </w:pPr>
-      <w:r>
-        <w:rPr>
-          <w:rFonts w:ascii="Arial" w:cs="Arial" w:eastAsia="Arial" w:hAnsi="Arial"/>
-          <w:b w:val="false"/>
-          <w:bCs w:val="false"/>
-          <w:sz w:val="24"/>
-          <w:szCs w:val="24"/>
-          <w:rtl/>
-        </w:rPr>
-        <w:t xml:space="preserve">حسّيتي مرة إنهم بيلوموكي؟ أثّرت إعاقة الولد على مكانتك بالبيت أو بالعائلة؟</w:t>
-      </w:r>
-    </w:p>
-    <w:p>
-      <w:pPr>
-        <w:pStyle w:val="ListParagraph"/>
-        <w:numPr>
-          <w:ilvl w:val="0"/>
-          <w:numId w:val="16"/>
-        </w:numPr>
-        <w:bidi/>
-        <w:spacing w:line="360"/>
-        <w:jc w:val="both"/>
-      </w:pPr>
-      <w:r>
-        <w:rPr>
-          <w:rFonts w:ascii="Arial" w:cs="Arial" w:eastAsia="Arial" w:hAnsi="Arial"/>
-          <w:b w:val="false"/>
-          <w:bCs w:val="false"/>
-          <w:sz w:val="24"/>
-          <w:szCs w:val="24"/>
-          <w:rtl/>
-        </w:rPr>
-        <w:t xml:space="preserve">شو مكان الدين والإيمان بطريقة فهمك للوضع وتعاملك معه؟</w:t>
-      </w:r>
-    </w:p>
-    <w:p>
-      <w:pPr>
-        <w:bidi/>
-        <w:spacing w:line="360"/>
-        <w:ind w:start="1134"/>
-        <w:jc w:val="both"/>
-      </w:pPr>
-      <w:r>
-        <w:rPr>
-          <w:rFonts w:ascii="Arial" w:cs="Arial" w:eastAsia="Arial" w:hAnsi="Arial"/>
-          <w:b w:val="false"/>
-          <w:bCs w:val="false"/>
-          <w:sz w:val="24"/>
-          <w:szCs w:val="24"/>
-          <w:rtl/>
-        </w:rPr>
-        <w:t xml:space="preserve">(بتاخدي [الاسم] على المناسبات العائلية، الأعراس، الزيارات؟ شو بيصير هناك؟)</w:t>
-      </w:r>
-    </w:p>
-    <w:p>
-      <w:pPr>
-        <w:pStyle w:val="Heading2"/>
-        <w:keepNext/>
-        <w:bidi/>
-        <w:spacing w:after="120" w:before="240" w:line="360"/>
-      </w:pPr>
-      <w:r>
-        <w:rPr>
-          <w:rFonts w:ascii="David" w:cs="David" w:eastAsia="David" w:hAnsi="David"/>
-          <w:b/>
-          <w:bCs/>
-          <w:sz w:val="28"/>
-          <w:szCs w:val="28"/>
-          <w:rtl/>
-        </w:rPr>
-        <w:t xml:space="preserve">5. المدرسة والدمج</w:t>
-      </w:r>
-    </w:p>
-    <w:p>
-      <w:pPr>
-        <w:pStyle w:val="ListParagraph"/>
-        <w:numPr>
-          <w:ilvl w:val="0"/>
-          <w:numId w:val="17"/>
-        </w:numPr>
-        <w:bidi/>
-        <w:spacing w:line="360"/>
-        <w:jc w:val="both"/>
-      </w:pPr>
-      <w:r>
-        <w:rPr>
-          <w:rFonts w:ascii="Arial" w:cs="Arial" w:eastAsia="Arial" w:hAnsi="Arial"/>
-          <w:b w:val="false"/>
-          <w:bCs w:val="false"/>
-          <w:sz w:val="24"/>
-          <w:szCs w:val="24"/>
-          <w:rtl/>
-        </w:rPr>
-        <w:t xml:space="preserve">وين بيتعلم/بتتعلم [الاسم] اليوم؟ احكيلي كيف وصلتوا لهاي المدرسة أو الصف.</w:t>
-      </w:r>
-    </w:p>
-    <w:p>
-      <w:pPr>
-        <w:pStyle w:val="ListParagraph"/>
-        <w:numPr>
-          <w:ilvl w:val="0"/>
-          <w:numId w:val="17"/>
-        </w:numPr>
-        <w:bidi/>
-        <w:spacing w:line="360"/>
-        <w:jc w:val="both"/>
-      </w:pPr>
-      <w:r>
-        <w:rPr>
-          <w:rFonts w:ascii="Arial" w:cs="Arial" w:eastAsia="Arial" w:hAnsi="Arial"/>
-          <w:b w:val="false"/>
-          <w:bCs w:val="false"/>
-          <w:sz w:val="24"/>
-          <w:szCs w:val="24"/>
-          <w:rtl/>
-        </w:rPr>
-        <w:t xml:space="preserve">مين قرّر على الإطار؟ كنتي باللجنة؟ كيف حسّيتي هناك؟ حسّيتي إنهم بيسمعوكي؟</w:t>
-      </w:r>
-    </w:p>
-    <w:p>
-      <w:pPr>
-        <w:pStyle w:val="ListParagraph"/>
-        <w:numPr>
-          <w:ilvl w:val="0"/>
-          <w:numId w:val="17"/>
-        </w:numPr>
-        <w:bidi/>
-        <w:spacing w:line="360"/>
-        <w:jc w:val="both"/>
-      </w:pPr>
-      <w:r>
-        <w:rPr>
-          <w:rFonts w:ascii="Arial" w:cs="Arial" w:eastAsia="Arial" w:hAnsi="Arial"/>
-          <w:b w:val="false"/>
-          <w:bCs w:val="false"/>
-          <w:sz w:val="24"/>
-          <w:szCs w:val="24"/>
-          <w:rtl/>
-        </w:rPr>
-        <w:t xml:space="preserve">عرضوا عليكي خيارات ثانية؟ كنتي عارفة إنه من حقك تختاري؟</w:t>
-      </w:r>
-    </w:p>
-    <w:p>
-      <w:pPr>
-        <w:pStyle w:val="ListParagraph"/>
-        <w:numPr>
-          <w:ilvl w:val="0"/>
-          <w:numId w:val="17"/>
-        </w:numPr>
-        <w:bidi/>
-        <w:spacing w:line="360"/>
-        <w:jc w:val="both"/>
-      </w:pPr>
-      <w:r>
-        <w:rPr>
-          <w:rFonts w:ascii="Arial" w:cs="Arial" w:eastAsia="Arial" w:hAnsi="Arial"/>
-          <w:b w:val="false"/>
-          <w:bCs w:val="false"/>
-          <w:sz w:val="24"/>
-          <w:szCs w:val="24"/>
-          <w:rtl/>
-        </w:rPr>
-        <w:t xml:space="preserve">لما بيقولوا "دمج"، شو معناها بالنسبة إلك؟ شو كنتي تتمني يكون لـ[الاسم]؟</w:t>
-      </w:r>
-    </w:p>
-    <w:p>
-      <w:pPr>
-        <w:pStyle w:val="ListParagraph"/>
-        <w:numPr>
-          <w:ilvl w:val="0"/>
-          <w:numId w:val="17"/>
-        </w:numPr>
-        <w:bidi/>
-        <w:spacing w:line="360"/>
-        <w:jc w:val="both"/>
-      </w:pPr>
-      <w:r>
-        <w:rPr>
-          <w:rFonts w:ascii="Arial" w:cs="Arial" w:eastAsia="Arial" w:hAnsi="Arial"/>
-          <w:b w:val="false"/>
-          <w:bCs w:val="false"/>
-          <w:sz w:val="24"/>
-          <w:szCs w:val="24"/>
-          <w:rtl/>
-        </w:rPr>
-        <w:t xml:space="preserve">كيف علاقتك مع المعلمات، مع المساعدة، مع المستشارة؟ بأي لغة بيحكوا معك؟ كيف بيخبروكي شو بيصير؟</w:t>
-      </w:r>
-    </w:p>
-    <w:p>
-      <w:pPr>
-        <w:pStyle w:val="ListParagraph"/>
-        <w:numPr>
-          <w:ilvl w:val="0"/>
-          <w:numId w:val="17"/>
-        </w:numPr>
-        <w:bidi/>
-        <w:spacing w:line="360"/>
-        <w:jc w:val="both"/>
-      </w:pPr>
-      <w:r>
-        <w:rPr>
-          <w:rFonts w:ascii="Arial" w:cs="Arial" w:eastAsia="Arial" w:hAnsi="Arial"/>
-          <w:b w:val="false"/>
-          <w:bCs w:val="false"/>
-          <w:sz w:val="24"/>
-          <w:szCs w:val="24"/>
-          <w:rtl/>
-        </w:rPr>
-        <w:t xml:space="preserve">شو ماشي منيح بالمدرسة؟ شو مش ماشي؟</w:t>
-      </w:r>
-    </w:p>
-    <w:p>
-      <w:pPr>
-        <w:pStyle w:val="ListParagraph"/>
-        <w:numPr>
-          <w:ilvl w:val="0"/>
-          <w:numId w:val="17"/>
-        </w:numPr>
-        <w:bidi/>
-        <w:spacing w:line="360"/>
-        <w:jc w:val="both"/>
-      </w:pPr>
-      <w:r>
-        <w:rPr>
-          <w:rFonts w:ascii="Arial" w:cs="Arial" w:eastAsia="Arial" w:hAnsi="Arial"/>
-          <w:b w:val="false"/>
-          <w:bCs w:val="false"/>
-          <w:sz w:val="24"/>
-          <w:szCs w:val="24"/>
-          <w:rtl/>
-        </w:rPr>
-        <w:t xml:space="preserve">[الاسم] بيحس/بتحس بانتماء؟ عنده/عندها أصحاب؟ كيف بيتعاملوا باقي الأولاد؟</w:t>
-      </w:r>
-    </w:p>
-    <w:p>
-      <w:pPr>
-        <w:pStyle w:val="ListParagraph"/>
-        <w:numPr>
-          <w:ilvl w:val="0"/>
-          <w:numId w:val="17"/>
-        </w:numPr>
-        <w:bidi/>
-        <w:spacing w:line="360"/>
-        <w:jc w:val="both"/>
-      </w:pPr>
-      <w:r>
-        <w:rPr>
-          <w:rFonts w:ascii="Arial" w:cs="Arial" w:eastAsia="Arial" w:hAnsi="Arial"/>
-          <w:b w:val="false"/>
-          <w:bCs w:val="false"/>
-          <w:sz w:val="24"/>
-          <w:szCs w:val="24"/>
-          <w:rtl/>
-        </w:rPr>
-        <w:t xml:space="preserve">كيف بيوصل/بتوصل للمدرسة؟ المسافة أو المواصلات بتأثر على الاختيار أو على علاقتك مع الطاقم؟</w:t>
-      </w:r>
-    </w:p>
-    <w:p>
-      <w:pPr>
-        <w:bidi/>
-        <w:spacing w:line="360"/>
-        <w:ind w:start="1134"/>
-        <w:jc w:val="both"/>
-      </w:pPr>
-      <w:r>
-        <w:rPr>
-          <w:rFonts w:ascii="Arial" w:cs="Arial" w:eastAsia="Arial" w:hAnsi="Arial"/>
-          <w:b w:val="false"/>
-          <w:bCs w:val="false"/>
-          <w:sz w:val="24"/>
-          <w:szCs w:val="24"/>
-          <w:rtl/>
-        </w:rPr>
-        <w:t xml:space="preserve">(أعطيني مثال على مرة حسّيتي إنه الطاقم فعلاً شريك معك. ومثال على مرة حسّيتي حالك لحالك قدامهم.)</w:t>
-      </w:r>
-    </w:p>
-    <w:p>
-      <w:pPr>
-        <w:pStyle w:val="Heading2"/>
-        <w:keepNext/>
-        <w:bidi/>
-        <w:spacing w:after="120" w:before="240" w:line="360"/>
-      </w:pPr>
-      <w:r>
-        <w:rPr>
-          <w:rFonts w:ascii="David" w:cs="David" w:eastAsia="David" w:hAnsi="David"/>
-          <w:b/>
-          <w:bCs/>
-          <w:sz w:val="28"/>
-          <w:szCs w:val="28"/>
-          <w:rtl/>
-        </w:rPr>
-        <w:t xml:space="preserve">6. المجتمع</w:t>
-      </w:r>
-    </w:p>
-    <w:p>
-      <w:pPr>
-        <w:pStyle w:val="ListParagraph"/>
-        <w:numPr>
-          <w:ilvl w:val="0"/>
-          <w:numId w:val="18"/>
-        </w:numPr>
-        <w:bidi/>
-        <w:spacing w:line="360"/>
-        <w:jc w:val="both"/>
-      </w:pPr>
-      <w:r>
-        <w:rPr>
-          <w:rFonts w:ascii="Arial" w:cs="Arial" w:eastAsia="Arial" w:hAnsi="Arial"/>
-          <w:b w:val="false"/>
-          <w:bCs w:val="false"/>
-          <w:sz w:val="24"/>
-          <w:szCs w:val="24"/>
-          <w:rtl/>
-        </w:rPr>
-        <w:t xml:space="preserve">كيف بيشارك/بتشارك [الاسم] بحياة المجتمع: لعب مع أولاد الجيران، المسجد، دورات، مناسبات؟</w:t>
-      </w:r>
-    </w:p>
-    <w:p>
-      <w:pPr>
-        <w:pStyle w:val="ListParagraph"/>
-        <w:numPr>
-          <w:ilvl w:val="0"/>
-          <w:numId w:val="18"/>
-        </w:numPr>
-        <w:bidi/>
-        <w:spacing w:line="360"/>
-        <w:jc w:val="both"/>
-      </w:pPr>
-      <w:r>
-        <w:rPr>
-          <w:rFonts w:ascii="Arial" w:cs="Arial" w:eastAsia="Arial" w:hAnsi="Arial"/>
-          <w:b w:val="false"/>
-          <w:bCs w:val="false"/>
-          <w:sz w:val="24"/>
-          <w:szCs w:val="24"/>
-          <w:rtl/>
-        </w:rPr>
-        <w:t xml:space="preserve">في أماكن بالمجتمع بتحسي إنه/إنها مش مرغوب/ة فيها؟</w:t>
-      </w:r>
-    </w:p>
-    <w:p>
-      <w:pPr>
-        <w:pStyle w:val="ListParagraph"/>
-        <w:numPr>
-          <w:ilvl w:val="0"/>
-          <w:numId w:val="18"/>
-        </w:numPr>
-        <w:bidi/>
-        <w:spacing w:line="360"/>
-        <w:jc w:val="both"/>
-      </w:pPr>
-      <w:r>
-        <w:rPr>
-          <w:rFonts w:ascii="Arial" w:cs="Arial" w:eastAsia="Arial" w:hAnsi="Arial"/>
-          <w:b w:val="false"/>
-          <w:bCs w:val="false"/>
-          <w:sz w:val="24"/>
-          <w:szCs w:val="24"/>
-          <w:rtl/>
-        </w:rPr>
-        <w:t xml:space="preserve">شو بتتمني يتغير ببلدك عشان أولاد مثل [الاسم]؟</w:t>
-      </w:r>
-    </w:p>
-    <w:p>
-      <w:pPr>
-        <w:pStyle w:val="Heading2"/>
-        <w:keepNext/>
-        <w:bidi/>
-        <w:spacing w:after="120" w:before="240" w:line="360"/>
-      </w:pPr>
-      <w:r>
-        <w:rPr>
-          <w:rFonts w:ascii="David" w:cs="David" w:eastAsia="David" w:hAnsi="David"/>
-          <w:b/>
-          <w:bCs/>
-          <w:sz w:val="28"/>
-          <w:szCs w:val="28"/>
-          <w:rtl/>
-        </w:rPr>
-        <w:t xml:space="preserve">7. الدعم والموارد</w:t>
-      </w:r>
-    </w:p>
-    <w:p>
-      <w:pPr>
-        <w:pStyle w:val="ListParagraph"/>
-        <w:numPr>
-          <w:ilvl w:val="0"/>
-          <w:numId w:val="19"/>
-        </w:numPr>
-        <w:bidi/>
-        <w:spacing w:line="360"/>
-        <w:jc w:val="both"/>
-      </w:pPr>
-      <w:r>
-        <w:rPr>
-          <w:rFonts w:ascii="Arial" w:cs="Arial" w:eastAsia="Arial" w:hAnsi="Arial"/>
-          <w:b w:val="false"/>
-          <w:bCs w:val="false"/>
-          <w:sz w:val="24"/>
-          <w:szCs w:val="24"/>
-          <w:rtl/>
-        </w:rPr>
-        <w:t xml:space="preserve">لمين بتلجئي لما يصعب عليكي؟ مين فعلاً بيساعد؟</w:t>
-      </w:r>
-    </w:p>
-    <w:p>
-      <w:pPr>
-        <w:pStyle w:val="ListParagraph"/>
-        <w:numPr>
-          <w:ilvl w:val="0"/>
-          <w:numId w:val="19"/>
-        </w:numPr>
-        <w:bidi/>
-        <w:spacing w:line="360"/>
-        <w:jc w:val="both"/>
-      </w:pPr>
-      <w:r>
-        <w:rPr>
-          <w:rFonts w:ascii="Arial" w:cs="Arial" w:eastAsia="Arial" w:hAnsi="Arial"/>
-          <w:b w:val="false"/>
-          <w:bCs w:val="false"/>
-          <w:sz w:val="24"/>
-          <w:szCs w:val="24"/>
-          <w:rtl/>
-        </w:rPr>
-        <w:t xml:space="preserve">مع أي خدمات إنتي على تواصل: عاملة اجتماعية، مركز تطور الطفل، التأمين الوطني، جمعية، مجموعة أمهات؟ كيف التجربة معهم؟</w:t>
-      </w:r>
-    </w:p>
-    <w:p>
-      <w:pPr>
-        <w:pStyle w:val="ListParagraph"/>
-        <w:numPr>
-          <w:ilvl w:val="0"/>
-          <w:numId w:val="19"/>
-        </w:numPr>
-        <w:bidi/>
-        <w:spacing w:line="360"/>
-        <w:jc w:val="both"/>
-      </w:pPr>
-      <w:r>
-        <w:rPr>
-          <w:rFonts w:ascii="Arial" w:cs="Arial" w:eastAsia="Arial" w:hAnsi="Arial"/>
-          <w:b w:val="false"/>
-          <w:bCs w:val="false"/>
-          <w:sz w:val="24"/>
-          <w:szCs w:val="24"/>
-          <w:rtl/>
-        </w:rPr>
-        <w:t xml:space="preserve">شو ناقصك؟ شو كان ممكن يساعدك ومش موجود؟</w:t>
-      </w:r>
-    </w:p>
-    <w:p>
-      <w:pPr>
-        <w:pStyle w:val="ListParagraph"/>
-        <w:numPr>
-          <w:ilvl w:val="0"/>
-          <w:numId w:val="19"/>
-        </w:numPr>
-        <w:bidi/>
-        <w:spacing w:line="360"/>
-        <w:jc w:val="both"/>
-      </w:pPr>
-      <w:r>
-        <w:rPr>
-          <w:rFonts w:ascii="Arial" w:cs="Arial" w:eastAsia="Arial" w:hAnsi="Arial"/>
-          <w:b w:val="false"/>
-          <w:bCs w:val="false"/>
-          <w:sz w:val="24"/>
-          <w:szCs w:val="24"/>
-          <w:rtl/>
-        </w:rPr>
-        <w:t xml:space="preserve">تعرفتي على أمهات ثانيات بنفس الوضع؟ ساعد هذا الإشي؟</w:t>
-      </w:r>
-    </w:p>
-    <w:p>
-      <w:pPr>
-        <w:pStyle w:val="Heading2"/>
-        <w:keepNext/>
-        <w:bidi/>
-        <w:spacing w:after="120" w:before="240" w:line="360"/>
-      </w:pPr>
-      <w:r>
-        <w:rPr>
-          <w:rFonts w:ascii="David" w:cs="David" w:eastAsia="David" w:hAnsi="David"/>
-          <w:b/>
-          <w:bCs/>
-          <w:sz w:val="28"/>
-          <w:szCs w:val="28"/>
-          <w:rtl/>
-        </w:rPr>
-        <w:t xml:space="preserve">8. نظرة للمستقبل</w:t>
-      </w:r>
-    </w:p>
-    <w:p>
-      <w:pPr>
-        <w:pStyle w:val="ListParagraph"/>
-        <w:numPr>
-          <w:ilvl w:val="0"/>
-          <w:numId w:val="20"/>
-        </w:numPr>
-        <w:bidi/>
-        <w:spacing w:line="360"/>
-        <w:jc w:val="both"/>
-      </w:pPr>
-      <w:r>
-        <w:rPr>
-          <w:rFonts w:ascii="Arial" w:cs="Arial" w:eastAsia="Arial" w:hAnsi="Arial"/>
-          <w:b w:val="false"/>
-          <w:bCs w:val="false"/>
-          <w:sz w:val="24"/>
-          <w:szCs w:val="24"/>
-          <w:rtl/>
-        </w:rPr>
-        <w:t xml:space="preserve">شو بتتمني لـ[الاسم] بعد خمس سنين؟</w:t>
-      </w:r>
-    </w:p>
-    <w:p>
-      <w:pPr>
-        <w:pStyle w:val="ListParagraph"/>
-        <w:numPr>
-          <w:ilvl w:val="0"/>
-          <w:numId w:val="20"/>
-        </w:numPr>
-        <w:bidi/>
-        <w:spacing w:line="360"/>
-        <w:jc w:val="both"/>
-      </w:pPr>
-      <w:r>
-        <w:rPr>
-          <w:rFonts w:ascii="Arial" w:cs="Arial" w:eastAsia="Arial" w:hAnsi="Arial"/>
-          <w:b w:val="false"/>
-          <w:bCs w:val="false"/>
-          <w:sz w:val="24"/>
-          <w:szCs w:val="24"/>
-          <w:rtl/>
-        </w:rPr>
-        <w:t xml:space="preserve">لو أم شابة من بلدك اكتشفت هلأ إنه ابنها عنده إعاقة، شو بتقولي لها؟</w:t>
-      </w:r>
-    </w:p>
-    <w:p>
-      <w:pPr>
-        <w:pStyle w:val="ListParagraph"/>
-        <w:numPr>
-          <w:ilvl w:val="0"/>
-          <w:numId w:val="20"/>
-        </w:numPr>
-        <w:bidi/>
-        <w:spacing w:line="360"/>
-        <w:jc w:val="both"/>
-      </w:pPr>
-      <w:r>
-        <w:rPr>
-          <w:rFonts w:ascii="Arial" w:cs="Arial" w:eastAsia="Arial" w:hAnsi="Arial"/>
-          <w:b w:val="false"/>
-          <w:bCs w:val="false"/>
-          <w:sz w:val="24"/>
-          <w:szCs w:val="24"/>
-          <w:rtl/>
-        </w:rPr>
-        <w:t xml:space="preserve">لو بتقدري تقولي جملة وحدة لمدير المدرسة، وجملة وحدة لوزارة التربية، شو بتقولي؟</w:t>
-      </w:r>
-    </w:p>
-    <w:p>
-      <w:pPr>
-        <w:pStyle w:val="Heading2"/>
-        <w:keepNext/>
-        <w:bidi/>
-        <w:spacing w:after="120" w:before="240" w:line="360"/>
-      </w:pPr>
-      <w:r>
-        <w:rPr>
-          <w:rFonts w:ascii="David" w:cs="David" w:eastAsia="David" w:hAnsi="David"/>
-          <w:b/>
-          <w:bCs/>
-          <w:sz w:val="28"/>
-          <w:szCs w:val="28"/>
-          <w:rtl/>
-        </w:rPr>
-        <w:t xml:space="preserve">9. الختام</w:t>
-      </w:r>
-    </w:p>
-    <w:p>
-      <w:pPr>
-        <w:pStyle w:val="ListParagraph"/>
-        <w:numPr>
-          <w:ilvl w:val="0"/>
-          <w:numId w:val="21"/>
-        </w:numPr>
-        <w:bidi/>
-        <w:spacing w:line="360"/>
-        <w:jc w:val="both"/>
-      </w:pPr>
-      <w:r>
-        <w:rPr>
-          <w:rFonts w:ascii="Arial" w:cs="Arial" w:eastAsia="Arial" w:hAnsi="Arial"/>
-          <w:b w:val="false"/>
-          <w:bCs w:val="false"/>
-          <w:sz w:val="24"/>
-          <w:szCs w:val="24"/>
-          <w:rtl/>
-        </w:rPr>
-        <w:t xml:space="preserve">في إشي ما سألتك عنه وبدك تضيفيه؟</w:t>
-      </w:r>
-    </w:p>
-    <w:p>
-      <w:pPr>
-        <w:pStyle w:val="ListParagraph"/>
-        <w:numPr>
-          <w:ilvl w:val="0"/>
-          <w:numId w:val="21"/>
-        </w:numPr>
-        <w:bidi/>
-        <w:spacing w:line="360"/>
-        <w:jc w:val="both"/>
-      </w:pPr>
-      <w:r>
-        <w:rPr>
-          <w:rFonts w:ascii="Arial" w:cs="Arial" w:eastAsia="Arial" w:hAnsi="Arial"/>
-          <w:b w:val="false"/>
-          <w:bCs w:val="false"/>
-          <w:sz w:val="24"/>
-          <w:szCs w:val="24"/>
-          <w:rtl/>
-        </w:rPr>
-        <w:t xml:space="preserve">كيف حسّيتي بهاي المحادثة؟</w:t>
-      </w:r>
-    </w:p>
-    <w:p>
-      <w:pPr>
-        <w:bidi/>
-        <w:spacing w:line="360"/>
-        <w:jc w:val="both"/>
-      </w:pPr>
-      <w:r>
-        <w:rPr>
-          <w:rFonts w:ascii="Arial" w:cs="Arial" w:eastAsia="Arial" w:hAnsi="Arial"/>
-          <w:b w:val="false"/>
-          <w:bCs w:val="false"/>
-          <w:sz w:val="24"/>
-          <w:szCs w:val="24"/>
-          <w:rtl/>
-        </w:rPr>
-        <w:t xml:space="preserve">شكر، تذكير بالسرية، شرح عن الخطوات الجاية وإمكانية الحصول على ملخص للنتائج، إعطاء أرقام تواصل للباحث/ة ولخدمات دعم باللغة العربية.</w:t>
+          <w:b w:val="false"/>
+          <w:bCs w:val="false"/>
+          <w:sz w:val="24"/>
+          <w:szCs w:val="24"/>
+          <w:rtl/>
+        </w:rPr>
+        <w:t xml:space="preserve">لو بتقدري تقولي جملة وحدة لمدير المدرسة وجملة وحدة لوزارة التربية، شو بتقولي؟ وفي إشي ما سألتك عنه وبدك تضيفيه؟</w:t>
       </w:r>
     </w:p>
     <w:p>
@@ -6424,102 +5004,6 @@
     </w:lvlOverride>
   </w:num>
   <w:num w:numId="5">
-    <w:abstractNumId w:val="2"/>
-    <w:lvlOverride w:ilvl="0">
-      <w:startOverride w:val="1"/>
-    </w:lvlOverride>
-  </w:num>
-  <w:num w:numId="6">
-    <w:abstractNumId w:val="2"/>
-    <w:lvlOverride w:ilvl="0">
-      <w:startOverride w:val="1"/>
-    </w:lvlOverride>
-  </w:num>
-  <w:num w:numId="7">
-    <w:abstractNumId w:val="2"/>
-    <w:lvlOverride w:ilvl="0">
-      <w:startOverride w:val="1"/>
-    </w:lvlOverride>
-  </w:num>
-  <w:num w:numId="8">
-    <w:abstractNumId w:val="2"/>
-    <w:lvlOverride w:ilvl="0">
-      <w:startOverride w:val="1"/>
-    </w:lvlOverride>
-  </w:num>
-  <w:num w:numId="9">
-    <w:abstractNumId w:val="2"/>
-    <w:lvlOverride w:ilvl="0">
-      <w:startOverride w:val="1"/>
-    </w:lvlOverride>
-  </w:num>
-  <w:num w:numId="10">
-    <w:abstractNumId w:val="2"/>
-    <w:lvlOverride w:ilvl="0">
-      <w:startOverride w:val="1"/>
-    </w:lvlOverride>
-  </w:num>
-  <w:num w:numId="11">
-    <w:abstractNumId w:val="2"/>
-    <w:lvlOverride w:ilvl="0">
-      <w:startOverride w:val="1"/>
-    </w:lvlOverride>
-  </w:num>
-  <w:num w:numId="12">
-    <w:abstractNumId w:val="2"/>
-    <w:lvlOverride w:ilvl="0">
-      <w:startOverride w:val="1"/>
-    </w:lvlOverride>
-  </w:num>
-  <w:num w:numId="13">
-    <w:abstractNumId w:val="2"/>
-    <w:lvlOverride w:ilvl="0">
-      <w:startOverride w:val="1"/>
-    </w:lvlOverride>
-  </w:num>
-  <w:num w:numId="14">
-    <w:abstractNumId w:val="2"/>
-    <w:lvlOverride w:ilvl="0">
-      <w:startOverride w:val="1"/>
-    </w:lvlOverride>
-  </w:num>
-  <w:num w:numId="15">
-    <w:abstractNumId w:val="2"/>
-    <w:lvlOverride w:ilvl="0">
-      <w:startOverride w:val="1"/>
-    </w:lvlOverride>
-  </w:num>
-  <w:num w:numId="16">
-    <w:abstractNumId w:val="2"/>
-    <w:lvlOverride w:ilvl="0">
-      <w:startOverride w:val="1"/>
-    </w:lvlOverride>
-  </w:num>
-  <w:num w:numId="17">
-    <w:abstractNumId w:val="2"/>
-    <w:lvlOverride w:ilvl="0">
-      <w:startOverride w:val="1"/>
-    </w:lvlOverride>
-  </w:num>
-  <w:num w:numId="18">
-    <w:abstractNumId w:val="2"/>
-    <w:lvlOverride w:ilvl="0">
-      <w:startOverride w:val="1"/>
-    </w:lvlOverride>
-  </w:num>
-  <w:num w:numId="19">
-    <w:abstractNumId w:val="2"/>
-    <w:lvlOverride w:ilvl="0">
-      <w:startOverride w:val="1"/>
-    </w:lvlOverride>
-  </w:num>
-  <w:num w:numId="20">
-    <w:abstractNumId w:val="2"/>
-    <w:lvlOverride w:ilvl="0">
-      <w:startOverride w:val="1"/>
-    </w:lvlOverride>
-  </w:num>
-  <w:num w:numId="21">
     <w:abstractNumId w:val="2"/>
     <w:lvlOverride w:ilvl="0">
       <w:startOverride w:val="1"/>

</xml_diff>

<commit_message>
Right-align the timeline table and fit it to the text width
Co-Authored-By: Claude Fable 5.1 <noreply@anthropic.com>
Claude-Session: https://claude.ai/code/session_013NTfKpqds6XkbupkiTDphe
</commit_message>
<xml_diff>
--- a/academic/research-proposal-bedouin-mothers.docx
+++ b/academic/research-proposal-bedouin-mothers.docx
@@ -1846,7 +1846,8 @@
     <w:tbl>
       <w:tblPr>
         <w:bidiVisual/>
-        <w:tblW w:type="auto" w:w="100"/>
+        <w:tblW w:type="dxa" w:w="9072"/>
+        <w:jc w:val="right"/>
         <w:tblBorders>
           <w:top w:val="single" w:color="auto" w:sz="4"/>
           <w:left w:val="single" w:color="auto" w:sz="4"/>
@@ -1857,9 +1858,9 @@
         </w:tblBorders>
       </w:tblPr>
       <w:tblGrid>
-        <w:gridCol w:w="3000"/>
-        <w:gridCol w:w="3000"/>
-        <w:gridCol w:w="3300"/>
+        <w:gridCol w:w="2900"/>
+        <w:gridCol w:w="2900"/>
+        <w:gridCol w:w="3272"/>
       </w:tblGrid>
       <w:tr>
         <w:trPr>
@@ -1867,7 +1868,7 @@
         </w:trPr>
         <w:tc>
           <w:tcPr>
-            <w:tcW w:type="dxa" w:w="3000"/>
+            <w:tcW w:type="dxa" w:w="2900"/>
             <w:shd w:fill="E7E6E6" w:color="auto" w:val="clear"/>
             <w:tcMar>
               <w:top w:type="dxa" w:w="60"/>
@@ -1899,7 +1900,7 @@
         </w:tc>
         <w:tc>
           <w:tcPr>
-            <w:tcW w:type="dxa" w:w="3000"/>
+            <w:tcW w:type="dxa" w:w="2900"/>
             <w:shd w:fill="E7E6E6" w:color="auto" w:val="clear"/>
             <w:tcMar>
               <w:top w:type="dxa" w:w="60"/>
@@ -1931,7 +1932,7 @@
         </w:tc>
         <w:tc>
           <w:tcPr>
-            <w:tcW w:type="dxa" w:w="3300"/>
+            <w:tcW w:type="dxa" w:w="3272"/>
             <w:shd w:fill="E7E6E6" w:color="auto" w:val="clear"/>
             <w:tcMar>
               <w:top w:type="dxa" w:w="60"/>
@@ -1968,7 +1969,7 @@
         </w:trPr>
         <w:tc>
           <w:tcPr>
-            <w:tcW w:type="dxa" w:w="3000"/>
+            <w:tcW w:type="dxa" w:w="2900"/>
             <w:tcMar>
               <w:top w:type="dxa" w:w="60"/>
               <w:left w:type="dxa" w:w="100"/>
@@ -1999,7 +2000,7 @@
         </w:tc>
         <w:tc>
           <w:tcPr>
-            <w:tcW w:type="dxa" w:w="3000"/>
+            <w:tcW w:type="dxa" w:w="2900"/>
             <w:tcMar>
               <w:top w:type="dxa" w:w="60"/>
               <w:left w:type="dxa" w:w="100"/>
@@ -2030,7 +2031,7 @@
         </w:tc>
         <w:tc>
           <w:tcPr>
-            <w:tcW w:type="dxa" w:w="3300"/>
+            <w:tcW w:type="dxa" w:w="3272"/>
             <w:tcMar>
               <w:top w:type="dxa" w:w="60"/>
               <w:left w:type="dxa" w:w="100"/>
@@ -2066,7 +2067,7 @@
         </w:trPr>
         <w:tc>
           <w:tcPr>
-            <w:tcW w:type="dxa" w:w="3000"/>
+            <w:tcW w:type="dxa" w:w="2900"/>
             <w:tcMar>
               <w:top w:type="dxa" w:w="60"/>
               <w:left w:type="dxa" w:w="100"/>
@@ -2097,7 +2098,7 @@
         </w:tc>
         <w:tc>
           <w:tcPr>
-            <w:tcW w:type="dxa" w:w="3000"/>
+            <w:tcW w:type="dxa" w:w="2900"/>
             <w:tcMar>
               <w:top w:type="dxa" w:w="60"/>
               <w:left w:type="dxa" w:w="100"/>
@@ -2128,7 +2129,7 @@
         </w:tc>
         <w:tc>
           <w:tcPr>
-            <w:tcW w:type="dxa" w:w="3300"/>
+            <w:tcW w:type="dxa" w:w="3272"/>
             <w:tcMar>
               <w:top w:type="dxa" w:w="60"/>
               <w:left w:type="dxa" w:w="100"/>
@@ -2164,7 +2165,7 @@
         </w:trPr>
         <w:tc>
           <w:tcPr>
-            <w:tcW w:type="dxa" w:w="3000"/>
+            <w:tcW w:type="dxa" w:w="2900"/>
             <w:tcMar>
               <w:top w:type="dxa" w:w="60"/>
               <w:left w:type="dxa" w:w="100"/>
@@ -2195,7 +2196,7 @@
         </w:tc>
         <w:tc>
           <w:tcPr>
-            <w:tcW w:type="dxa" w:w="3000"/>
+            <w:tcW w:type="dxa" w:w="2900"/>
             <w:tcMar>
               <w:top w:type="dxa" w:w="60"/>
               <w:left w:type="dxa" w:w="100"/>
@@ -2226,7 +2227,7 @@
         </w:tc>
         <w:tc>
           <w:tcPr>
-            <w:tcW w:type="dxa" w:w="3300"/>
+            <w:tcW w:type="dxa" w:w="3272"/>
             <w:tcMar>
               <w:top w:type="dxa" w:w="60"/>
               <w:left w:type="dxa" w:w="100"/>
@@ -2262,7 +2263,7 @@
         </w:trPr>
         <w:tc>
           <w:tcPr>
-            <w:tcW w:type="dxa" w:w="3000"/>
+            <w:tcW w:type="dxa" w:w="2900"/>
             <w:tcMar>
               <w:top w:type="dxa" w:w="60"/>
               <w:left w:type="dxa" w:w="100"/>
@@ -2293,7 +2294,7 @@
         </w:tc>
         <w:tc>
           <w:tcPr>
-            <w:tcW w:type="dxa" w:w="3000"/>
+            <w:tcW w:type="dxa" w:w="2900"/>
             <w:tcMar>
               <w:top w:type="dxa" w:w="60"/>
               <w:left w:type="dxa" w:w="100"/>
@@ -2324,7 +2325,7 @@
         </w:tc>
         <w:tc>
           <w:tcPr>
-            <w:tcW w:type="dxa" w:w="3300"/>
+            <w:tcW w:type="dxa" w:w="3272"/>
             <w:tcMar>
               <w:top w:type="dxa" w:w="60"/>
               <w:left w:type="dxa" w:w="100"/>
@@ -2360,7 +2361,7 @@
         </w:trPr>
         <w:tc>
           <w:tcPr>
-            <w:tcW w:type="dxa" w:w="3000"/>
+            <w:tcW w:type="dxa" w:w="2900"/>
             <w:tcMar>
               <w:top w:type="dxa" w:w="60"/>
               <w:left w:type="dxa" w:w="100"/>
@@ -2391,7 +2392,7 @@
         </w:tc>
         <w:tc>
           <w:tcPr>
-            <w:tcW w:type="dxa" w:w="3000"/>
+            <w:tcW w:type="dxa" w:w="2900"/>
             <w:tcMar>
               <w:top w:type="dxa" w:w="60"/>
               <w:left w:type="dxa" w:w="100"/>
@@ -2422,7 +2423,7 @@
         </w:tc>
         <w:tc>
           <w:tcPr>
-            <w:tcW w:type="dxa" w:w="3300"/>
+            <w:tcW w:type="dxa" w:w="3272"/>
             <w:tcMar>
               <w:top w:type="dxa" w:w="60"/>
               <w:left w:type="dxa" w:w="100"/>
@@ -2458,7 +2459,7 @@
         </w:trPr>
         <w:tc>
           <w:tcPr>
-            <w:tcW w:type="dxa" w:w="3000"/>
+            <w:tcW w:type="dxa" w:w="2900"/>
             <w:tcMar>
               <w:top w:type="dxa" w:w="60"/>
               <w:left w:type="dxa" w:w="100"/>
@@ -2489,7 +2490,7 @@
         </w:tc>
         <w:tc>
           <w:tcPr>
-            <w:tcW w:type="dxa" w:w="3000"/>
+            <w:tcW w:type="dxa" w:w="2900"/>
             <w:tcMar>
               <w:top w:type="dxa" w:w="60"/>
               <w:left w:type="dxa" w:w="100"/>
@@ -2520,7 +2521,7 @@
         </w:tc>
         <w:tc>
           <w:tcPr>
-            <w:tcW w:type="dxa" w:w="3300"/>
+            <w:tcW w:type="dxa" w:w="3272"/>
             <w:tcMar>
               <w:top w:type="dxa" w:w="60"/>
               <w:left w:type="dxa" w:w="100"/>
@@ -2556,7 +2557,7 @@
         </w:trPr>
         <w:tc>
           <w:tcPr>
-            <w:tcW w:type="dxa" w:w="3000"/>
+            <w:tcW w:type="dxa" w:w="2900"/>
             <w:tcMar>
               <w:top w:type="dxa" w:w="60"/>
               <w:left w:type="dxa" w:w="100"/>
@@ -2587,7 +2588,7 @@
         </w:tc>
         <w:tc>
           <w:tcPr>
-            <w:tcW w:type="dxa" w:w="3000"/>
+            <w:tcW w:type="dxa" w:w="2900"/>
             <w:tcMar>
               <w:top w:type="dxa" w:w="60"/>
               <w:left w:type="dxa" w:w="100"/>
@@ -2618,7 +2619,7 @@
         </w:tc>
         <w:tc>
           <w:tcPr>
-            <w:tcW w:type="dxa" w:w="3300"/>
+            <w:tcW w:type="dxa" w:w="3272"/>
             <w:tcMar>
               <w:top w:type="dxa" w:w="60"/>
               <w:left w:type="dxa" w:w="100"/>

</xml_diff>

<commit_message>
Tag runs with proofing languages and hide spelling/grammar marks
Co-Authored-By: Claude Fable 5.1 <noreply@anthropic.com>
Claude-Session: https://claude.ai/code/session_013NTfKpqds6XkbupkiTDphe
</commit_message>
<xml_diff>
--- a/academic/research-proposal-bedouin-mothers.docx
+++ b/academic/research-proposal-bedouin-mothers.docx
@@ -64,6 +64,7 @@
           <w:sz w:val="24"/>
           <w:szCs w:val="24"/>
           <w:rtl/>
+          <w:lang w:val="he-IL" w:bidi="he-IL"/>
         </w:rPr>
         <w:t xml:space="preserve">הקריה האקדמית אונו</w:t>
       </w:r>
@@ -84,6 +85,7 @@
           <w:sz w:val="24"/>
           <w:szCs w:val="24"/>
           <w:rtl/>
+          <w:lang w:val="he-IL" w:bidi="he-IL"/>
         </w:rPr>
         <w:t xml:space="preserve">[שם הפקולטה / התוכנית]</w:t>
       </w:r>
@@ -98,6 +100,7 @@
           <w:sz w:val="24"/>
           <w:szCs w:val="24"/>
           <w:rtl/>
+          <w:lang w:val="he-IL" w:bidi="he-IL"/>
         </w:rPr>
         <w:t xml:space="preserve"/>
       </w:r>
@@ -118,6 +121,7 @@
           <w:sz w:val="24"/>
           <w:szCs w:val="24"/>
           <w:rtl/>
+          <w:lang w:val="he-IL" w:bidi="he-IL"/>
         </w:rPr>
         <w:t xml:space="preserve">קורס: שילוב והכלה במרחב החינוכי-חברתי [מספר קורס: ________]</w:t>
       </w:r>
@@ -138,6 +142,7 @@
           <w:sz w:val="24"/>
           <w:szCs w:val="24"/>
           <w:rtl/>
+          <w:lang w:val="he-IL" w:bidi="he-IL"/>
         </w:rPr>
         <w:t xml:space="preserve">מרצה: עומרי טנקמן</w:t>
       </w:r>
@@ -152,6 +157,7 @@
           <w:sz w:val="24"/>
           <w:szCs w:val="24"/>
           <w:rtl/>
+          <w:lang w:val="he-IL" w:bidi="he-IL"/>
         </w:rPr>
         <w:t xml:space="preserve"/>
       </w:r>
@@ -166,6 +172,7 @@
           <w:sz w:val="24"/>
           <w:szCs w:val="24"/>
           <w:rtl/>
+          <w:lang w:val="he-IL" w:bidi="he-IL"/>
         </w:rPr>
         <w:t xml:space="preserve"/>
       </w:r>
@@ -186,6 +193,7 @@
           <w:sz w:val="24"/>
           <w:szCs w:val="24"/>
           <w:rtl/>
+          <w:lang w:val="he-IL" w:bidi="he-IL"/>
         </w:rPr>
         <w:t xml:space="preserve">הצעת מחקר לעבודת סמינריון</w:t>
       </w:r>
@@ -200,6 +208,7 @@
           <w:sz w:val="24"/>
           <w:szCs w:val="24"/>
           <w:rtl/>
+          <w:lang w:val="he-IL" w:bidi="he-IL"/>
         </w:rPr>
         <w:t xml:space="preserve"/>
       </w:r>
@@ -218,6 +227,7 @@
           <w:sz w:val="32"/>
           <w:szCs w:val="32"/>
           <w:rtl/>
+          <w:lang w:val="he-IL" w:bidi="he-IL"/>
         </w:rPr>
         <w:t xml:space="preserve">חוויותיהן של אימהות לילדים עם מוגבלות בחברה הבדואית:</w:t>
       </w:r>
@@ -236,6 +246,7 @@
           <w:sz w:val="32"/>
           <w:szCs w:val="32"/>
           <w:rtl/>
+          <w:lang w:val="he-IL" w:bidi="he-IL"/>
         </w:rPr>
         <w:t xml:space="preserve">בין מסורת לשילוב במערכת החינוך ובקהילה</w:t>
       </w:r>
@@ -250,6 +261,7 @@
           <w:sz w:val="24"/>
           <w:szCs w:val="24"/>
           <w:rtl/>
+          <w:lang w:val="he-IL" w:bidi="he-IL"/>
         </w:rPr>
         <w:t xml:space="preserve"/>
       </w:r>
@@ -264,6 +276,7 @@
           <w:sz w:val="24"/>
           <w:szCs w:val="24"/>
           <w:rtl/>
+          <w:lang w:val="he-IL" w:bidi="he-IL"/>
         </w:rPr>
         <w:t xml:space="preserve"/>
       </w:r>
@@ -278,6 +291,7 @@
           <w:sz w:val="24"/>
           <w:szCs w:val="24"/>
           <w:rtl/>
+          <w:lang w:val="he-IL" w:bidi="he-IL"/>
         </w:rPr>
         <w:t xml:space="preserve"/>
       </w:r>
@@ -298,6 +312,7 @@
           <w:sz w:val="24"/>
           <w:szCs w:val="24"/>
           <w:rtl/>
+          <w:lang w:val="he-IL" w:bidi="he-IL"/>
         </w:rPr>
         <w:t xml:space="preserve">מגישים:</w:t>
       </w:r>
@@ -318,6 +333,7 @@
           <w:sz w:val="24"/>
           <w:szCs w:val="24"/>
           <w:rtl/>
+          <w:lang w:val="he-IL" w:bidi="he-IL"/>
         </w:rPr>
         <w:t xml:space="preserve">סולימאן אבו חמיד, ת.ז. 066127135</w:t>
       </w:r>
@@ -338,6 +354,7 @@
           <w:sz w:val="24"/>
           <w:szCs w:val="24"/>
           <w:rtl/>
+          <w:lang w:val="he-IL" w:bidi="he-IL"/>
         </w:rPr>
         <w:t xml:space="preserve">ג'ואהר אבו גאנם, ת.ז. 212555130</w:t>
       </w:r>
@@ -352,6 +369,7 @@
           <w:sz w:val="24"/>
           <w:szCs w:val="24"/>
           <w:rtl/>
+          <w:lang w:val="he-IL" w:bidi="he-IL"/>
         </w:rPr>
         <w:t xml:space="preserve"/>
       </w:r>
@@ -366,6 +384,7 @@
           <w:sz w:val="24"/>
           <w:szCs w:val="24"/>
           <w:rtl/>
+          <w:lang w:val="he-IL" w:bidi="he-IL"/>
         </w:rPr>
         <w:t xml:space="preserve"/>
       </w:r>
@@ -386,6 +405,7 @@
           <w:sz w:val="24"/>
           <w:szCs w:val="24"/>
           <w:rtl/>
+          <w:lang w:val="he-IL" w:bidi="he-IL"/>
         </w:rPr>
         <w:t xml:space="preserve">אלול תשפ"ו, ספטמבר 2026</w:t>
       </w:r>
@@ -404,6 +424,7 @@
           <w:sz w:val="32"/>
           <w:szCs w:val="32"/>
           <w:rtl/>
+          <w:lang w:val="he-IL" w:bidi="he-IL"/>
         </w:rPr>
         <w:t xml:space="preserve">תוכן עניינים</w:t>
       </w:r>
@@ -443,6 +464,7 @@
           <w:sz w:val="24"/>
           <w:szCs w:val="24"/>
           <w:rtl/>
+          <w:lang w:val="he-IL" w:bidi="he-IL"/>
         </w:rPr>
         <w:t xml:space="preserve">(תוכן העניינים מתעדכן אוטומטית: לחיצה ימנית על הרשימה ובחירה ב"עדכן שדה", או F9)</w:t>
       </w:r>
@@ -462,6 +484,7 @@
           <w:sz w:val="32"/>
           <w:szCs w:val="32"/>
           <w:rtl/>
+          <w:lang w:val="he-IL" w:bidi="he-IL"/>
         </w:rPr>
         <w:t xml:space="preserve">1. מבוא</w:t>
       </w:r>
@@ -482,6 +505,7 @@
           <w:sz w:val="24"/>
           <w:szCs w:val="24"/>
           <w:rtl/>
+          <w:lang w:val="he-IL" w:bidi="he-IL"/>
         </w:rPr>
         <w:t xml:space="preserve">החברה הבדואית בנגב מונה כיום כ-300 אלף נפש, ויותר ממחציתם ילדים. יישוביה נמצאים באשכולות החברתיים-כלכליים הנמוכים ביותר במדינה, ומערכת החינוך שלה סובלת מפערי תשתית, ממחסור בכיתות ובאנשי מקצוע ומהישגים נמוכים באופן עקבי ביחס לממוצע הארצי (אבו סעד, 2023). לתוך המציאות הזאת נכנס בשנת 2018 תיקון מס' 11 לחוק חינוך מיוחד, שהעביר להורים את זכות הבחירה בין מסגרת של חינוך מיוחד לבין שילוב בחינוך הרגיל, וקבע שהתקציב ילווה את הילד ולא את המסגרת (חוק חינוך מיוחד (תיקון מס' 11), התשע"ח-2018). המדיניות החדשה מניחה הורה מיודע, נגיש למידע ומסוגל לעמוד מול ועדה מקצועית. בחברה הבדואית הנחה זו אינה מובנת מאליה.</w:t>
       </w:r>
@@ -502,6 +526,7 @@
           <w:sz w:val="24"/>
           <w:szCs w:val="24"/>
           <w:rtl/>
+          <w:lang w:val="he-IL" w:bidi="he-IL"/>
         </w:rPr>
         <w:t xml:space="preserve">המחקר הארצי על ילדים עם מוגבלות בישראל מצא כי ילדים מהחברה הערבית מיוצגים ביתר בקרב הילדים עם מוגבלות, וכי משפחותיהם משתמשות פחות בשירותים ומדווחות על חסמים רבים יותר בדרך אליהם (ברלב ואחרים, 2021). בחברה הבדואית מצטרפים לכך תפיסות מסורתיות של מוגבלות, סטיגמה שנדבקת גם להורים, ומעמד הנשים, שמגביל את תנועתן במרחב הציבורי ואת השתתפותן בקבלת החלטות (Manor-Binyamini &amp; Shoshana, 2018). האם היא לרוב המטפלת העיקרית בילד. היא זו שפוגשת את הגננת, את המורה ואת ועדת הזכאות, וזו שנושאת בעיקר המחיר הרגשי. ובכל זאת קולה נשמע מעט במחקר על שילוב.</w:t>
       </w:r>
@@ -522,6 +547,7 @@
           <w:sz w:val="24"/>
           <w:szCs w:val="24"/>
           <w:rtl/>
+          <w:lang w:val="he-IL" w:bidi="he-IL"/>
         </w:rPr>
         <w:t xml:space="preserve">רוב המחקר על אימהות בדואיות לילדים עם מוגבלות נעשה בגישה כמותית ובחן מצוקה, דיכאון ותמיכה חברתית (Benatov et al., 2022; Manor-Binyamini et al., 2020). המחקרים האיכותניים המעטים התמקדו בסוג מוגבלות אחד, אוטיזם או לקות שמיעה, ונערכו ברובם לפני שהתיקון לחוק יושם בשטח (Allassad Alhuzail &amp; Levinger, 2021; Manor-Binyamini &amp; Shoshana, 2018). על תפיסת השילוב עצמו, כלומר על האופן שבו אימהות בדואיות מבינות את המפגש בין ילדן לבין בית הספר והקהילה, ידוע מעט.</w:t>
       </w:r>
@@ -542,6 +568,7 @@
           <w:sz w:val="24"/>
           <w:szCs w:val="24"/>
           <w:rtl/>
+          <w:lang w:val="he-IL" w:bidi="he-IL"/>
         </w:rPr>
         <w:t xml:space="preserve">המחקר המוצע מבקש למלא פער זה. מטרתו לתאר ולהבין, מנקודת מבטן של אימהות בדואיות בנגב, את תהליך השילוב של ילדן עם מוגבלות במסגרות החינוך ובקהילה. שאלת המחקר המרכזית היא: כיצד תופסות אימהות בחברה הבדואית את תהליך השילוב של ילדן עם מוגבלות בתוך מסגרות החינוך והקהילה? המחקר ייערך בגישה איכותנית, באמצעות ראיונות עומק חצי-מובנים, והנתונים ינותחו בניתוח תמטי.</w:t>
       </w:r>
@@ -562,6 +589,7 @@
           <w:sz w:val="24"/>
           <w:szCs w:val="24"/>
           <w:rtl/>
+          <w:lang w:val="he-IL" w:bidi="he-IL"/>
         </w:rPr>
         <w:t xml:space="preserve">ההצעה בנויה כך: פרק סקירת הספרות מציג את ההקשר החברתי והחינוכי של החברה הבדואית, את התפיסות התרבותיות של מוגבלות, את הידוע על אימהות בדואיות לילדים עם מוגבלות ואת מדיניות השילוב וההכלה. אחריו מוצגות שאלת המחקר ומטרותיו, פרק המתודולוגיה, התרומה הצפויה ולוח זמנים. מדריך הריאיון בעברית ובערבית וטיוטת טופס הסכמה מצורפים כנספחים.</w:t>
       </w:r>
@@ -581,6 +609,7 @@
           <w:sz w:val="32"/>
           <w:szCs w:val="32"/>
           <w:rtl/>
+          <w:lang w:val="he-IL" w:bidi="he-IL"/>
         </w:rPr>
         <w:t xml:space="preserve">2. סקירת ספרות</w:t>
       </w:r>
@@ -600,6 +629,7 @@
           <w:sz w:val="28"/>
           <w:szCs w:val="28"/>
           <w:rtl/>
+          <w:lang w:val="he-IL" w:bidi="he-IL"/>
         </w:rPr>
         <w:t xml:space="preserve">2.1 החברה הבדואית בנגב: הקשר חברתי, תרבותי וחינוכי</w:t>
       </w:r>
@@ -620,6 +650,7 @@
           <w:sz w:val="24"/>
           <w:szCs w:val="24"/>
           <w:rtl/>
+          <w:lang w:val="he-IL" w:bidi="he-IL"/>
         </w:rPr>
         <w:t xml:space="preserve">החברה הבדואית בנגב עברה בתוך שני דורות ממחיה נוודית למחצה להתיישבות קבע, חלקה בעיירות שהקימה המדינה וחלקה בכפרים שאינם מוכרים ואינם מחוברים לתשתיות בסיסיות. המבנה החברתי נותר שבטי ופטריארכלי, והמשפחה המורחבת היא היחידה שבה מתקבלות החלטות רבות הנוגעות לפרט (אלאסד-אלהוזייל, 2016). אבו סעד (2023) מתאר מערכת חינוך שגדלה במהירות, יותר ממאה אלף תלמידים בשנת הלימודים תשפ"א, אך נותרה מאחור בתשתיות, באיכות בתי הספר ובהישגים. הוא מצביע גם על היעדר שליטה מקומית ביעדי החינוך ובתוכני הלימוד, ועל השלכותיו של מצב זה על אמון הקהילה במערכת.</w:t>
       </w:r>
@@ -640,6 +671,7 @@
           <w:sz w:val="24"/>
           <w:szCs w:val="24"/>
           <w:rtl/>
+          <w:lang w:val="he-IL" w:bidi="he-IL"/>
         </w:rPr>
         <w:t xml:space="preserve">לנשים הבדואיות מקום מיוחד בתמונה זו. אלאסד-אלהוזייל (2016), חוקרת בדואית שראיינה נשים משלושה דורות, מראה כיצד השינויים בדפוסי המגורים והתעסוקה שינו את משמעות הבית בחיי הנשים, והוא נעשה בו זמנית ממלכה פרטית ומרחב סגור. מחקר על אימהות לילדים עם אוטיזם מתאר מציאות שבה יציאה מהבית לפגישה בבית הספר או במרכז להתפתחות הילד מותנית בליווי של גבר מהמשפחה, ושבה איום בגירושין או בנישואין לאישה נוספת מרחף מעל היחסים הזוגיים. מנור-בנימיני ושושנה (Manor-Binyamini &amp; Shoshana, 2018) כינו זאת "הדרה בתוך הדרה": הדרה של האם כאישה בדואית בתוך הדרה של הקהילה כולה.</w:t>
       </w:r>
@@ -659,6 +691,7 @@
           <w:sz w:val="28"/>
           <w:szCs w:val="28"/>
           <w:rtl/>
+          <w:lang w:val="he-IL" w:bidi="he-IL"/>
         </w:rPr>
         <w:t xml:space="preserve">2.2 מוגבלות בעיני התרבות: דת, סטיגמה ופוליגמיה</w:t>
       </w:r>
@@ -679,6 +712,7 @@
           <w:sz w:val="24"/>
           <w:szCs w:val="24"/>
           <w:rtl/>
+          <w:lang w:val="he-IL" w:bidi="he-IL"/>
         </w:rPr>
         <w:t xml:space="preserve">תפיסת המוגבלות בחברה הבדואית נעה בין שני קטבים. מצד אחד, השיח הדתי מספק לאימהות מסגרת של משמעות. הילד נתפס כניסיון מאלוהים או כמתנה, וקבלת הדין נחווית ככוח. בהשוואה בין חמישים אימהות בדואיות ל-72 אימהות יהודיות לילדים עם צרכים מיוחדים נמצא שהאימהות הבדואיות עיבדו את חוויותיהן בעיקר במישור הדתי, סביב סמכות והשלמה עם רצון האל, ואילו האימהות היהודיות הרבו לדבר על אשמה. עוד נמצא שחוסר ידע ומיומנות נחווה אצל האימהות הבדואיות כגורם לחץ, בעוד אצל האימהות היהודיות תחושת מיומנות שימשה משאב חוסן (Barak-Levy &amp; Paryente, 2024).</w:t>
       </w:r>
@@ -699,6 +733,7 @@
           <w:sz w:val="24"/>
           <w:szCs w:val="24"/>
           <w:rtl/>
+          <w:lang w:val="he-IL" w:bidi="he-IL"/>
         </w:rPr>
         <w:t xml:space="preserve">בהמשך לכך, מחקר משולב שיטות בקרב ארבעים אימהות בדואיות לילדים עם אוטיזם או עם מוגבלות שכלית התפתחותית זיהה שתי עמדות דתיות שונות כלפי המוגבלות: עמדה פסימית, שרואה בה עונש משמיים ומלווה בהלם, בפחד ובצער, ועמדה אופטימית, שרואה בה מתנה או ניסיון של אהבה. אחת האימהות ניסחה זאת במילים "אלוהים נתן לי את הילד הזה מתוך אהבתו הרבה אליי". השילוב בין העמדה הדתית לעמדה הרגשית של האם עיצב את דרך ההתמודדות שלה עם המוגבלות ועם המערכות שסביבה (פריינטה וברק לוי, 2025). ממצא זה מחדד את הצורך לשאול את האימהות עצמן מה המשמעות שהן מייחסות למוגבלות, לפני שמניחים שהדת פועלת בכיוון אחד בלבד.</w:t>
       </w:r>
@@ -719,6 +754,7 @@
           <w:sz w:val="24"/>
           <w:szCs w:val="24"/>
           <w:rtl/>
+          <w:lang w:val="he-IL" w:bidi="he-IL"/>
         </w:rPr>
         <w:t xml:space="preserve">מצד שני, הסטיגמה חזקה ונדבקת גם להורים. אצל אימהות בדואיות לילדים צעירים עם מוגבלות התפתחותית נמצא קשר בין סטיגמה נתפסת לבין איכות חיים נמוכה, וקשר בין שני אלה לבין מידת שיתוף הפעולה של האם עם אנשי המקצוע (Manor-Binyamini &amp; Schreiber-Divon, 2021). ממצא זה נוגע ישירות למחקר על שילוב, משום שהוא מרמז שהסטיגמה אינה רק חוויה פנימית אלא גם מנגנון שמרחיק את האם מהמערכת שאמורה לסייע לילדה.</w:t>
       </w:r>
@@ -739,6 +775,7 @@
           <w:sz w:val="24"/>
           <w:szCs w:val="24"/>
           <w:rtl/>
+          <w:lang w:val="he-IL" w:bidi="he-IL"/>
         </w:rPr>
         <w:t xml:space="preserve">הסטיגמה מקבלת ביטוי חד במיוחד בקשר שבין הולדת ילד עם מוגבלות לבין פוליגמיה. עשרים אימהות בדואיות שומעות לילדים עם לקות שמיעה תיארו את החברה כחסם ולא כמשאב, וחלקן קשרו במפורש בין לידת הילד לבין החלטת הבעל לשאת אישה שנייה (Allassad Alhuzail &amp; Levinger, 2021). האשמה מופנית אל האם, לא אל הגורם הרפואי.</w:t>
       </w:r>
@@ -759,6 +796,7 @@
           <w:sz w:val="24"/>
           <w:szCs w:val="24"/>
           <w:rtl/>
+          <w:lang w:val="he-IL" w:bidi="he-IL"/>
         </w:rPr>
         <w:t xml:space="preserve">לצד כל אלה, גם המצוקה הנפשית של האימהות נותרת לעיתים ללא מענה. מחקר איכותני בקרב בדואים בנגב מצא אוריינות נמוכה בבריאות הנפש, נטייה לפנות תחילה למשפחה ולמרפאים מסורתיים, וחשדנות כלפי שירותים ממוסדים (Abo-Rass et al., 2024). המשמעות היא שאם שמתקשה לשאת את הנטל אינה בהכרח מאותרת, ואינה בהכרח מקבלת עזרה.</w:t>
       </w:r>
@@ -778,6 +816,7 @@
           <w:sz w:val="28"/>
           <w:szCs w:val="28"/>
           <w:rtl/>
+          <w:lang w:val="he-IL" w:bidi="he-IL"/>
         </w:rPr>
         <w:t xml:space="preserve">2.3 אימהות בדואיות לילדים עם מוגבלות: נטל, מצוקה, תמיכה והתמודדות</w:t>
       </w:r>
@@ -798,6 +837,7 @@
           <w:sz w:val="24"/>
           <w:szCs w:val="24"/>
           <w:rtl/>
+          <w:lang w:val="he-IL" w:bidi="he-IL"/>
         </w:rPr>
         <w:t xml:space="preserve">סדרת מחקרים כמותיים ציירה תמונה עקבית של נטל. בהשוואה בין 95 אימהות בדואיות למתבגרים עם ובלי מוגבלות התפתחותית נמצא שהאימהות לילדים עם מוגבלות דיווחו על יותר דיכאון, יותר תסמינים סומטיים ופחות תמיכה חברתית. תמיכה חברתית הפחיתה דיכאון בקרב אימהות לילדים עם התפתחות טיפוסית, אך לא בקרב אימהות לילדים עם מוגבלות (Manor-Binyamini et al., 2020). באותו מדגם נמצאה שכיחות גבוהה של דיכאון חמור, ונטייה של האימהות לילדים עם מוגבלות להשתמש יותר בהתמודדות נמנעת (Benatov et al., 2022).</w:t>
       </w:r>
@@ -818,6 +858,7 @@
           <w:sz w:val="24"/>
           <w:szCs w:val="24"/>
           <w:rtl/>
+          <w:lang w:val="he-IL" w:bidi="he-IL"/>
         </w:rPr>
         <w:t xml:space="preserve">המחקר האיכותני מוסיף לתמונה הזאת את צד החוויה. שמונה-עשרה אימהות לילדים עם אוטיזם, מיישובים מוכרים ולא מוכרים, דיברו על בדידות, על מחסור במידע ועל הדרה מקבלת החלטות הנוגעות לילדן, בבית ובמוסדות (Manor-Binyamini &amp; Shoshana, 2018). המחסור במידע חוזר גם אצל אימהות לילדים עם לקות שמיעה, שתיארו כיצד תפיסתן את המוגבלות של ילדן עיצבה את יחסן למסגרות החינוך שהוצעו להן ואת החלטת ההשמה (Allassad Alhuzail &amp; Levinger, 2018).</w:t>
       </w:r>
@@ -838,6 +879,7 @@
           <w:sz w:val="24"/>
           <w:szCs w:val="24"/>
           <w:rtl/>
+          <w:lang w:val="he-IL" w:bidi="he-IL"/>
         </w:rPr>
         <w:t xml:space="preserve">התמונה אינה רק של מצוקה. בקרב הורים ישראלים לילדים עם מוגבלויות נמצא שתקווה קשורה לצמיחה אישית ומתווכת בין לחץ נתפס לצמיחה, קשר שהיה ייחודי להורים לילדים עם מוגבלות ולא נמצא בקבוצת ההשוואה (גור ואחרים, 2022). גם אצל האימהות הבדואיות במחקרן של ברק-לוי ופריינטה (Barak-Levy &amp; Paryente, 2024) נמצאו דפוסי עיבוד מעצימים לצד דפוסים מחלישים. מחקר שמקשיב לאימהות צריך אפוא להשאיר מקום לשני הצדדים.</w:t>
       </w:r>
@@ -857,6 +899,7 @@
           <w:sz w:val="28"/>
           <w:szCs w:val="28"/>
           <w:rtl/>
+          <w:lang w:val="he-IL" w:bidi="he-IL"/>
         </w:rPr>
         <w:t xml:space="preserve">2.4 שילוב והכלה: מדיניות, בית ספר והורים</w:t>
       </w:r>
@@ -877,6 +920,7 @@
           <w:sz w:val="24"/>
           <w:szCs w:val="24"/>
           <w:rtl/>
+          <w:lang w:val="he-IL" w:bidi="he-IL"/>
         </w:rPr>
         <w:t xml:space="preserve">תיקון מס' 11 לחוק חינוך מיוחד קבע שההורים הם שבוחרים את סוג המסגרת, שהזכאות נקבעת בוועדת זכאות ואפיון, ושהמשאבים מלווים את התלמיד (חוק חינוך מיוחד (תיקון מס' 11), התשע"ח-2018). המהלך מבטא מעבר מתפיסה של שילוב, שבה הילד מותאם למערכת, לתפיסה של הכלה, שבה המערכת מתאימה את עצמה לילד. הצלחתו תלויה בשני צדדים: בהורים שיודעים לבחור ובבתי ספר שיודעים להכיל.</w:t>
       </w:r>
@@ -897,6 +941,7 @@
           <w:sz w:val="24"/>
           <w:szCs w:val="24"/>
           <w:rtl/>
+          <w:lang w:val="he-IL" w:bidi="he-IL"/>
         </w:rPr>
         <w:t xml:space="preserve">מחקר ארצי שבחן כיצד הורים בוחרים בפועל מסגרת לילדם הזכאי לשירותי חינוך מיוחדים מצא שהשיקולים המרכזיים הם זמינות התמיכות והשירותים, גודל הכיתה, גישת הצוות ויכולתו להכיל, לצד מאפייני המשפחה והילד. בחברה הערבית נמצא שיעור גבוה יותר של תלמידים המשולבים בכיתות רגילות, אך המחקר מייחס זאת בעיקר למחסור במסגרות ייעודיות ולא לבחירה מודעת, וממליץ להעמיק את המידע שבידי ההורים הערבים כדי שהבחירה תנבע מהבנה ולא מהיעדר ברירה (נמר פורסטנברג ואחרים, 2024). ממצא זה מציב סימן שאלה על עצם המושג "בחירה הורית" בהקשר הבדואי.</w:t>
       </w:r>
@@ -917,6 +962,7 @@
           <w:sz w:val="24"/>
           <w:szCs w:val="24"/>
           <w:rtl/>
+          <w:lang w:val="he-IL" w:bidi="he-IL"/>
         </w:rPr>
         <w:t xml:space="preserve">מה חושבים הורים בחברה הערבית על הצד שלהם במשוואה? בראיונות עם עשרים הורים לילדים עם צרכים חינוכיים מיוחדים בחברה הערבית בישראל עלו שש קטגוריות: הורות, למידה בבית, תקשורת עם בית הספר, התנדבות, שיתוף ההורים בקבלת החלטות הנוגעות לילדם, ועמדות המורים כלפי הילדים. ההורים תיארו תקשורת דלה ותחושה שההחלטות מתקבלות בלעדיהם (Jorban et al., 2024). המחקר לא הבחין בין אוכלוסיות שונות בתוך החברה הערבית, ולא בין אימהות לאבות.</w:t>
       </w:r>
@@ -937,6 +983,7 @@
           <w:sz w:val="24"/>
           <w:szCs w:val="24"/>
           <w:rtl/>
+          <w:lang w:val="he-IL" w:bidi="he-IL"/>
         </w:rPr>
         <w:t xml:space="preserve">ומה חושבים המורים? חמישה-עשר מורים בדואים בבתי ספר משלבים תיארו מחויבות עמוקה לשילוב חברתי של תלמידים עם מוגבלות, "בכל מחיר" בלשון החוקרים, לצד תסכול מהיעדר מערכות תמיכה ושעות פרטניות שיאפשרו מענה לימודי ממשי (Abu-Gweder et al., 2026). בצד של בית הספר קיימת אפוא נכונות, אך היא נשענת על אתוס קהילתי יותר מאשר על משאבים.</w:t>
       </w:r>
@@ -957,6 +1004,7 @@
           <w:sz w:val="24"/>
           <w:szCs w:val="24"/>
           <w:rtl/>
+          <w:lang w:val="he-IL" w:bidi="he-IL"/>
         </w:rPr>
         <w:t xml:space="preserve">בין ההורים למורים עומדת שאלת שיתוף הפעולה. אצל אימהות בדואיות נמצא ששיתוף הפעולה עם אנשי מקצוע נמוך יותר ככל שהסטיגמה גבוהה יותר ואיכות החיים נמוכה יותר (Manor-Binyamini &amp; Schreiber-Divon, 2021). לכך מצטרפים חסמים מעשיים: מרחק, הסעות, השפה שבה מתנהלות הוועדות, והיעדר ליווי של גבר מהמשפחה לפגישות מחוץ לבית (Manor-Binyamini &amp; Shoshana, 2018).</w:t>
       </w:r>
@@ -976,6 +1024,7 @@
           <w:sz w:val="28"/>
           <w:szCs w:val="28"/>
           <w:rtl/>
+          <w:lang w:val="he-IL" w:bidi="he-IL"/>
         </w:rPr>
         <w:t xml:space="preserve">2.5 סיכום הסקירה ופער הידע</w:t>
       </w:r>
@@ -996,6 +1045,7 @@
           <w:sz w:val="24"/>
           <w:szCs w:val="24"/>
           <w:rtl/>
+          <w:lang w:val="he-IL" w:bidi="he-IL"/>
         </w:rPr>
         <w:t xml:space="preserve">הספרות מתעדת היטב את הנטל הרגשי של אימהות בדואיות לילדים עם מוגבלות, את הסטיגמה ואת מעמדן המוגבל. היא מתעדת גם, בנפרד, את עמדות ההורים בחברה הערבית ואת עמדות המורים הבדואים כלפי שילוב. אבל שלוש חוליות חסרות. ראשית, המחקרים על אימהות בדואיות התמקדו בסוג מוגבלות אחד או בהתמודדות הרגשית והדתית, ולא בשאלת השילוב עצמה. שנית, מחקר ההורים בחברה הערבית לא התייחס לחברה הבדואית ולא לאימהות כקבוצה נפרדת. שלישית, כמעט כל הנתונים נאספו לפני שתיקון 11 הפך למציאות היומיומית של ועדות הזכאות ובתי הספר. המחקר המוצע פונה לאימהות עצמן ושואל כיצד הן מבינות את השילוב, בבית הספר ובקהילה, מתוך עולמן התרבותי.</w:t>
       </w:r>
@@ -1015,6 +1065,7 @@
           <w:sz w:val="32"/>
           <w:szCs w:val="32"/>
           <w:rtl/>
+          <w:lang w:val="he-IL" w:bidi="he-IL"/>
         </w:rPr>
         <w:t xml:space="preserve">3. שאלת המחקר ומטרותיו</w:t>
       </w:r>
@@ -1035,6 +1086,7 @@
           <w:sz w:val="24"/>
           <w:szCs w:val="24"/>
           <w:rtl/>
+          <w:lang w:val="he-IL" w:bidi="he-IL"/>
         </w:rPr>
         <w:t xml:space="preserve">שאלת המחקר המרכזית: </w:t>
       </w:r>
@@ -1048,6 +1100,7 @@
           <w:sz w:val="24"/>
           <w:szCs w:val="24"/>
           <w:rtl/>
+          <w:lang w:val="he-IL" w:bidi="he-IL"/>
         </w:rPr>
         <w:t xml:space="preserve">כיצד תופסות אימהות בחברה הבדואית את תהליך השילוב של ילדן עם מוגבלות בתוך מסגרות החינוך והקהילה?</w:t>
       </w:r>
@@ -1069,6 +1122,7 @@
           <w:sz w:val="24"/>
           <w:szCs w:val="24"/>
           <w:rtl/>
+          <w:lang w:val="he-IL" w:bidi="he-IL"/>
         </w:rPr>
         <w:t xml:space="preserve">שאלות משנה:</w:t>
       </w:r>
@@ -1094,6 +1148,7 @@
           <w:sz w:val="24"/>
           <w:szCs w:val="24"/>
           <w:rtl/>
+          <w:lang w:val="he-IL" w:bidi="he-IL"/>
         </w:rPr>
         <w:t xml:space="preserve">כיצד חוו האימהות את תהליך קביעת המסגרת החינוכית לילדן, ומה היה חלקן בהחלטה?</w:t>
       </w:r>
@@ -1119,6 +1174,7 @@
           <w:sz w:val="24"/>
           <w:szCs w:val="24"/>
           <w:rtl/>
+          <w:lang w:val="he-IL" w:bidi="he-IL"/>
         </w:rPr>
         <w:t xml:space="preserve">כיצד הן מתארות את הקשר היומיומי עם הצוות החינוכי, ומה מקדם או מעכב אותו?</w:t>
       </w:r>
@@ -1144,6 +1200,7 @@
           <w:sz w:val="24"/>
           <w:szCs w:val="24"/>
           <w:rtl/>
+          <w:lang w:val="he-IL" w:bidi="he-IL"/>
         </w:rPr>
         <w:t xml:space="preserve">כיצד הן תופסות את יחס המשפחה המורחבת והקהילה לילד ולשילובו, ואיזה מקום יש למסורת ולדת בתפיסה זו?</w:t>
       </w:r>
@@ -1169,6 +1226,7 @@
           <w:sz w:val="24"/>
           <w:szCs w:val="24"/>
           <w:rtl/>
+          <w:lang w:val="he-IL" w:bidi="he-IL"/>
         </w:rPr>
         <w:t xml:space="preserve">אילו חסמים ואילו משאבי תמיכה הן מזהות, ומה לדעתן צריך להשתנות?</w:t>
       </w:r>
@@ -1190,6 +1248,7 @@
           <w:sz w:val="24"/>
           <w:szCs w:val="24"/>
           <w:rtl/>
+          <w:lang w:val="he-IL" w:bidi="he-IL"/>
         </w:rPr>
         <w:t xml:space="preserve">מטרות המחקר:</w:t>
       </w:r>
@@ -1215,6 +1274,7 @@
           <w:sz w:val="24"/>
           <w:szCs w:val="24"/>
           <w:rtl/>
+          <w:lang w:val="he-IL" w:bidi="he-IL"/>
         </w:rPr>
         <w:t xml:space="preserve">לתת קול לאימהות בדואיות בשיח המחקרי והמקצועי על שילוב והכלה.</w:t>
       </w:r>
@@ -1240,6 +1300,7 @@
           <w:sz w:val="24"/>
           <w:szCs w:val="24"/>
           <w:rtl/>
+          <w:lang w:val="he-IL" w:bidi="he-IL"/>
         </w:rPr>
         <w:t xml:space="preserve">למפות חסמים ומשאבי תמיכה כפי שהם נחווים מבפנים, במקום כפי שהמערכת מגדירה אותם.</w:t>
       </w:r>
@@ -1265,6 +1326,7 @@
           <w:sz w:val="24"/>
           <w:szCs w:val="24"/>
           <w:rtl/>
+          <w:lang w:val="he-IL" w:bidi="he-IL"/>
         </w:rPr>
         <w:t xml:space="preserve">לגזור המלצות יישומיות לצוותים חינוכיים, לעובדים סוציאליים ולקובעי מדיניות בחינוך הבדואי.</w:t>
       </w:r>
@@ -1284,6 +1346,7 @@
           <w:sz w:val="32"/>
           <w:szCs w:val="32"/>
           <w:rtl/>
+          <w:lang w:val="he-IL" w:bidi="he-IL"/>
         </w:rPr>
         <w:t xml:space="preserve">4. מתודולוגיה</w:t>
       </w:r>
@@ -1303,6 +1366,7 @@
           <w:sz w:val="28"/>
           <w:szCs w:val="28"/>
           <w:rtl/>
+          <w:lang w:val="he-IL" w:bidi="he-IL"/>
         </w:rPr>
         <w:t xml:space="preserve">4.1 גישת המחקר</w:t>
       </w:r>
@@ -1323,6 +1387,7 @@
           <w:sz w:val="24"/>
           <w:szCs w:val="24"/>
           <w:rtl/>
+          <w:lang w:val="he-IL" w:bidi="he-IL"/>
         </w:rPr>
         <w:t xml:space="preserve">המחקר ייערך בגישה איכותנית, בפרדיגמה פנומנולוגית-פרשנית. גישה זו מתאימה כאשר המטרה היא להבין חוויה חיה ואת המשמעות שמייחסים לה בני האדם שחוו אותה, ולא למדוד משתנים מוגדרים מראש (Creswell &amp; Poth, 2018; שקדי, 2003). הבחירה בגישה זו נובעת משלושה שיקולים. האוכלוסייה הנחקרת כמעט אינה נשמעת במחקר ובשיח הציבורי, ולכן יש ערך לתיאור עשיר של עולמה במילותיה שלה. המשמעות של "שילוב" ושל "מוגבלות" תלויה בהקשר תרבותי, ואי אפשר להניח מראש שהמושגים המקצועיים תואמים את תפיסת האימהות. ולבסוף, המחקרים האיכותניים הקודמים על אימהות בדואיות (Allassad Alhuzail &amp; Levinger, 2021; Manor-Binyamini &amp; Shoshana, 2018) הראו שראיונות עומק מאפשרים לחשוף ממדים שנעלמו מהמחקר הכמותי, כמו הקשר בין המוגבלות לפוליגמיה או ההדרה מקבלת החלטות.</w:t>
       </w:r>
@@ -1342,6 +1407,7 @@
           <w:sz w:val="28"/>
           <w:szCs w:val="28"/>
           <w:rtl/>
+          <w:lang w:val="he-IL" w:bidi="he-IL"/>
         </w:rPr>
         <w:t xml:space="preserve">4.2 משתתפות המחקר</w:t>
       </w:r>
@@ -1362,6 +1428,7 @@
           <w:sz w:val="24"/>
           <w:szCs w:val="24"/>
           <w:rtl/>
+          <w:lang w:val="he-IL" w:bidi="he-IL"/>
         </w:rPr>
         <w:t xml:space="preserve">במחקר ישתתפו 10 עד 12 אימהות בדואיות מהנגב. קריטריוני ההכללה: אם לילד או ילדה בגילאי 6 עד 14 עם מוגבלות מאובחנת (התפתחותית, שכלית, אוטיזם, חושית או פיזית), שהילד לומד במסגרת חינוכית כלשהי: כיתה רגילה עם תמיכה, כיתה מיוחדת בבית ספר רגיל, או בית ספר לחינוך מיוחד, ושהחלטת ההשמה האחרונה התקבלה בשלוש השנים האחרונות, כך שהאם התנסתה בוועדת זכאות ואפיון לפי החוק המתוקן. יושם דגש על מגוון: יישובים מוכרים לצד כפרים לא מוכרים, סוגי מוגבלות שונים, סוגי מסגרות שונים ורמות השכלה שונות של האם.</w:t>
       </w:r>
@@ -1382,6 +1449,7 @@
           <w:sz w:val="24"/>
           <w:szCs w:val="24"/>
           <w:rtl/>
+          <w:lang w:val="he-IL" w:bidi="he-IL"/>
         </w:rPr>
         <w:t xml:space="preserve">הדגימה תהיה מכוונת ובשיטת כדור השלג. הפנייה הראשונית תיעשה דרך שומרי סף מהקהילה: מרכזים להתפתחות הילד, מרכזי תמיכה יישוביים-אזוריים (מתי"א), מחלקות הרווחה ועמותות נשים בדואיות. מספר המשתתפות הסופי ייקבע לפי עקרון הרוויה, כלומר כאשר ראיונות נוספים אינם מעלים תמות חדשות (Creswell &amp; Poth, 2018).</w:t>
       </w:r>
@@ -1401,6 +1469,7 @@
           <w:sz w:val="28"/>
           <w:szCs w:val="28"/>
           <w:rtl/>
+          <w:lang w:val="he-IL" w:bidi="he-IL"/>
         </w:rPr>
         <w:t xml:space="preserve">4.3 כלי המחקר</w:t>
       </w:r>
@@ -1421,6 +1490,7 @@
           <w:sz w:val="24"/>
           <w:szCs w:val="24"/>
           <w:rtl/>
+          <w:lang w:val="he-IL" w:bidi="he-IL"/>
         </w:rPr>
         <w:t xml:space="preserve">כלי המחקר הוא ריאיון עומק חצי-מובנה. מדריך הריאיון (נספח א') נפתח בשאלה פתוחה, "ספרי לי על עצמך", שנועדה לאפשר לאם לבחור מאיפה להתחיל ולבסס אמון לפני שנכנסים לנושאים רגישים. אחריה מגיעות עוד שש-עשרה שאלות פתוחות, שנעות מהילד והאבחון, דרך חיי היומיום ויחס הסביבה, אל בית הספר והשילוב, הקהילה, משאבי התמיכה והמבט לעתיד. המראיינת תשתמש בשאלות הבהרה קצרות, כמו "תוכלי לתת דוגמה?" או "מה הרגשת באותו רגע?", רק כאשר האם לא תרחיב מעצמה. הראיונות ייערכו בערבית, שפת האם של המשתתפות, ולכן מצורף גם נוסח ערבי של המדריך (נספח ב'). המדריך ייבדק בשני ראיונות פיילוט, ונוסח השאלות יתוקן לפי הצורך. בנוסף ימולא שאלון דמוגרפי קצר: גיל, השכלה, תעסוקה, יישוב, מספר ילדים, מבנה המשפחה, גיל הילד וסוג המסגרת.</w:t>
       </w:r>
@@ -1440,6 +1510,7 @@
           <w:sz w:val="28"/>
           <w:szCs w:val="28"/>
           <w:rtl/>
+          <w:lang w:val="he-IL" w:bidi="he-IL"/>
         </w:rPr>
         <w:t xml:space="preserve">4.4 הליך המחקר</w:t>
       </w:r>
@@ -1460,6 +1531,7 @@
           <w:sz w:val="24"/>
           <w:szCs w:val="24"/>
           <w:rtl/>
+          <w:lang w:val="he-IL" w:bidi="he-IL"/>
         </w:rPr>
         <w:t xml:space="preserve">המחקר יחל לאחר קבלת אישור מוועדת האתיקה של המוסד. הקשר עם המשתתפות ייווצר דרך שומרי הסף, שיציגו את המחקר לאימהות ויעבירו לחוקרים רק את פרטיהן של אלה שהביעו עניין. מקום הריאיון ייקבע לפי בחירת האם: ביתה, מרכז קהילתי או מרכז להתפתחות הילד. הריאיון יימשך בין 45 ל-75 דקות ויוקלט באישור האם.</w:t>
       </w:r>
@@ -1480,6 +1552,7 @@
           <w:sz w:val="24"/>
           <w:szCs w:val="24"/>
           <w:rtl/>
+          <w:lang w:val="he-IL" w:bidi="he-IL"/>
         </w:rPr>
         <w:t xml:space="preserve">בהתחשב בנורמות התרבותיות הנוגעות למפגש בין נשים לגברים שאינם בני משפחה, כל הראיונות ייערכו על ידי החוקרת, ג'ואהר אבו גאנם, בערבית. אם תעדיף זאת, תוכל האם להזמין בת משפחה להיות נוכחת. החוקר, סולימאן אבו חמיד, יהיה שותף מלא לבניית המדריך, לניתוח ולכתיבה, אך לא ינכח בראיונות. חלוקה זו אינה רק אילוץ, היא גם תנאי לכך שהאימהות ידברו בחופשיות על נושאים כמו יחסים זוגיים, פוליגמיה ואשמה. הראיונות יתומללו בערבית וינותחו בשפת המקור. ציטוטים נבחרים יתורגמו לעברית, והתרגום ייבדק על ידי עמית דו-לשוני כדי לשמור על משמעות ועל ניואנסים.</w:t>
       </w:r>
@@ -1499,6 +1572,7 @@
           <w:sz w:val="28"/>
           <w:szCs w:val="28"/>
           <w:rtl/>
+          <w:lang w:val="he-IL" w:bidi="he-IL"/>
         </w:rPr>
         <w:t xml:space="preserve">4.5 ניתוח הנתונים</w:t>
       </w:r>
@@ -1519,6 +1593,7 @@
           <w:sz w:val="24"/>
           <w:szCs w:val="24"/>
           <w:rtl/>
+          <w:lang w:val="he-IL" w:bidi="he-IL"/>
         </w:rPr>
         <w:t xml:space="preserve">הנתונים ינותחו בניתוח תמטי לפי שישת השלבים של בראון וקלארק (Braun &amp; Clarke, 2006): היכרות עם החומר באמצעות קריאה חוזרת של התמלילים, יצירת קודים ראשוניים, חיפוש תמות, בחינת התמות מול הקודים ומול כלל החומר, הגדרת התמות ומתן שמות, וכתיבה. הניתוח יהיה אינדוקטיבי בעיקרו, כלומר הקודים יצמחו מהחומר ולא מקטגוריות שנקבעו מראש, אך שאלות המשנה ישמשו מסגרת מארגנת בשלב הדיווח: חסמים, משאבי תמיכה ותפיסות סובייקטיביות של השילוב. הקידוד ייעשה בתוכנת ניתוח איכותני או בגיליון אלקטרוני, ויתועד ביומן ניתוח.</w:t>
       </w:r>
@@ -1538,6 +1613,7 @@
           <w:sz w:val="28"/>
           <w:szCs w:val="28"/>
           <w:rtl/>
+          <w:lang w:val="he-IL" w:bidi="he-IL"/>
         </w:rPr>
         <w:t xml:space="preserve">4.6 אמינות המחקר ומקומם של החוקרים</w:t>
       </w:r>
@@ -1558,6 +1634,7 @@
           <w:sz w:val="24"/>
           <w:szCs w:val="24"/>
           <w:rtl/>
+          <w:lang w:val="he-IL" w:bidi="he-IL"/>
         </w:rPr>
         <w:t xml:space="preserve">אמינות המחקר תיבחן לפי ארבעת הקריטריונים של לינקולן וגובה (Lincoln &amp; Guba, 1985). מהימנות פנימית תובטח באמצעות החזרת סיכום הממצאים לשתיים או שלוש משתתפות לבדיקה, ובאמצעות דיון בקידוד עם עמית. יכולת ההעברה תובטח באמצעות תיאור עשיר של ההקשר ושל המשתתפות. עקביות תובטח באמצעות שמירת שובל ביקורת: תמלילים, טבלאות קידוד ויומן החלטות. ואובייקטיביות, במובנה האיכותני, תובטח באמצעות יומן רפלקסיבי שבו יתעדו החוקרים את הנחותיהם ואת תגובותיהם לאורך המחקר.</w:t>
       </w:r>
@@ -1578,6 +1655,7 @@
           <w:sz w:val="24"/>
           <w:szCs w:val="24"/>
           <w:rtl/>
+          <w:lang w:val="he-IL" w:bidi="he-IL"/>
         </w:rPr>
         <w:t xml:space="preserve">לחוקרים, כבני החברה הערבית, יש עמדה של "מבפנים ומבחוץ": קרבה תרבותית ולשונית שמקלה על יצירת אמון, ובה בעת ריחוק מעמדי, השכלתי ולעיתים קהילתי מהמשתתפות. העובדה שהמראיינת היא אישה מקלה על השיחה בנושאים אינטימיים, אך אינה מבטלת את הפער בין אישה אקדמאית לבין אם שחייה מתנהלים בתוך מגבלות שהיא לא בחרה. שתי העמדות ישפיעו על מה שייאמר ועל מה שיובן, ולכן יידונו במפורש בפרק הממצאים ובפרק הרפלקציה.</w:t>
       </w:r>
@@ -1597,6 +1675,7 @@
           <w:sz w:val="28"/>
           <w:szCs w:val="28"/>
           <w:rtl/>
+          <w:lang w:val="he-IL" w:bidi="he-IL"/>
         </w:rPr>
         <w:t xml:space="preserve">4.7 שיקולים אתיים</w:t>
       </w:r>
@@ -1622,6 +1701,7 @@
           <w:sz w:val="24"/>
           <w:szCs w:val="24"/>
           <w:rtl/>
+          <w:lang w:val="he-IL" w:bidi="he-IL"/>
         </w:rPr>
         <w:t xml:space="preserve">הסכמה מדעת: כל משתתפת תקבל הסבר בעל פה ובכתב בערבית על מטרת המחקר, על מהלך הריאיון ועל השימוש בנתונים, ותחתום על טופס הסכמה (טיוטה בנספח ג'). לאימהות שאינן קוראות תינתן אפשרות להסכמה בעל פה מוקלטת.</w:t>
       </w:r>
@@ -1647,6 +1727,7 @@
           <w:sz w:val="24"/>
           <w:szCs w:val="24"/>
           <w:rtl/>
+          <w:lang w:val="he-IL" w:bidi="he-IL"/>
         </w:rPr>
         <w:t xml:space="preserve">התנדבות וזכות פרישה: ההשתתפות היא מרצון, ללא תמורה כספית שעלולה ליצור לחץ, וניתן להפסיק את הריאיון או לחזור בו מההסכמה בכל שלב ללא כל השלכה.</w:t>
       </w:r>
@@ -1672,6 +1753,7 @@
           <w:sz w:val="24"/>
           <w:szCs w:val="24"/>
           <w:rtl/>
+          <w:lang w:val="he-IL" w:bidi="he-IL"/>
         </w:rPr>
         <w:t xml:space="preserve">סודיות ואנונימיות: השמות יוחלפו בשמות בדויים, פרטים מזהים של היישוב, של השבט ושל בית הספר יטושטשו, וההקלטות יישמרו בקובץ מוצפן ויימחקו בתום המחקר.</w:t>
       </w:r>
@@ -1697,6 +1779,7 @@
           <w:sz w:val="24"/>
           <w:szCs w:val="24"/>
           <w:rtl/>
+          <w:lang w:val="he-IL" w:bidi="he-IL"/>
         </w:rPr>
         <w:t xml:space="preserve">רגישות למצוקה: הריאיון עוסק בנושאים כואבים. אם תעלה מצוקה, הריאיון יופסק, ולאם יימסרו פרטי קשר של שירותים תומכים בשפה הערבית באזור מגוריה.</w:t>
       </w:r>
@@ -1722,6 +1805,7 @@
           <w:sz w:val="24"/>
           <w:szCs w:val="24"/>
           <w:rtl/>
+          <w:lang w:val="he-IL" w:bidi="he-IL"/>
         </w:rPr>
         <w:t xml:space="preserve">כבוד לנורמות התרבותיות: כמפורט בסעיף 4.4, מתכונת הריאיון תותאם לנוחות האם ולא להפך.</w:t>
       </w:r>
@@ -1741,6 +1825,7 @@
           <w:sz w:val="28"/>
           <w:szCs w:val="28"/>
           <w:rtl/>
+          <w:lang w:val="he-IL" w:bidi="he-IL"/>
         </w:rPr>
         <w:t xml:space="preserve">4.8 מגבלות המחקר</w:t>
       </w:r>
@@ -1761,6 +1846,7 @@
           <w:sz w:val="24"/>
           <w:szCs w:val="24"/>
           <w:rtl/>
+          <w:lang w:val="he-IL" w:bidi="he-IL"/>
         </w:rPr>
         <w:t xml:space="preserve">המדגם קטן ומכוון, ולכן הממצאים לא יאפשרו הכללה סטטיסטית אלא הבנה מעמיקה של חוויה. גיוס דרך שומרי סף עלול להטות את המדגם לעבר אימהות שכבר נמצאות בקשר עם שירותים, בעוד אלה שמנותקות מהם, ואולי במצוקה הגדולה ביותר, יישארו מחוץ למחקר. ראיונות בנושא רגיש בחברה קטנה עלולים לעורר רצייה חברתית. והתרגום מערבית לעברית עלול לאבד ניואנסים. המחקר ינסה לצמצם מגבלות אלה באמצעות גיוון ערוצי הגיוס, בניית אמון לפני הריאיון, ניתוח בשפת המקור ובדיקת תרגום כפולה.</w:t>
       </w:r>
@@ -1780,6 +1866,7 @@
           <w:sz w:val="32"/>
           <w:szCs w:val="32"/>
           <w:rtl/>
+          <w:lang w:val="he-IL" w:bidi="he-IL"/>
         </w:rPr>
         <w:t xml:space="preserve">5. תרומת המחקר הצפויה</w:t>
       </w:r>
@@ -1800,6 +1887,7 @@
           <w:sz w:val="24"/>
           <w:szCs w:val="24"/>
           <w:rtl/>
+          <w:lang w:val="he-IL" w:bidi="he-IL"/>
         </w:rPr>
         <w:t xml:space="preserve">ברמה התאורטית, המחקר יוסיף לספרות על שילוב והכלה נקודת מבט שכמעט חסרה בה: זו של אימהות בחברה מסורתית, מיעוט בתוך מיעוט, שפוגשות מדיניות שנכתבה מתוך הנחות על הורה אחר. הוא יאפשר לבחון אם המושגים המקובלים בשיח ההכלה, כמו בחירה הורית, שותפות ושייכות, מקבלים משמעות שונה בהקשר הבדואי.</w:t>
       </w:r>
@@ -1820,6 +1908,7 @@
           <w:sz w:val="24"/>
           <w:szCs w:val="24"/>
           <w:rtl/>
+          <w:lang w:val="he-IL" w:bidi="he-IL"/>
         </w:rPr>
         <w:t xml:space="preserve">ברמה היישומית, המחקר צפוי להצביע על צעדים קונקרטיים. לדוגמה: קיום ועדות זכאות ואפיון בערבית ובנוכחות מתווכת תרבותית, מתן מידע כתוב ומוקלט בערבית על אפשרויות ההשמה לפני הוועדה ולא במהלכה, קביעת ערוץ קשר קבוע בין האם לצוות שאינו מחייב הגעה פיזית לבית הספר, והקמת קבוצות אימהות ביישובים עצמם. ההמלצות הסופיות ייגזרו מהממצאים ויוצגו בפרק הסיכום של העבודה.</w:t>
       </w:r>
@@ -1839,6 +1928,7 @@
           <w:sz w:val="32"/>
           <w:szCs w:val="32"/>
           <w:rtl/>
+          <w:lang w:val="he-IL" w:bidi="he-IL"/>
         </w:rPr>
         <w:t xml:space="preserve">6. לוח זמנים משוער</w:t>
       </w:r>
@@ -1893,6 +1983,7 @@
                 <w:sz w:val="24"/>
                 <w:szCs w:val="24"/>
                 <w:rtl/>
+                <w:lang w:val="he-IL" w:bidi="he-IL"/>
               </w:rPr>
               <w:t xml:space="preserve">שלב</w:t>
             </w:r>
@@ -1925,6 +2016,7 @@
                 <w:sz w:val="24"/>
                 <w:szCs w:val="24"/>
                 <w:rtl/>
+                <w:lang w:val="he-IL" w:bidi="he-IL"/>
               </w:rPr>
               <w:t xml:space="preserve">תוצר</w:t>
             </w:r>
@@ -1957,6 +2049,7 @@
                 <w:sz w:val="24"/>
                 <w:szCs w:val="24"/>
                 <w:rtl/>
+                <w:lang w:val="he-IL" w:bidi="he-IL"/>
               </w:rPr>
               <w:t xml:space="preserve">מועד משוער</w:t>
             </w:r>
@@ -1993,6 +2086,7 @@
                 <w:sz w:val="24"/>
                 <w:szCs w:val="24"/>
                 <w:rtl/>
+                <w:lang w:val="he-IL" w:bidi="he-IL"/>
               </w:rPr>
               <w:t xml:space="preserve">אישור הנושא וההצעה</w:t>
             </w:r>
@@ -2024,6 +2118,7 @@
                 <w:sz w:val="24"/>
                 <w:szCs w:val="24"/>
                 <w:rtl/>
+                <w:lang w:val="he-IL" w:bidi="he-IL"/>
               </w:rPr>
               <w:t xml:space="preserve">הצעת מחקר מאושרת</w:t>
             </w:r>
@@ -2055,6 +2150,7 @@
                 <w:sz w:val="24"/>
                 <w:szCs w:val="24"/>
                 <w:rtl/>
+                <w:lang w:val="he-IL" w:bidi="he-IL"/>
               </w:rPr>
               <w:t xml:space="preserve">ספטמבר–אוקטובר 2026</w:t>
             </w:r>
@@ -2091,6 +2187,7 @@
                 <w:sz w:val="24"/>
                 <w:szCs w:val="24"/>
                 <w:rtl/>
+                <w:lang w:val="he-IL" w:bidi="he-IL"/>
               </w:rPr>
               <w:t xml:space="preserve">השלמת סקירת הספרות</w:t>
             </w:r>
@@ -2122,6 +2219,7 @@
                 <w:sz w:val="24"/>
                 <w:szCs w:val="24"/>
                 <w:rtl/>
+                <w:lang w:val="he-IL" w:bidi="he-IL"/>
               </w:rPr>
               <w:t xml:space="preserve">פרק סקירה מלא</w:t>
             </w:r>
@@ -2153,6 +2251,7 @@
                 <w:sz w:val="24"/>
                 <w:szCs w:val="24"/>
                 <w:rtl/>
+                <w:lang w:val="he-IL" w:bidi="he-IL"/>
               </w:rPr>
               <w:t xml:space="preserve">נובמבר 2026</w:t>
             </w:r>
@@ -2189,6 +2288,7 @@
                 <w:sz w:val="24"/>
                 <w:szCs w:val="24"/>
                 <w:rtl/>
+                <w:lang w:val="he-IL" w:bidi="he-IL"/>
               </w:rPr>
               <w:t xml:space="preserve">אישור ועדת אתיקה, פיילוט למדריך</w:t>
             </w:r>
@@ -2220,6 +2320,7 @@
                 <w:sz w:val="24"/>
                 <w:szCs w:val="24"/>
                 <w:rtl/>
+                <w:lang w:val="he-IL" w:bidi="he-IL"/>
               </w:rPr>
               <w:t xml:space="preserve">אישור, מדריך סופי</w:t>
             </w:r>
@@ -2251,6 +2352,7 @@
                 <w:sz w:val="24"/>
                 <w:szCs w:val="24"/>
                 <w:rtl/>
+                <w:lang w:val="he-IL" w:bidi="he-IL"/>
               </w:rPr>
               <w:t xml:space="preserve">דצמבר 2026</w:t>
             </w:r>
@@ -2287,6 +2389,7 @@
                 <w:sz w:val="24"/>
                 <w:szCs w:val="24"/>
                 <w:rtl/>
+                <w:lang w:val="he-IL" w:bidi="he-IL"/>
               </w:rPr>
               <w:t xml:space="preserve">גיוס משתתפות וראיונות</w:t>
             </w:r>
@@ -2318,6 +2421,7 @@
                 <w:sz w:val="24"/>
                 <w:szCs w:val="24"/>
                 <w:rtl/>
+                <w:lang w:val="he-IL" w:bidi="he-IL"/>
               </w:rPr>
               <w:t xml:space="preserve">10–12 ראיונות מוקלטים</w:t>
             </w:r>
@@ -2349,6 +2453,7 @@
                 <w:sz w:val="24"/>
                 <w:szCs w:val="24"/>
                 <w:rtl/>
+                <w:lang w:val="he-IL" w:bidi="he-IL"/>
               </w:rPr>
               <w:t xml:space="preserve">ינואר–פברואר 2027</w:t>
             </w:r>
@@ -2385,6 +2490,7 @@
                 <w:sz w:val="24"/>
                 <w:szCs w:val="24"/>
                 <w:rtl/>
+                <w:lang w:val="he-IL" w:bidi="he-IL"/>
               </w:rPr>
               <w:t xml:space="preserve">תמלול וניתוח תמטי</w:t>
             </w:r>
@@ -2416,6 +2522,7 @@
                 <w:sz w:val="24"/>
                 <w:szCs w:val="24"/>
                 <w:rtl/>
+                <w:lang w:val="he-IL" w:bidi="he-IL"/>
               </w:rPr>
               <w:t xml:space="preserve">טבלת תמות ויומן ניתוח</w:t>
             </w:r>
@@ -2447,6 +2554,7 @@
                 <w:sz w:val="24"/>
                 <w:szCs w:val="24"/>
                 <w:rtl/>
+                <w:lang w:val="he-IL" w:bidi="he-IL"/>
               </w:rPr>
               <w:t xml:space="preserve">מרץ 2027</w:t>
             </w:r>
@@ -2483,6 +2591,7 @@
                 <w:sz w:val="24"/>
                 <w:szCs w:val="24"/>
                 <w:rtl/>
+                <w:lang w:val="he-IL" w:bidi="he-IL"/>
               </w:rPr>
               <w:t xml:space="preserve">כתיבת ממצאים, דיון וסיכום</w:t>
             </w:r>
@@ -2514,6 +2623,7 @@
                 <w:sz w:val="24"/>
                 <w:szCs w:val="24"/>
                 <w:rtl/>
+                <w:lang w:val="he-IL" w:bidi="he-IL"/>
               </w:rPr>
               <w:t xml:space="preserve">טיוטה מלאה</w:t>
             </w:r>
@@ -2545,6 +2655,7 @@
                 <w:sz w:val="24"/>
                 <w:szCs w:val="24"/>
                 <w:rtl/>
+                <w:lang w:val="he-IL" w:bidi="he-IL"/>
               </w:rPr>
               <w:t xml:space="preserve">אפריל–מאי 2027</w:t>
             </w:r>
@@ -2581,6 +2692,7 @@
                 <w:sz w:val="24"/>
                 <w:szCs w:val="24"/>
                 <w:rtl/>
+                <w:lang w:val="he-IL" w:bidi="he-IL"/>
               </w:rPr>
               <w:t xml:space="preserve">תיקונים והגשה</w:t>
             </w:r>
@@ -2612,6 +2724,7 @@
                 <w:sz w:val="24"/>
                 <w:szCs w:val="24"/>
                 <w:rtl/>
+                <w:lang w:val="he-IL" w:bidi="he-IL"/>
               </w:rPr>
               <w:t xml:space="preserve">עבודת סמינריון</w:t>
             </w:r>
@@ -2643,6 +2756,7 @@
                 <w:sz w:val="24"/>
                 <w:szCs w:val="24"/>
                 <w:rtl/>
+                <w:lang w:val="he-IL" w:bidi="he-IL"/>
               </w:rPr>
               <w:t xml:space="preserve">יוני 2027</w:t>
             </w:r>
@@ -2666,6 +2780,7 @@
           <w:sz w:val="24"/>
           <w:szCs w:val="24"/>
           <w:rtl/>
+          <w:lang w:val="he-IL" w:bidi="he-IL"/>
         </w:rPr>
         <w:t xml:space="preserve">לוח הזמנים יותאם למועדי ההגשה שייקבעו בקורס.</w:t>
       </w:r>
@@ -2685,6 +2800,7 @@
           <w:sz w:val="32"/>
           <w:szCs w:val="32"/>
           <w:rtl/>
+          <w:lang w:val="he-IL" w:bidi="he-IL"/>
         </w:rPr>
         <w:t xml:space="preserve">רשימת מקורות</w:t>
       </w:r>
@@ -2704,6 +2820,7 @@
           <w:sz w:val="24"/>
           <w:szCs w:val="24"/>
           <w:rtl/>
+          <w:lang w:val="he-IL" w:bidi="he-IL"/>
         </w:rPr>
         <w:t xml:space="preserve">אבו סעד, א' (2023). </w:t>
       </w:r>
@@ -2715,6 +2832,7 @@
           <w:sz w:val="24"/>
           <w:szCs w:val="24"/>
           <w:rtl/>
+          <w:lang w:val="he-IL" w:bidi="he-IL"/>
         </w:rPr>
         <w:t xml:space="preserve">מערכת החינוך הערבית-בדואית בנגב בראייה מקומית: מציאות וצרכים</w:t>
       </w:r>
@@ -2726,6 +2844,7 @@
           <w:sz w:val="24"/>
           <w:szCs w:val="24"/>
           <w:rtl/>
+          <w:lang w:val="he-IL" w:bidi="he-IL"/>
         </w:rPr>
         <w:t xml:space="preserve"> (מחקר מדיניות 186). המכון הישראלי לדמוקרטיה.</w:t>
       </w:r>
@@ -2745,6 +2864,7 @@
           <w:sz w:val="24"/>
           <w:szCs w:val="24"/>
           <w:rtl/>
+          <w:lang w:val="he-IL" w:bidi="he-IL"/>
         </w:rPr>
         <w:t xml:space="preserve">אלאסד-אלהוזייל, נ' (2016). </w:t>
       </w:r>
@@ -2756,6 +2876,7 @@
           <w:sz w:val="24"/>
           <w:szCs w:val="24"/>
           <w:rtl/>
+          <w:lang w:val="he-IL" w:bidi="he-IL"/>
         </w:rPr>
         <w:t xml:space="preserve">כשהצל גדול סימן שהשמש שוקעת: חייהן של נשים בדואיות בראי השינויים</w:t>
       </w:r>
@@ -2767,6 +2888,7 @@
           <w:sz w:val="24"/>
           <w:szCs w:val="24"/>
           <w:rtl/>
+          <w:lang w:val="he-IL" w:bidi="he-IL"/>
         </w:rPr>
         <w:t xml:space="preserve">. רסלינג.</w:t>
       </w:r>
@@ -2786,6 +2908,7 @@
           <w:sz w:val="24"/>
           <w:szCs w:val="24"/>
           <w:rtl/>
+          <w:lang w:val="he-IL" w:bidi="he-IL"/>
         </w:rPr>
         <w:t xml:space="preserve">ברלב, ל', נמר פורסטנברג, ר', וגדג', נ' (2021). </w:t>
       </w:r>
@@ -2797,6 +2920,7 @@
           <w:sz w:val="24"/>
           <w:szCs w:val="24"/>
           <w:rtl/>
+          <w:lang w:val="he-IL" w:bidi="he-IL"/>
         </w:rPr>
         <w:t xml:space="preserve">ילדים עם מוגבלות בישראל: מחקר ארצי</w:t>
       </w:r>
@@ -2808,6 +2932,7 @@
           <w:sz w:val="24"/>
           <w:szCs w:val="24"/>
           <w:rtl/>
+          <w:lang w:val="he-IL" w:bidi="he-IL"/>
         </w:rPr>
         <w:t xml:space="preserve"> (דמ-21-885). מאיירס-ג'וינט-ברוקדייל.</w:t>
       </w:r>
@@ -2827,6 +2952,7 @@
           <w:sz w:val="24"/>
           <w:szCs w:val="24"/>
           <w:rtl/>
+          <w:lang w:val="he-IL" w:bidi="he-IL"/>
         </w:rPr>
         <w:t xml:space="preserve">גור, א', חפניק, ד', זייפמן, א', וסימנובסקי, א' (2022). צמיחה אישית בקרב הורים לילדים עם מוגבלויות: תפקידה של התקווה. </w:t>
       </w:r>
@@ -2838,6 +2964,7 @@
           <w:sz w:val="24"/>
           <w:szCs w:val="24"/>
           <w:rtl/>
+          <w:lang w:val="he-IL" w:bidi="he-IL"/>
         </w:rPr>
         <w:t xml:space="preserve">חברה ורווחה, מב</w:t>
       </w:r>
@@ -2849,6 +2976,7 @@
           <w:sz w:val="24"/>
           <w:szCs w:val="24"/>
           <w:rtl/>
+          <w:lang w:val="he-IL" w:bidi="he-IL"/>
         </w:rPr>
         <w:t xml:space="preserve">(1), 7–29.</w:t>
       </w:r>
@@ -2868,6 +2996,7 @@
           <w:sz w:val="24"/>
           <w:szCs w:val="24"/>
           <w:rtl/>
+          <w:lang w:val="he-IL" w:bidi="he-IL"/>
         </w:rPr>
         <w:t xml:space="preserve">חוק חינוך מיוחד (תיקון מס' 11), התשע"ח-2018.</w:t>
       </w:r>
@@ -2887,6 +3016,7 @@
           <w:sz w:val="24"/>
           <w:szCs w:val="24"/>
           <w:rtl/>
+          <w:lang w:val="he-IL" w:bidi="he-IL"/>
         </w:rPr>
         <w:t xml:space="preserve">נמר פורסטנברג, ר', ברלב, ל', הרקוביץ-אמיר, ע', ואיילי, ט' (2024). </w:t>
       </w:r>
@@ -2898,6 +3028,7 @@
           <w:sz w:val="24"/>
           <w:szCs w:val="24"/>
           <w:rtl/>
+          <w:lang w:val="he-IL" w:bidi="he-IL"/>
         </w:rPr>
         <w:t xml:space="preserve">החלטות הורים על בחירת מסגרת חינוך לילדיהם הזכאים לשירותי חינוך מיוחדים</w:t>
       </w:r>
@@ -2909,6 +3040,7 @@
           <w:sz w:val="24"/>
           <w:szCs w:val="24"/>
           <w:rtl/>
+          <w:lang w:val="he-IL" w:bidi="he-IL"/>
         </w:rPr>
         <w:t xml:space="preserve"> (דמ-24-949). מאיירס-ג'וינט-ברוקדייל.</w:t>
       </w:r>
@@ -2928,6 +3060,7 @@
           <w:sz w:val="24"/>
           <w:szCs w:val="24"/>
           <w:rtl/>
+          <w:lang w:val="he-IL" w:bidi="he-IL"/>
         </w:rPr>
         <w:t xml:space="preserve">פריינטה, ב', וברק לוי, י' (2025). תהליכי ההתמודדות של אימהות בדוויות לילדים עם צרכים מיוחדים: "אלוהים נתן לי את הילד הזה מתוך אהבתו הרבה אליי". </w:t>
       </w:r>
@@ -2939,6 +3072,7 @@
           <w:sz w:val="24"/>
           <w:szCs w:val="24"/>
           <w:rtl/>
+          <w:lang w:val="he-IL" w:bidi="he-IL"/>
         </w:rPr>
         <w:t xml:space="preserve">מפגש לעבודה חינוכית-סוציאלית, לג</w:t>
       </w:r>
@@ -2950,6 +3084,7 @@
           <w:sz w:val="24"/>
           <w:szCs w:val="24"/>
           <w:rtl/>
+          <w:lang w:val="he-IL" w:bidi="he-IL"/>
         </w:rPr>
         <w:t xml:space="preserve">(58).</w:t>
       </w:r>
@@ -2969,6 +3104,7 @@
           <w:sz w:val="24"/>
           <w:szCs w:val="24"/>
           <w:rtl/>
+          <w:lang w:val="he-IL" w:bidi="he-IL"/>
         </w:rPr>
         <w:t xml:space="preserve">שקדי, א' (2003). </w:t>
       </w:r>
@@ -2980,6 +3116,7 @@
           <w:sz w:val="24"/>
           <w:szCs w:val="24"/>
           <w:rtl/>
+          <w:lang w:val="he-IL" w:bidi="he-IL"/>
         </w:rPr>
         <w:t xml:space="preserve">מילים המנסות לגעת: מחקר איכותני – תאוריה ויישום</w:t>
       </w:r>
@@ -2991,6 +3128,7 @@
           <w:sz w:val="24"/>
           <w:szCs w:val="24"/>
           <w:rtl/>
+          <w:lang w:val="he-IL" w:bidi="he-IL"/>
         </w:rPr>
         <w:t xml:space="preserve">. רמות.</w:t>
       </w:r>
@@ -3009,6 +3147,7 @@
           <w:iCs w:val="false"/>
           <w:sz w:val="24"/>
           <w:szCs w:val="24"/>
+          <w:lang w:val="en-US" w:bidi="he-IL"/>
         </w:rPr>
         <w:t xml:space="preserve">Abo-Rass, F., Abu-Kaf, S., Nakash, O., &amp; Braun-Lewensohn, O. (2024). Mental health literacy as a barrier and facilitator for service use: Qualitative inquiry among Palestinian Bedouins in Israel. </w:t>
       </w:r>
@@ -3019,6 +3158,7 @@
           <w:iCs/>
           <w:sz w:val="24"/>
           <w:szCs w:val="24"/>
+          <w:lang w:val="en-US" w:bidi="he-IL"/>
         </w:rPr>
         <w:t xml:space="preserve">International Journal of Social Psychiatry, 70</w:t>
       </w:r>
@@ -3029,6 +3169,7 @@
           <w:iCs w:val="false"/>
           <w:sz w:val="24"/>
           <w:szCs w:val="24"/>
+          <w:lang w:val="en-US" w:bidi="he-IL"/>
         </w:rPr>
         <w:t xml:space="preserve">(4), 689–699. https://doi.org/10.1177/00207640231223433</w:t>
       </w:r>
@@ -3047,6 +3188,7 @@
           <w:iCs w:val="false"/>
           <w:sz w:val="24"/>
           <w:szCs w:val="24"/>
+          <w:lang w:val="en-US" w:bidi="he-IL"/>
         </w:rPr>
         <w:t xml:space="preserve">Abu-Gweder, A., Elkashalla, B., &amp; Abu-Sareya, A. A. (2026). Integrating them socially at any cost: Arab-Bedouin teachers' attitudes toward including students with limitations in regular classrooms. </w:t>
       </w:r>
@@ -3057,6 +3199,7 @@
           <w:iCs/>
           <w:sz w:val="24"/>
           <w:szCs w:val="24"/>
+          <w:lang w:val="en-US" w:bidi="he-IL"/>
         </w:rPr>
         <w:t xml:space="preserve">Psychology in the Schools, 63</w:t>
       </w:r>
@@ -3067,6 +3210,7 @@
           <w:iCs w:val="false"/>
           <w:sz w:val="24"/>
           <w:szCs w:val="24"/>
+          <w:lang w:val="en-US" w:bidi="he-IL"/>
         </w:rPr>
         <w:t xml:space="preserve">, 130–138. https://doi.org/10.1002/pits.70080</w:t>
       </w:r>
@@ -3085,6 +3229,7 @@
           <w:iCs w:val="false"/>
           <w:sz w:val="24"/>
           <w:szCs w:val="24"/>
+          <w:lang w:val="en-US" w:bidi="he-IL"/>
         </w:rPr>
         <w:t xml:space="preserve">Allassad Alhuzail, N., &amp; Levinger, M. (2018). A "Sotra environment": How hearing Bedouin mothers of children with hearing loss perceive the education system. </w:t>
       </w:r>
@@ -3095,6 +3240,7 @@
           <w:iCs/>
           <w:sz w:val="24"/>
           <w:szCs w:val="24"/>
+          <w:lang w:val="en-US" w:bidi="he-IL"/>
         </w:rPr>
         <w:t xml:space="preserve">The Volta Review, 118</w:t>
       </w:r>
@@ -3105,6 +3251,7 @@
           <w:iCs w:val="false"/>
           <w:sz w:val="24"/>
           <w:szCs w:val="24"/>
+          <w:lang w:val="en-US" w:bidi="he-IL"/>
         </w:rPr>
         <w:t xml:space="preserve">(1-2), 60–87.</w:t>
       </w:r>
@@ -3123,6 +3270,7 @@
           <w:iCs w:val="false"/>
           <w:sz w:val="24"/>
           <w:szCs w:val="24"/>
+          <w:lang w:val="en-US" w:bidi="he-IL"/>
         </w:rPr>
         <w:t xml:space="preserve">Allassad Alhuzail, N., &amp; Levinger, M. (2021). Society as a barrier rather than a resource for women: Bedouin mothers of children with hearing loss describe their plight. </w:t>
       </w:r>
@@ -3133,6 +3281,7 @@
           <w:iCs/>
           <w:sz w:val="24"/>
           <w:szCs w:val="24"/>
+          <w:lang w:val="en-US" w:bidi="he-IL"/>
         </w:rPr>
         <w:t xml:space="preserve">International Journal of Disability, Development and Education, 68</w:t>
       </w:r>
@@ -3143,6 +3292,7 @@
           <w:iCs w:val="false"/>
           <w:sz w:val="24"/>
           <w:szCs w:val="24"/>
+          <w:lang w:val="en-US" w:bidi="he-IL"/>
         </w:rPr>
         <w:t xml:space="preserve">(3), 362–375. https://doi.org/10.1080/1034912X.2019.1681378</w:t>
       </w:r>
@@ -3161,6 +3311,7 @@
           <w:iCs w:val="false"/>
           <w:sz w:val="24"/>
           <w:szCs w:val="24"/>
+          <w:lang w:val="en-US" w:bidi="he-IL"/>
         </w:rPr>
         <w:t xml:space="preserve">Barak-Levy, Y., &amp; Paryente, B. (2024). Parenting children with special needs in Israel: Bedouin and Jewish mothers process their experiences. </w:t>
       </w:r>
@@ -3171,6 +3322,7 @@
           <w:iCs/>
           <w:sz w:val="24"/>
           <w:szCs w:val="24"/>
+          <w:lang w:val="en-US" w:bidi="he-IL"/>
         </w:rPr>
         <w:t xml:space="preserve">Israel Affairs, 30</w:t>
       </w:r>
@@ -3181,6 +3333,7 @@
           <w:iCs w:val="false"/>
           <w:sz w:val="24"/>
           <w:szCs w:val="24"/>
+          <w:lang w:val="en-US" w:bidi="he-IL"/>
         </w:rPr>
         <w:t xml:space="preserve">(6). https://doi.org/10.1080/13537121.2024.2419235</w:t>
       </w:r>
@@ -3199,6 +3352,7 @@
           <w:iCs w:val="false"/>
           <w:sz w:val="24"/>
           <w:szCs w:val="24"/>
+          <w:lang w:val="en-US" w:bidi="he-IL"/>
         </w:rPr>
         <w:t xml:space="preserve">Benatov, J., Manor-Binyamini, I., &amp; Abu-Kaf, S. (2022). Coping strategies and depression among Bedouin mothers raising an adolescent with a developmental disability. </w:t>
       </w:r>
@@ -3209,6 +3363,7 @@
           <w:iCs/>
           <w:sz w:val="24"/>
           <w:szCs w:val="24"/>
+          <w:lang w:val="en-US" w:bidi="he-IL"/>
         </w:rPr>
         <w:t xml:space="preserve">Archives of Women's Mental Health, 25</w:t>
       </w:r>
@@ -3219,6 +3374,7 @@
           <w:iCs w:val="false"/>
           <w:sz w:val="24"/>
           <w:szCs w:val="24"/>
+          <w:lang w:val="en-US" w:bidi="he-IL"/>
         </w:rPr>
         <w:t xml:space="preserve">(1), 147–156. https://doi.org/10.1007/s00737-022-01203-1</w:t>
       </w:r>
@@ -3237,6 +3393,7 @@
           <w:iCs w:val="false"/>
           <w:sz w:val="24"/>
           <w:szCs w:val="24"/>
+          <w:lang w:val="en-US" w:bidi="he-IL"/>
         </w:rPr>
         <w:t xml:space="preserve">Braun, V., &amp; Clarke, V. (2006). Using thematic analysis in psychology. </w:t>
       </w:r>
@@ -3247,6 +3404,7 @@
           <w:iCs/>
           <w:sz w:val="24"/>
           <w:szCs w:val="24"/>
+          <w:lang w:val="en-US" w:bidi="he-IL"/>
         </w:rPr>
         <w:t xml:space="preserve">Qualitative Research in Psychology, 3</w:t>
       </w:r>
@@ -3257,6 +3415,7 @@
           <w:iCs w:val="false"/>
           <w:sz w:val="24"/>
           <w:szCs w:val="24"/>
+          <w:lang w:val="en-US" w:bidi="he-IL"/>
         </w:rPr>
         <w:t xml:space="preserve">(2), 77–101. https://doi.org/10.1191/1478088706qp063oa</w:t>
       </w:r>
@@ -3275,6 +3434,7 @@
           <w:iCs w:val="false"/>
           <w:sz w:val="24"/>
           <w:szCs w:val="24"/>
+          <w:lang w:val="en-US" w:bidi="he-IL"/>
         </w:rPr>
         <w:t xml:space="preserve">Creswell, J. W., &amp; Poth, C. N. (2018). </w:t>
       </w:r>
@@ -3285,6 +3445,7 @@
           <w:iCs/>
           <w:sz w:val="24"/>
           <w:szCs w:val="24"/>
+          <w:lang w:val="en-US" w:bidi="he-IL"/>
         </w:rPr>
         <w:t xml:space="preserve">Qualitative inquiry and research design: Choosing among five approaches</w:t>
       </w:r>
@@ -3295,6 +3456,7 @@
           <w:iCs w:val="false"/>
           <w:sz w:val="24"/>
           <w:szCs w:val="24"/>
+          <w:lang w:val="en-US" w:bidi="he-IL"/>
         </w:rPr>
         <w:t xml:space="preserve"> (4th ed.). Sage.</w:t>
       </w:r>
@@ -3313,6 +3475,7 @@
           <w:iCs w:val="false"/>
           <w:sz w:val="24"/>
           <w:szCs w:val="24"/>
+          <w:lang w:val="en-US" w:bidi="he-IL"/>
         </w:rPr>
         <w:t xml:space="preserve">Jorban, M., Cachón-Zagalaz, J., Mecías-Calvo, M., &amp; Navarro-Patón, R. (2024). Facilitators of and barriers to inclusive education in the Arab community of Israel: The parents' perspective. </w:t>
       </w:r>
@@ -3323,6 +3486,7 @@
           <w:iCs/>
           <w:sz w:val="24"/>
           <w:szCs w:val="24"/>
+          <w:lang w:val="en-US" w:bidi="he-IL"/>
         </w:rPr>
         <w:t xml:space="preserve">Education Sciences, 14</w:t>
       </w:r>
@@ -3333,6 +3497,7 @@
           <w:iCs w:val="false"/>
           <w:sz w:val="24"/>
           <w:szCs w:val="24"/>
+          <w:lang w:val="en-US" w:bidi="he-IL"/>
         </w:rPr>
         <w:t xml:space="preserve">(5), 525. https://doi.org/10.3390/educsci14050525</w:t>
       </w:r>
@@ -3351,6 +3516,7 @@
           <w:iCs w:val="false"/>
           <w:sz w:val="24"/>
           <w:szCs w:val="24"/>
+          <w:lang w:val="en-US" w:bidi="he-IL"/>
         </w:rPr>
         <w:t xml:space="preserve">Lincoln, Y. S., &amp; Guba, E. G. (1985). </w:t>
       </w:r>
@@ -3361,6 +3527,7 @@
           <w:iCs/>
           <w:sz w:val="24"/>
           <w:szCs w:val="24"/>
+          <w:lang w:val="en-US" w:bidi="he-IL"/>
         </w:rPr>
         <w:t xml:space="preserve">Naturalistic inquiry</w:t>
       </w:r>
@@ -3371,6 +3538,7 @@
           <w:iCs w:val="false"/>
           <w:sz w:val="24"/>
           <w:szCs w:val="24"/>
+          <w:lang w:val="en-US" w:bidi="he-IL"/>
         </w:rPr>
         <w:t xml:space="preserve">. Sage.</w:t>
       </w:r>
@@ -3389,6 +3557,7 @@
           <w:iCs w:val="false"/>
           <w:sz w:val="24"/>
           <w:szCs w:val="24"/>
+          <w:lang w:val="en-US" w:bidi="he-IL"/>
         </w:rPr>
         <w:t xml:space="preserve">Manor-Binyamini, I., Benatov, J., &amp; Abu-Kaf, S. (2020). Social support, depression, and somatisation among Bedouin mothers of adolescents with or without developmental disabilities. </w:t>
       </w:r>
@@ -3399,6 +3568,7 @@
           <w:iCs/>
           <w:sz w:val="24"/>
           <w:szCs w:val="24"/>
+          <w:lang w:val="en-US" w:bidi="he-IL"/>
         </w:rPr>
         <w:t xml:space="preserve">Journal of Intellectual &amp; Developmental Disability, 45</w:t>
       </w:r>
@@ -3409,6 +3579,7 @@
           <w:iCs w:val="false"/>
           <w:sz w:val="24"/>
           <w:szCs w:val="24"/>
+          <w:lang w:val="en-US" w:bidi="he-IL"/>
         </w:rPr>
         <w:t xml:space="preserve">(3), 245–253.</w:t>
       </w:r>
@@ -3427,6 +3598,7 @@
           <w:iCs w:val="false"/>
           <w:sz w:val="24"/>
           <w:szCs w:val="24"/>
+          <w:lang w:val="en-US" w:bidi="he-IL"/>
         </w:rPr>
         <w:t xml:space="preserve">Manor-Binyamini, I., &amp; Schreiber-Divon, M. (2021). Bedouin mothers of young children with developmental disability: Stigma, quality of life and collaboration with professionals. </w:t>
       </w:r>
@@ -3437,6 +3609,7 @@
           <w:iCs/>
           <w:sz w:val="24"/>
           <w:szCs w:val="24"/>
+          <w:lang w:val="en-US" w:bidi="he-IL"/>
         </w:rPr>
         <w:t xml:space="preserve">Research in Developmental Disabilities, 108</w:t>
       </w:r>
@@ -3447,6 +3620,7 @@
           <w:iCs w:val="false"/>
           <w:sz w:val="24"/>
           <w:szCs w:val="24"/>
+          <w:lang w:val="en-US" w:bidi="he-IL"/>
         </w:rPr>
         <w:t xml:space="preserve">, 103819. https://doi.org/10.1016/j.ridd.2020.103819</w:t>
       </w:r>
@@ -3465,6 +3639,7 @@
           <w:iCs w:val="false"/>
           <w:sz w:val="24"/>
           <w:szCs w:val="24"/>
+          <w:lang w:val="en-US" w:bidi="he-IL"/>
         </w:rPr>
         <w:t xml:space="preserve">Manor-Binyamini, I., &amp; Shoshana, A. (2018). Listening to Bedouin mothers of children with autism. </w:t>
       </w:r>
@@ -3475,6 +3650,7 @@
           <w:iCs/>
           <w:sz w:val="24"/>
           <w:szCs w:val="24"/>
+          <w:lang w:val="en-US" w:bidi="he-IL"/>
         </w:rPr>
         <w:t xml:space="preserve">Culture, Medicine, and Psychiatry, 42</w:t>
       </w:r>
@@ -3485,6 +3661,7 @@
           <w:iCs w:val="false"/>
           <w:sz w:val="24"/>
           <w:szCs w:val="24"/>
+          <w:lang w:val="en-US" w:bidi="he-IL"/>
         </w:rPr>
         <w:t xml:space="preserve">(2), 401–418. https://doi.org/10.1007/s11013-018-9567-x</w:t>
       </w:r>
@@ -3504,6 +3681,7 @@
           <w:sz w:val="32"/>
           <w:szCs w:val="32"/>
           <w:rtl/>
+          <w:lang w:val="he-IL" w:bidi="he-IL"/>
         </w:rPr>
         <w:t xml:space="preserve">נספח א': מדריך ריאיון חצי-מובנה (עברית)</w:t>
       </w:r>
@@ -3524,6 +3702,7 @@
           <w:sz w:val="24"/>
           <w:szCs w:val="24"/>
           <w:rtl/>
+          <w:lang w:val="he-IL" w:bidi="he-IL"/>
         </w:rPr>
         <w:t xml:space="preserve">הריאיון ייערך בערבית (הנוסח הערבי בנספח ב'). לפני השאלות: הצגת המראיינת, הסבר קצר על מטרת המחקר, הבהרה שאין תשובות נכונות או לא נכונות, סודיות, הקלטה, זכות לעצור בכל רגע וחתימה על טופס הסכמה. סדר השאלות גמיש ויותאם לזרימת השיחה. בסיום: תודה, תזכורת על סודיות ומסירת פרטי קשר של החוקרים ושל שירותי תמיכה בערבית.</w:t>
       </w:r>
@@ -3549,6 +3728,7 @@
           <w:sz w:val="24"/>
           <w:szCs w:val="24"/>
           <w:rtl/>
+          <w:lang w:val="he-IL" w:bidi="he-IL"/>
         </w:rPr>
         <w:t xml:space="preserve">ספרי לי על עצמך.</w:t>
       </w:r>
@@ -3574,6 +3754,7 @@
           <w:sz w:val="24"/>
           <w:szCs w:val="24"/>
           <w:rtl/>
+          <w:lang w:val="he-IL" w:bidi="he-IL"/>
         </w:rPr>
         <w:t xml:space="preserve">ספרי לי על [שם הילד/ה]. איך גיליתם שיש לו/לה מוגבלות, ומה הרגשת אז?</w:t>
       </w:r>
@@ -3599,6 +3780,7 @@
           <w:sz w:val="24"/>
           <w:szCs w:val="24"/>
           <w:rtl/>
+          <w:lang w:val="he-IL" w:bidi="he-IL"/>
         </w:rPr>
         <w:t xml:space="preserve">תארי לי יום רגיל שלך, מהבוקר עד הלילה.</w:t>
       </w:r>
@@ -3624,6 +3806,7 @@
           <w:sz w:val="24"/>
           <w:szCs w:val="24"/>
           <w:rtl/>
+          <w:lang w:val="he-IL" w:bidi="he-IL"/>
         </w:rPr>
         <w:t xml:space="preserve">מה הדבר הכי קשה בשבילך בגידול של [שם], ומה נותן לך כוח?</w:t>
       </w:r>
@@ -3649,6 +3832,7 @@
           <w:sz w:val="24"/>
           <w:szCs w:val="24"/>
           <w:rtl/>
+          <w:lang w:val="he-IL" w:bidi="he-IL"/>
         </w:rPr>
         <w:t xml:space="preserve">איך המצב השפיע על הבריאות שלך, על הקשר עם בעלך ועם המשפחה המורחבת?</w:t>
       </w:r>
@@ -3674,6 +3858,7 @@
           <w:sz w:val="24"/>
           <w:szCs w:val="24"/>
           <w:rtl/>
+          <w:lang w:val="he-IL" w:bidi="he-IL"/>
         </w:rPr>
         <w:t xml:space="preserve">מה חושבים אנשים בסביבה שלך על ילד עם מוגבלות?</w:t>
       </w:r>
@@ -3699,6 +3884,7 @@
           <w:sz w:val="24"/>
           <w:szCs w:val="24"/>
           <w:rtl/>
+          <w:lang w:val="he-IL" w:bidi="he-IL"/>
         </w:rPr>
         <w:t xml:space="preserve">איך המשפחה המורחבת והשבט התייחסו כשנודע על המוגבלות, ואיך היום?</w:t>
       </w:r>
@@ -3724,6 +3910,7 @@
           <w:sz w:val="24"/>
           <w:szCs w:val="24"/>
           <w:rtl/>
+          <w:lang w:val="he-IL" w:bidi="he-IL"/>
         </w:rPr>
         <w:t xml:space="preserve">האם הרגשת פעם שמאשימים אותך, או שהמוגבלות של הילד השפיעה על המעמד שלך בבית או במשפחה?</w:t>
       </w:r>
@@ -3749,6 +3936,7 @@
           <w:sz w:val="24"/>
           <w:szCs w:val="24"/>
           <w:rtl/>
+          <w:lang w:val="he-IL" w:bidi="he-IL"/>
         </w:rPr>
         <w:t xml:space="preserve">איזה מקום יש לדת ולאמונה באופן שבו את מבינה את המצב ומתמודדת איתו?</w:t>
       </w:r>
@@ -3774,6 +3962,7 @@
           <w:sz w:val="24"/>
           <w:szCs w:val="24"/>
           <w:rtl/>
+          <w:lang w:val="he-IL" w:bidi="he-IL"/>
         </w:rPr>
         <w:t xml:space="preserve">איפה [שם] לומד/ת היום, ואיך הגעתם למסגרת הזאת? מי החליט, והאם הרגשת שמקשיבים לך בוועדה?</w:t>
       </w:r>
@@ -3799,6 +3988,7 @@
           <w:sz w:val="24"/>
           <w:szCs w:val="24"/>
           <w:rtl/>
+          <w:lang w:val="he-IL" w:bidi="he-IL"/>
         </w:rPr>
         <w:t xml:space="preserve">כשאומרים "שילוב", מה זה אומר בשבילך, ומה היית רוצה שיהיה בשביל [שם]?</w:t>
       </w:r>
@@ -3824,6 +4014,7 @@
           <w:sz w:val="24"/>
           <w:szCs w:val="24"/>
           <w:rtl/>
+          <w:lang w:val="he-IL" w:bidi="he-IL"/>
         </w:rPr>
         <w:t xml:space="preserve">איך הקשר שלך עם המורות, הסייעת והיועצת? באיזו שפה מדברים איתך, ואיך מעדכנים אותך?</w:t>
       </w:r>
@@ -3849,6 +4040,7 @@
           <w:sz w:val="24"/>
           <w:szCs w:val="24"/>
           <w:rtl/>
+          <w:lang w:val="he-IL" w:bidi="he-IL"/>
         </w:rPr>
         <w:t xml:space="preserve">מה עובד טוב בבית הספר ומה לא? האם [שם] מרגיש/ה שייך/ת, ויש לו/לה חברים?</w:t>
       </w:r>
@@ -3874,6 +4066,7 @@
           <w:sz w:val="24"/>
           <w:szCs w:val="24"/>
           <w:rtl/>
+          <w:lang w:val="he-IL" w:bidi="he-IL"/>
         </w:rPr>
         <w:t xml:space="preserve">איך [שם] משתתף/ת בחיי הקהילה: משחק עם ילדי השכנים, מסגד, אירועים משפחתיים? יש מקומות שבהם הוא/היא לא רצוי/ה?</w:t>
       </w:r>
@@ -3899,6 +4092,7 @@
           <w:sz w:val="24"/>
           <w:szCs w:val="24"/>
           <w:rtl/>
+          <w:lang w:val="he-IL" w:bidi="he-IL"/>
         </w:rPr>
         <w:t xml:space="preserve">למי את פונה כשקשה לך, ועם אילו שירותים את בקשר? מה חסר, ומה היה יכול לעזור?</w:t>
       </w:r>
@@ -3924,6 +4118,7 @@
           <w:sz w:val="24"/>
           <w:szCs w:val="24"/>
           <w:rtl/>
+          <w:lang w:val="he-IL" w:bidi="he-IL"/>
         </w:rPr>
         <w:t xml:space="preserve">מה את מאחלת ל[שם] בעוד חמש שנים, ומה היית אומרת לאם צעירה שרק גילתה שלילדה יש מוגבלות?</w:t>
       </w:r>
@@ -3949,6 +4144,7 @@
           <w:sz w:val="24"/>
           <w:szCs w:val="24"/>
           <w:rtl/>
+          <w:lang w:val="he-IL" w:bidi="he-IL"/>
         </w:rPr>
         <w:t xml:space="preserve">אם היית יכולה להגיד משפט אחד למנהל בית הספר ומשפט אחד למשרד החינוך, מה היית אומרת? ויש משהו שלא שאלתי ואת רוצה להוסיף?</w:t>
       </w:r>
@@ -3968,6 +4164,7 @@
           <w:sz w:val="32"/>
           <w:szCs w:val="32"/>
           <w:rtl/>
+          <w:lang w:val="he-IL" w:bidi="he-IL"/>
         </w:rPr>
         <w:t xml:space="preserve">נספח ב': מדריך הריאיון בערבית (دليل المقابلة)</w:t>
       </w:r>
@@ -3986,6 +4183,7 @@
           <w:sz w:val="24"/>
           <w:szCs w:val="24"/>
           <w:rtl/>
+          <w:lang w:val="ar-JO" w:bidi="ar-JO"/>
         </w:rPr>
         <w:t xml:space="preserve">قبل الأسئلة: تعريف بالباحثة، شرح قصير عن هدف البحث، توضيح إنه ما في إجابات صح أو غلط، السرية، التسجيل، حق التوقف بأي لحظة، وتوقيع نموذج الموافقة. ترتيب الأسئلة مرن وبيتغير حسب مجرى الحديث. بالختام: شكر، تذكير بالسرية، وإعطاء أرقام تواصل للباحثين ولخدمات دعم باللغة العربية.</w:t>
       </w:r>
@@ -4009,6 +4207,7 @@
           <w:sz w:val="24"/>
           <w:szCs w:val="24"/>
           <w:rtl/>
+          <w:lang w:val="ar-JO" w:bidi="ar-JO"/>
         </w:rPr>
         <w:t xml:space="preserve">احكيلي عن حالك.</w:t>
       </w:r>
@@ -4032,6 +4231,7 @@
           <w:sz w:val="24"/>
           <w:szCs w:val="24"/>
           <w:rtl/>
+          <w:lang w:val="ar-JO" w:bidi="ar-JO"/>
         </w:rPr>
         <w:t xml:space="preserve">احكيلي عن [اسم الطفل/ة]. كيف اكتشفتوا إنه عنده/عندها إعاقة، وشو حسّيتي وقتها؟</w:t>
       </w:r>
@@ -4055,6 +4255,7 @@
           <w:sz w:val="24"/>
           <w:szCs w:val="24"/>
           <w:rtl/>
+          <w:lang w:val="ar-JO" w:bidi="ar-JO"/>
         </w:rPr>
         <w:t xml:space="preserve">صفيلي يوم عادي إلك، من الصبح للّيل.</w:t>
       </w:r>
@@ -4078,6 +4279,7 @@
           <w:sz w:val="24"/>
           <w:szCs w:val="24"/>
           <w:rtl/>
+          <w:lang w:val="ar-JO" w:bidi="ar-JO"/>
         </w:rPr>
         <w:t xml:space="preserve">شو أصعب إشي بالنسبة إلك بتربية [الاسم]، وشو بيعطيكي قوة؟</w:t>
       </w:r>
@@ -4101,6 +4303,7 @@
           <w:sz w:val="24"/>
           <w:szCs w:val="24"/>
           <w:rtl/>
+          <w:lang w:val="ar-JO" w:bidi="ar-JO"/>
         </w:rPr>
         <w:t xml:space="preserve">كيف أثّر الوضع على صحتك، وعلى علاقتك مع زوجك ومع العائلة الكبيرة؟</w:t>
       </w:r>
@@ -4124,6 +4327,7 @@
           <w:sz w:val="24"/>
           <w:szCs w:val="24"/>
           <w:rtl/>
+          <w:lang w:val="ar-JO" w:bidi="ar-JO"/>
         </w:rPr>
         <w:t xml:space="preserve">شو بيفكروا الناس بمحيطك عن طفل عنده إعاقة؟</w:t>
       </w:r>
@@ -4147,6 +4351,7 @@
           <w:sz w:val="24"/>
           <w:szCs w:val="24"/>
           <w:rtl/>
+          <w:lang w:val="ar-JO" w:bidi="ar-JO"/>
         </w:rPr>
         <w:t xml:space="preserve">كيف تعاملت العائلة الكبيرة والعشيرة لما عرفوا عن الإعاقة، وكيف اليوم؟</w:t>
       </w:r>
@@ -4170,6 +4375,7 @@
           <w:sz w:val="24"/>
           <w:szCs w:val="24"/>
           <w:rtl/>
+          <w:lang w:val="ar-JO" w:bidi="ar-JO"/>
         </w:rPr>
         <w:t xml:space="preserve">حسّيتي مرة إنهم بيلوموكي، أو إنه إعاقة الولد أثّرت على مكانتك بالبيت أو بالعائلة؟</w:t>
       </w:r>
@@ -4193,6 +4399,7 @@
           <w:sz w:val="24"/>
           <w:szCs w:val="24"/>
           <w:rtl/>
+          <w:lang w:val="ar-JO" w:bidi="ar-JO"/>
         </w:rPr>
         <w:t xml:space="preserve">شو مكان الدين والإيمان بالطريقة اللي بتفهمي فيها الوضع وبتتعاملي معه؟</w:t>
       </w:r>
@@ -4216,6 +4423,7 @@
           <w:sz w:val="24"/>
           <w:szCs w:val="24"/>
           <w:rtl/>
+          <w:lang w:val="ar-JO" w:bidi="ar-JO"/>
         </w:rPr>
         <w:t xml:space="preserve">وين بيتعلم/بتتعلم [الاسم] اليوم، وكيف وصلتوا لهاي المدرسة أو الصف؟ مين قرّر، وحسّيتي إنهم بيسمعوكي باللجنة؟</w:t>
       </w:r>
@@ -4239,6 +4447,7 @@
           <w:sz w:val="24"/>
           <w:szCs w:val="24"/>
           <w:rtl/>
+          <w:lang w:val="ar-JO" w:bidi="ar-JO"/>
         </w:rPr>
         <w:t xml:space="preserve">لما بيقولوا "دمج"، شو معناها بالنسبة إلك، وشو كنتي تتمني يكون لـ[الاسم]؟</w:t>
       </w:r>
@@ -4262,6 +4471,7 @@
           <w:sz w:val="24"/>
           <w:szCs w:val="24"/>
           <w:rtl/>
+          <w:lang w:val="ar-JO" w:bidi="ar-JO"/>
         </w:rPr>
         <w:t xml:space="preserve">كيف علاقتك مع المعلمات والمساعدة والمستشارة؟ بأي لغة بيحكوا معك، وكيف بيخبروكي شو بيصير؟</w:t>
       </w:r>
@@ -4285,6 +4495,7 @@
           <w:sz w:val="24"/>
           <w:szCs w:val="24"/>
           <w:rtl/>
+          <w:lang w:val="ar-JO" w:bidi="ar-JO"/>
         </w:rPr>
         <w:t xml:space="preserve">شو ماشي منيح بالمدرسة وشو لأ؟ [الاسم] بيحس/بتحس بانتماء، وعنده/عندها أصحاب؟</w:t>
       </w:r>
@@ -4308,6 +4519,7 @@
           <w:sz w:val="24"/>
           <w:szCs w:val="24"/>
           <w:rtl/>
+          <w:lang w:val="ar-JO" w:bidi="ar-JO"/>
         </w:rPr>
         <w:t xml:space="preserve">كيف بيشارك/بتشارك [الاسم] بحياة المجتمع: لعب مع أولاد الجيران، المسجد، مناسبات عائلية؟ في أماكن مش مرغوب/ة فيها؟</w:t>
       </w:r>
@@ -4331,6 +4543,7 @@
           <w:sz w:val="24"/>
           <w:szCs w:val="24"/>
           <w:rtl/>
+          <w:lang w:val="ar-JO" w:bidi="ar-JO"/>
         </w:rPr>
         <w:t xml:space="preserve">لمين بتلجئي لما يصعب عليكي، ومع أي خدمات إنتي على تواصل؟ شو ناقص، وشو كان ممكن يساعد؟</w:t>
       </w:r>
@@ -4354,6 +4567,7 @@
           <w:sz w:val="24"/>
           <w:szCs w:val="24"/>
           <w:rtl/>
+          <w:lang w:val="ar-JO" w:bidi="ar-JO"/>
         </w:rPr>
         <w:t xml:space="preserve">شو بتتمني لـ[الاسم] بعد خمس سنين، وشو بتقولي لأم شابة لسا اكتشفت إنه ابنها عنده إعاقة؟</w:t>
       </w:r>
@@ -4377,6 +4591,7 @@
           <w:sz w:val="24"/>
           <w:szCs w:val="24"/>
           <w:rtl/>
+          <w:lang w:val="ar-JO" w:bidi="ar-JO"/>
         </w:rPr>
         <w:t xml:space="preserve">لو بتقدري تقولي جملة وحدة لمدير المدرسة وجملة وحدة لوزارة التربية، شو بتقولي؟ وفي إشي ما سألتك عنه وبدك تضيفيه؟</w:t>
       </w:r>
@@ -4396,6 +4611,7 @@
           <w:sz w:val="32"/>
           <w:szCs w:val="32"/>
           <w:rtl/>
+          <w:lang w:val="he-IL" w:bidi="he-IL"/>
         </w:rPr>
         <w:t xml:space="preserve">נספח ג': טיוטת טופס הסכמה מדעת (לתרגום לערבית ולאישור ועדת האתיקה)</w:t>
       </w:r>
@@ -4416,6 +4632,7 @@
           <w:sz w:val="24"/>
           <w:szCs w:val="24"/>
           <w:rtl/>
+          <w:lang w:val="he-IL" w:bidi="he-IL"/>
         </w:rPr>
         <w:t xml:space="preserve">שם המחקר: </w:t>
       </w:r>
@@ -4429,6 +4646,7 @@
           <w:sz w:val="24"/>
           <w:szCs w:val="24"/>
           <w:rtl/>
+          <w:lang w:val="he-IL" w:bidi="he-IL"/>
         </w:rPr>
         <w:t xml:space="preserve">חוויותיהן של אימהות לילדים עם מוגבלות בחברה הבדואית: בין מסורת לשילוב במערכת החינוך ובקהילה.</w:t>
       </w:r>
@@ -4449,6 +4667,7 @@
           <w:sz w:val="24"/>
           <w:szCs w:val="24"/>
           <w:rtl/>
+          <w:lang w:val="he-IL" w:bidi="he-IL"/>
         </w:rPr>
         <w:t xml:space="preserve">החוקרים: </w:t>
       </w:r>
@@ -4462,6 +4681,7 @@
           <w:sz w:val="24"/>
           <w:szCs w:val="24"/>
           <w:rtl/>
+          <w:lang w:val="he-IL" w:bidi="he-IL"/>
         </w:rPr>
         <w:t xml:space="preserve">סולימאן אבו חמיד וג'ואהר אבו גאנם, סטודנטים בקורס "שילוב והכלה במרחב החינוכי-חברתי", הקריה האקדמית אונו, בהנחיית עומרי טנקמן.</w:t>
       </w:r>
@@ -4482,6 +4702,7 @@
           <w:sz w:val="24"/>
           <w:szCs w:val="24"/>
           <w:rtl/>
+          <w:lang w:val="he-IL" w:bidi="he-IL"/>
         </w:rPr>
         <w:t xml:space="preserve">מטרת המחקר: </w:t>
       </w:r>
@@ -4495,6 +4716,7 @@
           <w:sz w:val="24"/>
           <w:szCs w:val="24"/>
           <w:rtl/>
+          <w:lang w:val="he-IL" w:bidi="he-IL"/>
         </w:rPr>
         <w:t xml:space="preserve">להבין כיצד אימהות בחברה הבדואית חוות את השילוב של ילדן עם מוגבלות בבית הספר ובקהילה.</w:t>
       </w:r>
@@ -4515,6 +4737,7 @@
           <w:sz w:val="24"/>
           <w:szCs w:val="24"/>
           <w:rtl/>
+          <w:lang w:val="he-IL" w:bidi="he-IL"/>
         </w:rPr>
         <w:t xml:space="preserve">מה כוללת ההשתתפות: </w:t>
       </w:r>
@@ -4528,6 +4751,7 @@
           <w:sz w:val="24"/>
           <w:szCs w:val="24"/>
           <w:rtl/>
+          <w:lang w:val="he-IL" w:bidi="he-IL"/>
         </w:rPr>
         <w:t xml:space="preserve">ריאיון אחד בערבית, באורך של כשעה, במקום שתבחרי. הריאיון ייערך על ידי החוקרת ויוקלט כדי שנוכל לזכור במדויק את דברייך.</w:t>
       </w:r>
@@ -4548,6 +4772,7 @@
           <w:sz w:val="24"/>
           <w:szCs w:val="24"/>
           <w:rtl/>
+          <w:lang w:val="he-IL" w:bidi="he-IL"/>
         </w:rPr>
         <w:t xml:space="preserve">התנדבות: </w:t>
       </w:r>
@@ -4561,6 +4786,7 @@
           <w:sz w:val="24"/>
           <w:szCs w:val="24"/>
           <w:rtl/>
+          <w:lang w:val="he-IL" w:bidi="he-IL"/>
         </w:rPr>
         <w:t xml:space="preserve">ההשתתפות היא מרצונך החופשי. את יכולה לא לענות על שאלה, לעצור את הריאיון או לבקש למחוק את ההקלטה, בכל שלב וללא כל הסבר. לא תהיה לכך שום השפעה על השירותים שאת או ילדך מקבלים.</w:t>
       </w:r>
@@ -4581,6 +4807,7 @@
           <w:sz w:val="24"/>
           <w:szCs w:val="24"/>
           <w:rtl/>
+          <w:lang w:val="he-IL" w:bidi="he-IL"/>
         </w:rPr>
         <w:t xml:space="preserve">סודיות: </w:t>
       </w:r>
@@ -4594,6 +4821,7 @@
           <w:sz w:val="24"/>
           <w:szCs w:val="24"/>
           <w:rtl/>
+          <w:lang w:val="he-IL" w:bidi="he-IL"/>
         </w:rPr>
         <w:t xml:space="preserve">שמך, שם ילדך, שם היישוב ושם בית הספר לא יופיעו בשום מסמך. ההקלטה תישמר בקובץ מוגן, תשמש רק לצורך המחקר ותימחק בסיומו. בעבודה ישולבו ציטוטים קצרים תחת שם בדוי.</w:t>
       </w:r>
@@ -4614,6 +4842,7 @@
           <w:sz w:val="24"/>
           <w:szCs w:val="24"/>
           <w:rtl/>
+          <w:lang w:val="he-IL" w:bidi="he-IL"/>
         </w:rPr>
         <w:t xml:space="preserve">סיכונים ותועלת: </w:t>
       </w:r>
@@ -4627,6 +4856,7 @@
           <w:sz w:val="24"/>
           <w:szCs w:val="24"/>
           <w:rtl/>
+          <w:lang w:val="he-IL" w:bidi="he-IL"/>
         </w:rPr>
         <w:t xml:space="preserve">הריאיון עשוי לעורר רגשות קשים. אם תרצי, נעצור, ונוכל למסור לך פרטים של גורמי תמיכה בערבית. אין תועלת אישית ישירה מההשתתפות, אך דברייך עשויים לסייע לשיפור השירותים לאימהות אחרות.</w:t>
       </w:r>
@@ -4647,6 +4877,7 @@
           <w:sz w:val="24"/>
           <w:szCs w:val="24"/>
           <w:rtl/>
+          <w:lang w:val="he-IL" w:bidi="he-IL"/>
         </w:rPr>
         <w:t xml:space="preserve">פרטי קשר לשאלות: </w:t>
       </w:r>
@@ -4660,6 +4891,7 @@
           <w:sz w:val="24"/>
           <w:szCs w:val="24"/>
           <w:rtl/>
+          <w:lang w:val="he-IL" w:bidi="he-IL"/>
         </w:rPr>
         <w:t xml:space="preserve">ג'ואהר אבו גאנם, טלפון: __________, דוא"ל: __________; סולימאן אבו חמיד, טלפון: __________, דוא"ל: __________.</w:t>
       </w:r>
@@ -4674,6 +4906,7 @@
           <w:sz w:val="24"/>
           <w:szCs w:val="24"/>
           <w:rtl/>
+          <w:lang w:val="he-IL" w:bidi="he-IL"/>
         </w:rPr>
         <w:t xml:space="preserve"/>
       </w:r>
@@ -4694,6 +4927,7 @@
           <w:sz w:val="24"/>
           <w:szCs w:val="24"/>
           <w:rtl/>
+          <w:lang w:val="he-IL" w:bidi="he-IL"/>
         </w:rPr>
         <w:t xml:space="preserve">קראתי (או הוקרא לי) את ההסבר, קיבלתי תשובות לשאלותיי, ואני מסכימה להשתתף במחקר ולהקלטת הריאיון.</w:t>
       </w:r>
@@ -4708,6 +4942,7 @@
           <w:sz w:val="24"/>
           <w:szCs w:val="24"/>
           <w:rtl/>
+          <w:lang w:val="he-IL" w:bidi="he-IL"/>
         </w:rPr>
         <w:t xml:space="preserve"/>
       </w:r>
@@ -4728,6 +4963,7 @@
           <w:sz w:val="24"/>
           <w:szCs w:val="24"/>
           <w:rtl/>
+          <w:lang w:val="he-IL" w:bidi="he-IL"/>
         </w:rPr>
         <w:t xml:space="preserve">שם המשתתפת: ____________________    חתימה: ______________    תאריך: ___________</w:t>
       </w:r>
@@ -4748,6 +4984,7 @@
           <w:sz w:val="24"/>
           <w:szCs w:val="24"/>
           <w:rtl/>
+          <w:lang w:val="he-IL" w:bidi="he-IL"/>
         </w:rPr>
         <w:t xml:space="preserve">שם החוקר/ת: ____________________    חתימה: ______________    תאריך: ___________</w:t>
       </w:r>
@@ -4817,6 +5054,7 @@
         <w:rFonts w:ascii="David" w:cs="David" w:eastAsia="David" w:hAnsi="David"/>
         <w:sz w:val="22"/>
         <w:szCs w:val="22"/>
+        <w:lang w:val="he-IL" w:bidi="he-IL"/>
       </w:rPr>
       <w:fldChar w:fldCharType="begin"/>
       <w:instrText xml:space="preserve">PAGE</w:instrText>
@@ -5022,6 +5260,7 @@
         <w:sz w:val="24"/>
         <w:szCs w:val="24"/>
         <w:rtl/>
+        <w:lang w:val="he-IL" w:bidi="he-IL"/>
       </w:rPr>
     </w:rPrDefault>
     <w:pPrDefault>

</xml_diff>

<commit_message>
Give each numbered list its own numbering definition so appendices restart at 1
Co-Authored-By: Claude Fable 5.1 <noreply@anthropic.com>
Claude-Session: https://claude.ai/code/session_013NTfKpqds6XkbupkiTDphe
</commit_message>
<xml_diff>
--- a/academic/research-proposal-bedouin-mothers.docx
+++ b/academic/research-proposal-bedouin-mothers.docx
@@ -5210,6 +5210,66 @@
     <w:multiLevelType w:val="hybridMultilevel"/>
     <w:lvl w:ilvl="0" w15:tentative="1">
       <w:start w:val="1"/>
+      <w:numFmt w:val="decimal"/>
+      <w:lvlText w:val="%1."/>
+      <w:lvlJc w:val="start"/>
+      <w:pPr>
+        <w:ind w:start="720" w:hanging="360"/>
+      </w:pPr>
+    </w:lvl>
+  </w:abstractNum>
+  <w:abstractNum w:abstractNumId="4" w15:restartNumberingAfterBreak="0">
+    <w:multiLevelType w:val="hybridMultilevel"/>
+    <w:lvl w:ilvl="0" w15:tentative="1">
+      <w:start w:val="1"/>
+      <w:numFmt w:val="decimal"/>
+      <w:lvlText w:val="%1."/>
+      <w:lvlJc w:val="start"/>
+      <w:pPr>
+        <w:ind w:start="720" w:hanging="360"/>
+      </w:pPr>
+    </w:lvl>
+  </w:abstractNum>
+  <w:abstractNum w:abstractNumId="5" w15:restartNumberingAfterBreak="0">
+    <w:multiLevelType w:val="hybridMultilevel"/>
+    <w:lvl w:ilvl="0" w15:tentative="1">
+      <w:start w:val="1"/>
+      <w:numFmt w:val="decimal"/>
+      <w:lvlText w:val="%1."/>
+      <w:lvlJc w:val="start"/>
+      <w:pPr>
+        <w:ind w:start="720" w:hanging="360"/>
+      </w:pPr>
+    </w:lvl>
+  </w:abstractNum>
+  <w:abstractNum w:abstractNumId="6" w15:restartNumberingAfterBreak="0">
+    <w:multiLevelType w:val="hybridMultilevel"/>
+    <w:lvl w:ilvl="0" w15:tentative="1">
+      <w:start w:val="1"/>
+      <w:numFmt w:val="decimal"/>
+      <w:lvlText w:val="%1."/>
+      <w:lvlJc w:val="start"/>
+      <w:pPr>
+        <w:ind w:start="720" w:hanging="360"/>
+      </w:pPr>
+    </w:lvl>
+  </w:abstractNum>
+  <w:abstractNum w:abstractNumId="7" w15:restartNumberingAfterBreak="0">
+    <w:multiLevelType w:val="hybridMultilevel"/>
+    <w:lvl w:ilvl="0" w15:tentative="1">
+      <w:start w:val="1"/>
+      <w:numFmt w:val="decimal"/>
+      <w:lvlText w:val="%1."/>
+      <w:lvlJc w:val="start"/>
+      <w:pPr>
+        <w:ind w:start="720" w:hanging="360"/>
+      </w:pPr>
+    </w:lvl>
+  </w:abstractNum>
+  <w:abstractNum w:abstractNumId="8" w15:restartNumberingAfterBreak="0">
+    <w:multiLevelType w:val="hybridMultilevel"/>
+    <w:lvl w:ilvl="0" w15:tentative="1">
+      <w:start w:val="1"/>
       <w:numFmt w:val="bullet"/>
       <w:lvlText w:val="•"/>
       <w:lvlJc w:val="start"/>
@@ -5231,19 +5291,19 @@
     </w:lvlOverride>
   </w:num>
   <w:num w:numId="3">
+    <w:abstractNumId w:val="8"/>
+    <w:lvlOverride w:ilvl="0">
+      <w:startOverride w:val="1"/>
+    </w:lvlOverride>
+  </w:num>
+  <w:num w:numId="4">
     <w:abstractNumId w:val="3"/>
     <w:lvlOverride w:ilvl="0">
       <w:startOverride w:val="1"/>
     </w:lvlOverride>
   </w:num>
-  <w:num w:numId="4">
-    <w:abstractNumId w:val="2"/>
-    <w:lvlOverride w:ilvl="0">
-      <w:startOverride w:val="1"/>
-    </w:lvlOverride>
-  </w:num>
   <w:num w:numId="5">
-    <w:abstractNumId w:val="2"/>
+    <w:abstractNumId w:val="4"/>
     <w:lvlOverride w:ilvl="0">
       <w:startOverride w:val="1"/>
     </w:lvlOverride>

</xml_diff>

<commit_message>
Remove faculty placeholder line from the cover page
Co-Authored-By: Claude Fable 5.1 <noreply@anthropic.com>
Claude-Session: https://claude.ai/code/session_013NTfKpqds6XkbupkiTDphe
</commit_message>
<xml_diff>
--- a/academic/research-proposal-bedouin-mothers.docx
+++ b/academic/research-proposal-bedouin-mothers.docx
@@ -67,27 +67,6 @@
           <w:lang w:val="he-IL" w:bidi="he-IL"/>
         </w:rPr>
         <w:t xml:space="preserve">הקריה האקדמית אונו</w:t>
-      </w:r>
-    </w:p>
-    <w:p>
-      <w:pPr>
-        <w:bidi/>
-        <w:spacing w:after="0" w:before="0" w:line="360"/>
-        <w:jc w:val="center"/>
-      </w:pPr>
-      <w:r>
-        <w:rPr>
-          <w:rFonts w:ascii="David" w:cs="David" w:eastAsia="David" w:hAnsi="David"/>
-          <w:b w:val="false"/>
-          <w:bCs w:val="false"/>
-          <w:i w:val="false"/>
-          <w:iCs w:val="false"/>
-          <w:sz w:val="24"/>
-          <w:szCs w:val="24"/>
-          <w:rtl/>
-          <w:lang w:val="he-IL" w:bidi="he-IL"/>
-        </w:rPr>
-        <w:t xml:space="preserve">[שם הפקולטה / התוכנית]</w:t>
       </w:r>
     </w:p>
     <w:p>

</xml_diff>